<commit_message>
docs: update documentation with zero-data mobile broadcast links and GitHub repo
</commit_message>
<xml_diff>
--- a/DATA_CURATION_AND_ACTIVE_ALERT_SYSTEM.docx
+++ b/DATA_CURATION_AND_ACTIVE_ALERT_SYSTEM.docx
@@ -255,7 +255,400 @@
               <w:rPr>
                 <w:sz w:val="16"/>
               </w:rPr>
+              <w:t>Zero-Data Alert Simulator (iOS/Android)</w:t>
+            </w:r>
+          </w:p>
+        </w:tc>
+        <w:tc>
+          <w:tcPr>
+            <w:tcW w:type="dxa" w:w="3312"/>
+            <w:tcMar>
+              <w:top w:w="80" w:type="dxa"/>
+              <w:bottom w:w="80" w:type="dxa"/>
+              <w:left w:w="100" w:type="dxa"/>
+              <w:right w:w="100" w:type="dxa"/>
+            </w:tcMar>
+            <w:shd w:fill="F8FAFC"/>
+          </w:tcPr>
+          <w:p>
+            <w:hyperlink r:id="rId10">
+              <w:r>
+                <w:rPr>
+                  <w:color w:val="0056B3"/>
+                  <w:u w:val="single"/>
+                  <w:b/>
+                  <w:sz w:val="19"/>
+                </w:rPr>
+                <w:t>https://frontend-rosy-phi-23.vercel.app/api/v1/alerts/mobile-broadcast</w:t>
+              </w:r>
+            </w:hyperlink>
+          </w:p>
+        </w:tc>
+        <w:tc>
+          <w:tcPr>
+            <w:tcW w:type="dxa" w:w="3312"/>
+            <w:tcMar>
+              <w:top w:w="80" w:type="dxa"/>
+              <w:bottom w:w="80" w:type="dxa"/>
+              <w:left w:w="100" w:type="dxa"/>
+              <w:right w:w="100" w:type="dxa"/>
+            </w:tcMar>
+            <w:shd w:fill="F8FAFC"/>
+          </w:tcPr>
+          <w:p>
+            <w:r>
+              <w:rPr>
+                <w:sz w:val="16"/>
+              </w:rPr>
+              <w:t>3GPP TS 23.041 zero-data &amp; grid power failure mobile broadcast test API</w:t>
+            </w:r>
+          </w:p>
+        </w:tc>
+      </w:tr>
+      <w:tr>
+        <w:tc>
+          <w:tcPr>
+            <w:tcW w:type="dxa" w:w="3312"/>
+            <w:tcMar>
+              <w:top w:w="80" w:type="dxa"/>
+              <w:bottom w:w="80" w:type="dxa"/>
+              <w:left w:w="100" w:type="dxa"/>
+              <w:right w:w="100" w:type="dxa"/>
+            </w:tcMar>
+          </w:tcPr>
+          <w:p>
+            <w:r>
+              <w:rPr>
+                <w:sz w:val="16"/>
+              </w:rPr>
               <w:t>Interactive AI Commander Bot</w:t>
+            </w:r>
+          </w:p>
+        </w:tc>
+        <w:tc>
+          <w:tcPr>
+            <w:tcW w:type="dxa" w:w="3312"/>
+            <w:tcMar>
+              <w:top w:w="80" w:type="dxa"/>
+              <w:bottom w:w="80" w:type="dxa"/>
+              <w:left w:w="100" w:type="dxa"/>
+              <w:right w:w="100" w:type="dxa"/>
+            </w:tcMar>
+          </w:tcPr>
+          <w:p>
+            <w:hyperlink r:id="rId9">
+              <w:r>
+                <w:rPr>
+                  <w:color w:val="0056B3"/>
+                  <w:u w:val="single"/>
+                  <w:b/>
+                  <w:sz w:val="19"/>
+                </w:rPr>
+                <w:t>https://frontend-rosy-phi-23.vercel.app</w:t>
+              </w:r>
+            </w:hyperlink>
+          </w:p>
+        </w:tc>
+        <w:tc>
+          <w:tcPr>
+            <w:tcW w:type="dxa" w:w="3312"/>
+            <w:tcMar>
+              <w:top w:w="80" w:type="dxa"/>
+              <w:bottom w:w="80" w:type="dxa"/>
+              <w:left w:w="100" w:type="dxa"/>
+              <w:right w:w="100" w:type="dxa"/>
+            </w:tcMar>
+          </w:tcPr>
+          <w:p>
+            <w:r>
+              <w:rPr>
+                <w:sz w:val="16"/>
+              </w:rPr>
+              <w:t>Click bottom-right floating bot. Answers evacuation queries, hazard reasons, and SOPs</w:t>
+            </w:r>
+          </w:p>
+        </w:tc>
+      </w:tr>
+      <w:tr>
+        <w:tc>
+          <w:tcPr>
+            <w:tcW w:type="dxa" w:w="3312"/>
+            <w:tcMar>
+              <w:top w:w="80" w:type="dxa"/>
+              <w:bottom w:w="80" w:type="dxa"/>
+              <w:left w:w="100" w:type="dxa"/>
+              <w:right w:w="100" w:type="dxa"/>
+            </w:tcMar>
+            <w:shd w:fill="F8FAFC"/>
+          </w:tcPr>
+          <w:p>
+            <w:r>
+              <w:rPr>
+                <w:sz w:val="16"/>
+              </w:rPr>
+              <w:t>ISRO Bhuvan GIS Emergency Map</w:t>
+            </w:r>
+          </w:p>
+        </w:tc>
+        <w:tc>
+          <w:tcPr>
+            <w:tcW w:type="dxa" w:w="3312"/>
+            <w:tcMar>
+              <w:top w:w="80" w:type="dxa"/>
+              <w:bottom w:w="80" w:type="dxa"/>
+              <w:left w:w="100" w:type="dxa"/>
+              <w:right w:w="100" w:type="dxa"/>
+            </w:tcMar>
+            <w:shd w:fill="F8FAFC"/>
+          </w:tcPr>
+          <w:p>
+            <w:hyperlink r:id="rId11">
+              <w:r>
+                <w:rPr>
+                  <w:color w:val="0056B3"/>
+                  <w:u w:val="single"/>
+                  <w:b/>
+                  <w:sz w:val="19"/>
+                </w:rPr>
+                <w:t>https://frontend-rosy-phi-23.vercel.app/emergency</w:t>
+              </w:r>
+            </w:hyperlink>
+          </w:p>
+        </w:tc>
+        <w:tc>
+          <w:tcPr>
+            <w:tcW w:type="dxa" w:w="3312"/>
+            <w:tcMar>
+              <w:top w:w="80" w:type="dxa"/>
+              <w:bottom w:w="80" w:type="dxa"/>
+              <w:left w:w="100" w:type="dxa"/>
+              <w:right w:w="100" w:type="dxa"/>
+            </w:tcMar>
+            <w:shd w:fill="F8FAFC"/>
+          </w:tcPr>
+          <w:p>
+            <w:r>
+              <w:rPr>
+                <w:sz w:val="16"/>
+              </w:rPr>
+              <w:t>Interactive 14-hazard spatial grid, satellite/terrain layers &amp; telemetry badges</w:t>
+            </w:r>
+          </w:p>
+        </w:tc>
+      </w:tr>
+      <w:tr>
+        <w:tc>
+          <w:tcPr>
+            <w:tcW w:type="dxa" w:w="3312"/>
+            <w:tcMar>
+              <w:top w:w="80" w:type="dxa"/>
+              <w:bottom w:w="80" w:type="dxa"/>
+              <w:left w:w="100" w:type="dxa"/>
+              <w:right w:w="100" w:type="dxa"/>
+            </w:tcMar>
+          </w:tcPr>
+          <w:p>
+            <w:r>
+              <w:rPr>
+                <w:sz w:val="16"/>
+              </w:rPr>
+              <w:t>DMMC Ops Control &amp; SMS Dispatcher</w:t>
+            </w:r>
+          </w:p>
+        </w:tc>
+        <w:tc>
+          <w:tcPr>
+            <w:tcW w:type="dxa" w:w="3312"/>
+            <w:tcMar>
+              <w:top w:w="80" w:type="dxa"/>
+              <w:bottom w:w="80" w:type="dxa"/>
+              <w:left w:w="100" w:type="dxa"/>
+              <w:right w:w="100" w:type="dxa"/>
+            </w:tcMar>
+          </w:tcPr>
+          <w:p>
+            <w:hyperlink r:id="rId12">
+              <w:r>
+                <w:rPr>
+                  <w:color w:val="0056B3"/>
+                  <w:u w:val="single"/>
+                  <w:b/>
+                  <w:sz w:val="19"/>
+                </w:rPr>
+                <w:t>https://frontend-rosy-phi-23.vercel.app/admin</w:t>
+              </w:r>
+            </w:hyperlink>
+          </w:p>
+        </w:tc>
+        <w:tc>
+          <w:tcPr>
+            <w:tcW w:type="dxa" w:w="3312"/>
+            <w:tcMar>
+              <w:top w:w="80" w:type="dxa"/>
+              <w:bottom w:w="80" w:type="dxa"/>
+              <w:left w:w="100" w:type="dxa"/>
+              <w:right w:w="100" w:type="dxa"/>
+            </w:tcMar>
+          </w:tcPr>
+          <w:p>
+            <w:r>
+              <w:rPr>
+                <w:sz w:val="16"/>
+              </w:rPr>
+              <w:t>Tab 7: Test live multilingual SMS push &amp; dispatch automated voice calls</w:t>
+            </w:r>
+          </w:p>
+        </w:tc>
+      </w:tr>
+      <w:tr>
+        <w:tc>
+          <w:tcPr>
+            <w:tcW w:type="dxa" w:w="3312"/>
+            <w:tcMar>
+              <w:top w:w="80" w:type="dxa"/>
+              <w:bottom w:w="80" w:type="dxa"/>
+              <w:left w:w="100" w:type="dxa"/>
+              <w:right w:w="100" w:type="dxa"/>
+            </w:tcMar>
+            <w:shd w:fill="F8FAFC"/>
+          </w:tcPr>
+          <w:p>
+            <w:r>
+              <w:rPr>
+                <w:sz w:val="16"/>
+              </w:rPr>
+              <w:t>Evacuation Shelters Directory</w:t>
+            </w:r>
+          </w:p>
+        </w:tc>
+        <w:tc>
+          <w:tcPr>
+            <w:tcW w:type="dxa" w:w="3312"/>
+            <w:tcMar>
+              <w:top w:w="80" w:type="dxa"/>
+              <w:bottom w:w="80" w:type="dxa"/>
+              <w:left w:w="100" w:type="dxa"/>
+              <w:right w:w="100" w:type="dxa"/>
+            </w:tcMar>
+            <w:shd w:fill="F8FAFC"/>
+          </w:tcPr>
+          <w:p>
+            <w:hyperlink r:id="rId13">
+              <w:r>
+                <w:rPr>
+                  <w:color w:val="0056B3"/>
+                  <w:u w:val="single"/>
+                  <w:b/>
+                  <w:sz w:val="19"/>
+                </w:rPr>
+                <w:t>https://frontend-rosy-phi-23.vercel.app/shelters</w:t>
+              </w:r>
+            </w:hyperlink>
+          </w:p>
+        </w:tc>
+        <w:tc>
+          <w:tcPr>
+            <w:tcW w:type="dxa" w:w="3312"/>
+            <w:tcMar>
+              <w:top w:w="80" w:type="dxa"/>
+              <w:bottom w:w="80" w:type="dxa"/>
+              <w:left w:w="100" w:type="dxa"/>
+              <w:right w:w="100" w:type="dxa"/>
+            </w:tcMar>
+            <w:shd w:fill="F8FAFC"/>
+          </w:tcPr>
+          <w:p>
+            <w:r>
+              <w:rPr>
+                <w:sz w:val="16"/>
+              </w:rPr>
+              <w:t>High-ground shelter capacities, GPS coordinates &amp; emergency supply tracking</w:t>
+            </w:r>
+          </w:p>
+        </w:tc>
+      </w:tr>
+      <w:tr>
+        <w:tc>
+          <w:tcPr>
+            <w:tcW w:type="dxa" w:w="3312"/>
+            <w:tcMar>
+              <w:top w:w="80" w:type="dxa"/>
+              <w:bottom w:w="80" w:type="dxa"/>
+              <w:left w:w="100" w:type="dxa"/>
+              <w:right w:w="100" w:type="dxa"/>
+            </w:tcMar>
+          </w:tcPr>
+          <w:p>
+            <w:r>
+              <w:rPr>
+                <w:sz w:val="16"/>
+              </w:rPr>
+              <w:t>Citizen Emergency Guidebook</w:t>
+            </w:r>
+          </w:p>
+        </w:tc>
+        <w:tc>
+          <w:tcPr>
+            <w:tcW w:type="dxa" w:w="3312"/>
+            <w:tcMar>
+              <w:top w:w="80" w:type="dxa"/>
+              <w:bottom w:w="80" w:type="dxa"/>
+              <w:left w:w="100" w:type="dxa"/>
+              <w:right w:w="100" w:type="dxa"/>
+            </w:tcMar>
+          </w:tcPr>
+          <w:p>
+            <w:hyperlink r:id="rId14">
+              <w:r>
+                <w:rPr>
+                  <w:color w:val="0056B3"/>
+                  <w:u w:val="single"/>
+                  <w:b/>
+                  <w:sz w:val="19"/>
+                </w:rPr>
+                <w:t>https://frontend-rosy-phi-23.vercel.app/guidebook</w:t>
+              </w:r>
+            </w:hyperlink>
+          </w:p>
+        </w:tc>
+        <w:tc>
+          <w:tcPr>
+            <w:tcW w:type="dxa" w:w="3312"/>
+            <w:tcMar>
+              <w:top w:w="80" w:type="dxa"/>
+              <w:bottom w:w="80" w:type="dxa"/>
+              <w:left w:w="100" w:type="dxa"/>
+              <w:right w:w="100" w:type="dxa"/>
+            </w:tcMar>
+          </w:tcPr>
+          <w:p>
+            <w:r>
+              <w:rPr>
+                <w:sz w:val="16"/>
+              </w:rPr>
+              <w:t>Offline survival protocols, flash flood evacuation rules &amp; hotlines (112 / 1070)</w:t>
+            </w:r>
+          </w:p>
+        </w:tc>
+      </w:tr>
+      <w:tr>
+        <w:tc>
+          <w:tcPr>
+            <w:tcW w:type="dxa" w:w="3312"/>
+            <w:tcMar>
+              <w:top w:w="80" w:type="dxa"/>
+              <w:bottom w:w="80" w:type="dxa"/>
+              <w:left w:w="100" w:type="dxa"/>
+              <w:right w:w="100" w:type="dxa"/>
+            </w:tcMar>
+            <w:shd w:fill="F8FAFC"/>
+          </w:tcPr>
+          <w:p>
+            <w:r>
+              <w:rPr>
+                <w:sz w:val="16"/>
+              </w:rPr>
+              <w:t>Permanent 24/7 Cloud Link (Vercel)</w:t>
             </w:r>
           </w:p>
         </w:tc>
@@ -300,7 +693,7 @@
               <w:rPr>
                 <w:sz w:val="16"/>
               </w:rPr>
-              <w:t>Click bottom-right floating bot. Answers evacuation queries, hazard reasons, and SOPs</w:t>
+              <w:t>Permanent production deployment hosted on Vercel's global edge network</w:t>
             </w:r>
           </w:p>
         </w:tc>
@@ -321,7 +714,7 @@
               <w:rPr>
                 <w:sz w:val="16"/>
               </w:rPr>
-              <w:t>ISRO Bhuvan GIS Emergency Map</w:t>
+              <w:t>Official GitHub Repository (Dual-Sync)</w:t>
             </w:r>
           </w:p>
         </w:tc>
@@ -336,7 +729,7 @@
             </w:tcMar>
           </w:tcPr>
           <w:p>
-            <w:hyperlink r:id="rId10">
+            <w:hyperlink r:id="rId15">
               <w:r>
                 <w:rPr>
                   <w:color w:val="0056B3"/>
@@ -344,7 +737,7 @@
                   <w:b/>
                   <w:sz w:val="19"/>
                 </w:rPr>
-                <w:t>https://frontend-rosy-phi-23.vercel.app/emergency</w:t>
+                <w:t>https://github.com/adityajoshi202424-commits/ukis-mountain-disaster-early-warning</w:t>
               </w:r>
             </w:hyperlink>
           </w:p>
@@ -364,269 +757,7 @@
               <w:rPr>
                 <w:sz w:val="16"/>
               </w:rPr>
-              <w:t>Interactive 14-hazard spatial grid, satellite/terrain layers &amp; telemetry badges</w:t>
-            </w:r>
-          </w:p>
-        </w:tc>
-      </w:tr>
-      <w:tr>
-        <w:tc>
-          <w:tcPr>
-            <w:tcW w:type="dxa" w:w="3312"/>
-            <w:tcMar>
-              <w:top w:w="80" w:type="dxa"/>
-              <w:bottom w:w="80" w:type="dxa"/>
-              <w:left w:w="100" w:type="dxa"/>
-              <w:right w:w="100" w:type="dxa"/>
-            </w:tcMar>
-            <w:shd w:fill="F8FAFC"/>
-          </w:tcPr>
-          <w:p>
-            <w:r>
-              <w:rPr>
-                <w:sz w:val="16"/>
-              </w:rPr>
-              <w:t>DMMC Ops Control &amp; SMS Dispatcher</w:t>
-            </w:r>
-          </w:p>
-        </w:tc>
-        <w:tc>
-          <w:tcPr>
-            <w:tcW w:type="dxa" w:w="3312"/>
-            <w:tcMar>
-              <w:top w:w="80" w:type="dxa"/>
-              <w:bottom w:w="80" w:type="dxa"/>
-              <w:left w:w="100" w:type="dxa"/>
-              <w:right w:w="100" w:type="dxa"/>
-            </w:tcMar>
-            <w:shd w:fill="F8FAFC"/>
-          </w:tcPr>
-          <w:p>
-            <w:hyperlink r:id="rId11">
-              <w:r>
-                <w:rPr>
-                  <w:color w:val="0056B3"/>
-                  <w:u w:val="single"/>
-                  <w:b/>
-                  <w:sz w:val="19"/>
-                </w:rPr>
-                <w:t>https://frontend-rosy-phi-23.vercel.app/admin</w:t>
-              </w:r>
-            </w:hyperlink>
-          </w:p>
-        </w:tc>
-        <w:tc>
-          <w:tcPr>
-            <w:tcW w:type="dxa" w:w="3312"/>
-            <w:tcMar>
-              <w:top w:w="80" w:type="dxa"/>
-              <w:bottom w:w="80" w:type="dxa"/>
-              <w:left w:w="100" w:type="dxa"/>
-              <w:right w:w="100" w:type="dxa"/>
-            </w:tcMar>
-            <w:shd w:fill="F8FAFC"/>
-          </w:tcPr>
-          <w:p>
-            <w:r>
-              <w:rPr>
-                <w:sz w:val="16"/>
-              </w:rPr>
-              <w:t>Tab 7: Test live multilingual SMS push &amp; dispatch automated voice calls</w:t>
-            </w:r>
-          </w:p>
-        </w:tc>
-      </w:tr>
-      <w:tr>
-        <w:tc>
-          <w:tcPr>
-            <w:tcW w:type="dxa" w:w="3312"/>
-            <w:tcMar>
-              <w:top w:w="80" w:type="dxa"/>
-              <w:bottom w:w="80" w:type="dxa"/>
-              <w:left w:w="100" w:type="dxa"/>
-              <w:right w:w="100" w:type="dxa"/>
-            </w:tcMar>
-          </w:tcPr>
-          <w:p>
-            <w:r>
-              <w:rPr>
-                <w:sz w:val="16"/>
-              </w:rPr>
-              <w:t>Evacuation Shelters Directory</w:t>
-            </w:r>
-          </w:p>
-        </w:tc>
-        <w:tc>
-          <w:tcPr>
-            <w:tcW w:type="dxa" w:w="3312"/>
-            <w:tcMar>
-              <w:top w:w="80" w:type="dxa"/>
-              <w:bottom w:w="80" w:type="dxa"/>
-              <w:left w:w="100" w:type="dxa"/>
-              <w:right w:w="100" w:type="dxa"/>
-            </w:tcMar>
-          </w:tcPr>
-          <w:p>
-            <w:hyperlink r:id="rId12">
-              <w:r>
-                <w:rPr>
-                  <w:color w:val="0056B3"/>
-                  <w:u w:val="single"/>
-                  <w:b/>
-                  <w:sz w:val="19"/>
-                </w:rPr>
-                <w:t>https://frontend-rosy-phi-23.vercel.app/shelters</w:t>
-              </w:r>
-            </w:hyperlink>
-          </w:p>
-        </w:tc>
-        <w:tc>
-          <w:tcPr>
-            <w:tcW w:type="dxa" w:w="3312"/>
-            <w:tcMar>
-              <w:top w:w="80" w:type="dxa"/>
-              <w:bottom w:w="80" w:type="dxa"/>
-              <w:left w:w="100" w:type="dxa"/>
-              <w:right w:w="100" w:type="dxa"/>
-            </w:tcMar>
-          </w:tcPr>
-          <w:p>
-            <w:r>
-              <w:rPr>
-                <w:sz w:val="16"/>
-              </w:rPr>
-              <w:t>High-ground shelter capacities, GPS coordinates &amp; emergency supply tracking</w:t>
-            </w:r>
-          </w:p>
-        </w:tc>
-      </w:tr>
-      <w:tr>
-        <w:tc>
-          <w:tcPr>
-            <w:tcW w:type="dxa" w:w="3312"/>
-            <w:tcMar>
-              <w:top w:w="80" w:type="dxa"/>
-              <w:bottom w:w="80" w:type="dxa"/>
-              <w:left w:w="100" w:type="dxa"/>
-              <w:right w:w="100" w:type="dxa"/>
-            </w:tcMar>
-            <w:shd w:fill="F8FAFC"/>
-          </w:tcPr>
-          <w:p>
-            <w:r>
-              <w:rPr>
-                <w:sz w:val="16"/>
-              </w:rPr>
-              <w:t>Citizen Emergency Guidebook</w:t>
-            </w:r>
-          </w:p>
-        </w:tc>
-        <w:tc>
-          <w:tcPr>
-            <w:tcW w:type="dxa" w:w="3312"/>
-            <w:tcMar>
-              <w:top w:w="80" w:type="dxa"/>
-              <w:bottom w:w="80" w:type="dxa"/>
-              <w:left w:w="100" w:type="dxa"/>
-              <w:right w:w="100" w:type="dxa"/>
-            </w:tcMar>
-            <w:shd w:fill="F8FAFC"/>
-          </w:tcPr>
-          <w:p>
-            <w:hyperlink r:id="rId13">
-              <w:r>
-                <w:rPr>
-                  <w:color w:val="0056B3"/>
-                  <w:u w:val="single"/>
-                  <w:b/>
-                  <w:sz w:val="19"/>
-                </w:rPr>
-                <w:t>https://frontend-rosy-phi-23.vercel.app/guidebook</w:t>
-              </w:r>
-            </w:hyperlink>
-          </w:p>
-        </w:tc>
-        <w:tc>
-          <w:tcPr>
-            <w:tcW w:type="dxa" w:w="3312"/>
-            <w:tcMar>
-              <w:top w:w="80" w:type="dxa"/>
-              <w:bottom w:w="80" w:type="dxa"/>
-              <w:left w:w="100" w:type="dxa"/>
-              <w:right w:w="100" w:type="dxa"/>
-            </w:tcMar>
-            <w:shd w:fill="F8FAFC"/>
-          </w:tcPr>
-          <w:p>
-            <w:r>
-              <w:rPr>
-                <w:sz w:val="16"/>
-              </w:rPr>
-              <w:t>Offline survival protocols, flash flood evacuation rules &amp; hotlines (112 / 1070)</w:t>
-            </w:r>
-          </w:p>
-        </w:tc>
-      </w:tr>
-      <w:tr>
-        <w:tc>
-          <w:tcPr>
-            <w:tcW w:type="dxa" w:w="3312"/>
-            <w:tcMar>
-              <w:top w:w="80" w:type="dxa"/>
-              <w:bottom w:w="80" w:type="dxa"/>
-              <w:left w:w="100" w:type="dxa"/>
-              <w:right w:w="100" w:type="dxa"/>
-            </w:tcMar>
-          </w:tcPr>
-          <w:p>
-            <w:r>
-              <w:rPr>
-                <w:sz w:val="16"/>
-              </w:rPr>
-              <w:t>Permanent 24/7 Cloud Link (Vercel)</w:t>
-            </w:r>
-          </w:p>
-        </w:tc>
-        <w:tc>
-          <w:tcPr>
-            <w:tcW w:type="dxa" w:w="3312"/>
-            <w:tcMar>
-              <w:top w:w="80" w:type="dxa"/>
-              <w:bottom w:w="80" w:type="dxa"/>
-              <w:left w:w="100" w:type="dxa"/>
-              <w:right w:w="100" w:type="dxa"/>
-            </w:tcMar>
-          </w:tcPr>
-          <w:p>
-            <w:hyperlink r:id="rId9">
-              <w:r>
-                <w:rPr>
-                  <w:color w:val="0056B3"/>
-                  <w:u w:val="single"/>
-                  <w:b/>
-                  <w:sz w:val="19"/>
-                </w:rPr>
-                <w:t>https://frontend-rosy-phi-23.vercel.app</w:t>
-              </w:r>
-            </w:hyperlink>
-          </w:p>
-        </w:tc>
-        <w:tc>
-          <w:tcPr>
-            <w:tcW w:type="dxa" w:w="3312"/>
-            <w:tcMar>
-              <w:top w:w="80" w:type="dxa"/>
-              <w:bottom w:w="80" w:type="dxa"/>
-              <w:left w:w="100" w:type="dxa"/>
-              <w:right w:w="100" w:type="dxa"/>
-            </w:tcMar>
-          </w:tcPr>
-          <w:p>
-            <w:r>
-              <w:rPr>
-                <w:sz w:val="16"/>
-              </w:rPr>
-              <w:t>Permanent production deployment hosted on Vercel's global edge network</w:t>
+              <w:t>Direct git tracking repo synced with Vercel production</w:t>
             </w:r>
           </w:p>
         </w:tc>

</xml_diff>

<commit_message>
feat: add Mountain Disaster & Early Warning Intelligence Hub with 7 empirical live physics problem models
</commit_message>
<xml_diff>
--- a/DATA_CURATION_AND_ACTIVE_ALERT_SYSTEM.docx
+++ b/DATA_CURATION_AND_ACTIVE_ALERT_SYSTEM.docx
@@ -255,7 +255,7 @@
               <w:rPr>
                 <w:sz w:val="16"/>
               </w:rPr>
-              <w:t>Zero-Data Alert Simulator (iOS/Android)</w:t>
+              <w:t>Mountain Intelligence Hub (7 Problem Engines)</w:t>
             </w:r>
           </w:p>
         </w:tc>
@@ -279,6 +279,71 @@
                   <w:b/>
                   <w:sz w:val="19"/>
                 </w:rPr>
+                <w:t>https://frontend-rosy-phi-23.vercel.app/mountain-intelligence</w:t>
+              </w:r>
+            </w:hyperlink>
+          </w:p>
+        </w:tc>
+        <w:tc>
+          <w:tcPr>
+            <w:tcW w:type="dxa" w:w="3312"/>
+            <w:tcMar>
+              <w:top w:w="80" w:type="dxa"/>
+              <w:bottom w:w="80" w:type="dxa"/>
+              <w:left w:w="100" w:type="dxa"/>
+              <w:right w:w="100" w:type="dxa"/>
+            </w:tcMar>
+            <w:shd w:fill="F8FAFC"/>
+          </w:tcPr>
+          <w:p>
+            <w:r>
+              <w:rPr>
+                <w:sz w:val="16"/>
+              </w:rPr>
+              <w:t>Live empirical modeling of GLOFs, cloudbursts, canyon hydraulics, seismic cascades &amp; sensor mortality</w:t>
+            </w:r>
+          </w:p>
+        </w:tc>
+      </w:tr>
+      <w:tr>
+        <w:tc>
+          <w:tcPr>
+            <w:tcW w:type="dxa" w:w="3312"/>
+            <w:tcMar>
+              <w:top w:w="80" w:type="dxa"/>
+              <w:bottom w:w="80" w:type="dxa"/>
+              <w:left w:w="100" w:type="dxa"/>
+              <w:right w:w="100" w:type="dxa"/>
+            </w:tcMar>
+          </w:tcPr>
+          <w:p>
+            <w:r>
+              <w:rPr>
+                <w:sz w:val="16"/>
+              </w:rPr>
+              <w:t>Zero-Data Alert Simulator (iOS/Android)</w:t>
+            </w:r>
+          </w:p>
+        </w:tc>
+        <w:tc>
+          <w:tcPr>
+            <w:tcW w:type="dxa" w:w="3312"/>
+            <w:tcMar>
+              <w:top w:w="80" w:type="dxa"/>
+              <w:bottom w:w="80" w:type="dxa"/>
+              <w:left w:w="100" w:type="dxa"/>
+              <w:right w:w="100" w:type="dxa"/>
+            </w:tcMar>
+          </w:tcPr>
+          <w:p>
+            <w:hyperlink r:id="rId11">
+              <w:r>
+                <w:rPr>
+                  <w:color w:val="0056B3"/>
+                  <w:u w:val="single"/>
+                  <w:b/>
+                  <w:sz w:val="19"/>
+                </w:rPr>
                 <w:t>https://frontend-rosy-phi-23.vercel.app/api/v1/alerts/mobile-broadcast</w:t>
               </w:r>
             </w:hyperlink>
@@ -293,7 +358,6 @@
               <w:left w:w="100" w:type="dxa"/>
               <w:right w:w="100" w:type="dxa"/>
             </w:tcMar>
-            <w:shd w:fill="F8FAFC"/>
           </w:tcPr>
           <w:p>
             <w:r>
@@ -315,6 +379,7 @@
               <w:left w:w="100" w:type="dxa"/>
               <w:right w:w="100" w:type="dxa"/>
             </w:tcMar>
+            <w:shd w:fill="F8FAFC"/>
           </w:tcPr>
           <w:p>
             <w:r>
@@ -322,333 +387,6 @@
                 <w:sz w:val="16"/>
               </w:rPr>
               <w:t>Interactive AI Commander Bot</w:t>
-            </w:r>
-          </w:p>
-        </w:tc>
-        <w:tc>
-          <w:tcPr>
-            <w:tcW w:type="dxa" w:w="3312"/>
-            <w:tcMar>
-              <w:top w:w="80" w:type="dxa"/>
-              <w:bottom w:w="80" w:type="dxa"/>
-              <w:left w:w="100" w:type="dxa"/>
-              <w:right w:w="100" w:type="dxa"/>
-            </w:tcMar>
-          </w:tcPr>
-          <w:p>
-            <w:hyperlink r:id="rId9">
-              <w:r>
-                <w:rPr>
-                  <w:color w:val="0056B3"/>
-                  <w:u w:val="single"/>
-                  <w:b/>
-                  <w:sz w:val="19"/>
-                </w:rPr>
-                <w:t>https://frontend-rosy-phi-23.vercel.app</w:t>
-              </w:r>
-            </w:hyperlink>
-          </w:p>
-        </w:tc>
-        <w:tc>
-          <w:tcPr>
-            <w:tcW w:type="dxa" w:w="3312"/>
-            <w:tcMar>
-              <w:top w:w="80" w:type="dxa"/>
-              <w:bottom w:w="80" w:type="dxa"/>
-              <w:left w:w="100" w:type="dxa"/>
-              <w:right w:w="100" w:type="dxa"/>
-            </w:tcMar>
-          </w:tcPr>
-          <w:p>
-            <w:r>
-              <w:rPr>
-                <w:sz w:val="16"/>
-              </w:rPr>
-              <w:t>Click bottom-right floating bot. Answers evacuation queries, hazard reasons, and SOPs</w:t>
-            </w:r>
-          </w:p>
-        </w:tc>
-      </w:tr>
-      <w:tr>
-        <w:tc>
-          <w:tcPr>
-            <w:tcW w:type="dxa" w:w="3312"/>
-            <w:tcMar>
-              <w:top w:w="80" w:type="dxa"/>
-              <w:bottom w:w="80" w:type="dxa"/>
-              <w:left w:w="100" w:type="dxa"/>
-              <w:right w:w="100" w:type="dxa"/>
-            </w:tcMar>
-            <w:shd w:fill="F8FAFC"/>
-          </w:tcPr>
-          <w:p>
-            <w:r>
-              <w:rPr>
-                <w:sz w:val="16"/>
-              </w:rPr>
-              <w:t>ISRO Bhuvan GIS Emergency Map</w:t>
-            </w:r>
-          </w:p>
-        </w:tc>
-        <w:tc>
-          <w:tcPr>
-            <w:tcW w:type="dxa" w:w="3312"/>
-            <w:tcMar>
-              <w:top w:w="80" w:type="dxa"/>
-              <w:bottom w:w="80" w:type="dxa"/>
-              <w:left w:w="100" w:type="dxa"/>
-              <w:right w:w="100" w:type="dxa"/>
-            </w:tcMar>
-            <w:shd w:fill="F8FAFC"/>
-          </w:tcPr>
-          <w:p>
-            <w:hyperlink r:id="rId11">
-              <w:r>
-                <w:rPr>
-                  <w:color w:val="0056B3"/>
-                  <w:u w:val="single"/>
-                  <w:b/>
-                  <w:sz w:val="19"/>
-                </w:rPr>
-                <w:t>https://frontend-rosy-phi-23.vercel.app/emergency</w:t>
-              </w:r>
-            </w:hyperlink>
-          </w:p>
-        </w:tc>
-        <w:tc>
-          <w:tcPr>
-            <w:tcW w:type="dxa" w:w="3312"/>
-            <w:tcMar>
-              <w:top w:w="80" w:type="dxa"/>
-              <w:bottom w:w="80" w:type="dxa"/>
-              <w:left w:w="100" w:type="dxa"/>
-              <w:right w:w="100" w:type="dxa"/>
-            </w:tcMar>
-            <w:shd w:fill="F8FAFC"/>
-          </w:tcPr>
-          <w:p>
-            <w:r>
-              <w:rPr>
-                <w:sz w:val="16"/>
-              </w:rPr>
-              <w:t>Interactive 14-hazard spatial grid, satellite/terrain layers &amp; telemetry badges</w:t>
-            </w:r>
-          </w:p>
-        </w:tc>
-      </w:tr>
-      <w:tr>
-        <w:tc>
-          <w:tcPr>
-            <w:tcW w:type="dxa" w:w="3312"/>
-            <w:tcMar>
-              <w:top w:w="80" w:type="dxa"/>
-              <w:bottom w:w="80" w:type="dxa"/>
-              <w:left w:w="100" w:type="dxa"/>
-              <w:right w:w="100" w:type="dxa"/>
-            </w:tcMar>
-          </w:tcPr>
-          <w:p>
-            <w:r>
-              <w:rPr>
-                <w:sz w:val="16"/>
-              </w:rPr>
-              <w:t>DMMC Ops Control &amp; SMS Dispatcher</w:t>
-            </w:r>
-          </w:p>
-        </w:tc>
-        <w:tc>
-          <w:tcPr>
-            <w:tcW w:type="dxa" w:w="3312"/>
-            <w:tcMar>
-              <w:top w:w="80" w:type="dxa"/>
-              <w:bottom w:w="80" w:type="dxa"/>
-              <w:left w:w="100" w:type="dxa"/>
-              <w:right w:w="100" w:type="dxa"/>
-            </w:tcMar>
-          </w:tcPr>
-          <w:p>
-            <w:hyperlink r:id="rId12">
-              <w:r>
-                <w:rPr>
-                  <w:color w:val="0056B3"/>
-                  <w:u w:val="single"/>
-                  <w:b/>
-                  <w:sz w:val="19"/>
-                </w:rPr>
-                <w:t>https://frontend-rosy-phi-23.vercel.app/admin</w:t>
-              </w:r>
-            </w:hyperlink>
-          </w:p>
-        </w:tc>
-        <w:tc>
-          <w:tcPr>
-            <w:tcW w:type="dxa" w:w="3312"/>
-            <w:tcMar>
-              <w:top w:w="80" w:type="dxa"/>
-              <w:bottom w:w="80" w:type="dxa"/>
-              <w:left w:w="100" w:type="dxa"/>
-              <w:right w:w="100" w:type="dxa"/>
-            </w:tcMar>
-          </w:tcPr>
-          <w:p>
-            <w:r>
-              <w:rPr>
-                <w:sz w:val="16"/>
-              </w:rPr>
-              <w:t>Tab 7: Test live multilingual SMS push &amp; dispatch automated voice calls</w:t>
-            </w:r>
-          </w:p>
-        </w:tc>
-      </w:tr>
-      <w:tr>
-        <w:tc>
-          <w:tcPr>
-            <w:tcW w:type="dxa" w:w="3312"/>
-            <w:tcMar>
-              <w:top w:w="80" w:type="dxa"/>
-              <w:bottom w:w="80" w:type="dxa"/>
-              <w:left w:w="100" w:type="dxa"/>
-              <w:right w:w="100" w:type="dxa"/>
-            </w:tcMar>
-            <w:shd w:fill="F8FAFC"/>
-          </w:tcPr>
-          <w:p>
-            <w:r>
-              <w:rPr>
-                <w:sz w:val="16"/>
-              </w:rPr>
-              <w:t>Evacuation Shelters Directory</w:t>
-            </w:r>
-          </w:p>
-        </w:tc>
-        <w:tc>
-          <w:tcPr>
-            <w:tcW w:type="dxa" w:w="3312"/>
-            <w:tcMar>
-              <w:top w:w="80" w:type="dxa"/>
-              <w:bottom w:w="80" w:type="dxa"/>
-              <w:left w:w="100" w:type="dxa"/>
-              <w:right w:w="100" w:type="dxa"/>
-            </w:tcMar>
-            <w:shd w:fill="F8FAFC"/>
-          </w:tcPr>
-          <w:p>
-            <w:hyperlink r:id="rId13">
-              <w:r>
-                <w:rPr>
-                  <w:color w:val="0056B3"/>
-                  <w:u w:val="single"/>
-                  <w:b/>
-                  <w:sz w:val="19"/>
-                </w:rPr>
-                <w:t>https://frontend-rosy-phi-23.vercel.app/shelters</w:t>
-              </w:r>
-            </w:hyperlink>
-          </w:p>
-        </w:tc>
-        <w:tc>
-          <w:tcPr>
-            <w:tcW w:type="dxa" w:w="3312"/>
-            <w:tcMar>
-              <w:top w:w="80" w:type="dxa"/>
-              <w:bottom w:w="80" w:type="dxa"/>
-              <w:left w:w="100" w:type="dxa"/>
-              <w:right w:w="100" w:type="dxa"/>
-            </w:tcMar>
-            <w:shd w:fill="F8FAFC"/>
-          </w:tcPr>
-          <w:p>
-            <w:r>
-              <w:rPr>
-                <w:sz w:val="16"/>
-              </w:rPr>
-              <w:t>High-ground shelter capacities, GPS coordinates &amp; emergency supply tracking</w:t>
-            </w:r>
-          </w:p>
-        </w:tc>
-      </w:tr>
-      <w:tr>
-        <w:tc>
-          <w:tcPr>
-            <w:tcW w:type="dxa" w:w="3312"/>
-            <w:tcMar>
-              <w:top w:w="80" w:type="dxa"/>
-              <w:bottom w:w="80" w:type="dxa"/>
-              <w:left w:w="100" w:type="dxa"/>
-              <w:right w:w="100" w:type="dxa"/>
-            </w:tcMar>
-          </w:tcPr>
-          <w:p>
-            <w:r>
-              <w:rPr>
-                <w:sz w:val="16"/>
-              </w:rPr>
-              <w:t>Citizen Emergency Guidebook</w:t>
-            </w:r>
-          </w:p>
-        </w:tc>
-        <w:tc>
-          <w:tcPr>
-            <w:tcW w:type="dxa" w:w="3312"/>
-            <w:tcMar>
-              <w:top w:w="80" w:type="dxa"/>
-              <w:bottom w:w="80" w:type="dxa"/>
-              <w:left w:w="100" w:type="dxa"/>
-              <w:right w:w="100" w:type="dxa"/>
-            </w:tcMar>
-          </w:tcPr>
-          <w:p>
-            <w:hyperlink r:id="rId14">
-              <w:r>
-                <w:rPr>
-                  <w:color w:val="0056B3"/>
-                  <w:u w:val="single"/>
-                  <w:b/>
-                  <w:sz w:val="19"/>
-                </w:rPr>
-                <w:t>https://frontend-rosy-phi-23.vercel.app/guidebook</w:t>
-              </w:r>
-            </w:hyperlink>
-          </w:p>
-        </w:tc>
-        <w:tc>
-          <w:tcPr>
-            <w:tcW w:type="dxa" w:w="3312"/>
-            <w:tcMar>
-              <w:top w:w="80" w:type="dxa"/>
-              <w:bottom w:w="80" w:type="dxa"/>
-              <w:left w:w="100" w:type="dxa"/>
-              <w:right w:w="100" w:type="dxa"/>
-            </w:tcMar>
-          </w:tcPr>
-          <w:p>
-            <w:r>
-              <w:rPr>
-                <w:sz w:val="16"/>
-              </w:rPr>
-              <w:t>Offline survival protocols, flash flood evacuation rules &amp; hotlines (112 / 1070)</w:t>
-            </w:r>
-          </w:p>
-        </w:tc>
-      </w:tr>
-      <w:tr>
-        <w:tc>
-          <w:tcPr>
-            <w:tcW w:type="dxa" w:w="3312"/>
-            <w:tcMar>
-              <w:top w:w="80" w:type="dxa"/>
-              <w:bottom w:w="80" w:type="dxa"/>
-              <w:left w:w="100" w:type="dxa"/>
-              <w:right w:w="100" w:type="dxa"/>
-            </w:tcMar>
-            <w:shd w:fill="F8FAFC"/>
-          </w:tcPr>
-          <w:p>
-            <w:r>
-              <w:rPr>
-                <w:sz w:val="16"/>
-              </w:rPr>
-              <w:t>Permanent 24/7 Cloud Link (Vercel)</w:t>
             </w:r>
           </w:p>
         </w:tc>
@@ -693,7 +431,7 @@
               <w:rPr>
                 <w:sz w:val="16"/>
               </w:rPr>
-              <w:t>Permanent production deployment hosted on Vercel's global edge network</w:t>
+              <w:t>Click bottom-right floating bot. Answers evacuation queries, hazard reasons, and SOPs</w:t>
             </w:r>
           </w:p>
         </w:tc>
@@ -714,7 +452,7 @@
               <w:rPr>
                 <w:sz w:val="16"/>
               </w:rPr>
-              <w:t>Official GitHub Repository (Dual-Sync)</w:t>
+              <w:t>ISRO Bhuvan GIS Emergency Map</w:t>
             </w:r>
           </w:p>
         </w:tc>
@@ -729,7 +467,335 @@
             </w:tcMar>
           </w:tcPr>
           <w:p>
+            <w:hyperlink r:id="rId12">
+              <w:r>
+                <w:rPr>
+                  <w:color w:val="0056B3"/>
+                  <w:u w:val="single"/>
+                  <w:b/>
+                  <w:sz w:val="19"/>
+                </w:rPr>
+                <w:t>https://frontend-rosy-phi-23.vercel.app/emergency</w:t>
+              </w:r>
+            </w:hyperlink>
+          </w:p>
+        </w:tc>
+        <w:tc>
+          <w:tcPr>
+            <w:tcW w:type="dxa" w:w="3312"/>
+            <w:tcMar>
+              <w:top w:w="80" w:type="dxa"/>
+              <w:bottom w:w="80" w:type="dxa"/>
+              <w:left w:w="100" w:type="dxa"/>
+              <w:right w:w="100" w:type="dxa"/>
+            </w:tcMar>
+          </w:tcPr>
+          <w:p>
+            <w:r>
+              <w:rPr>
+                <w:sz w:val="16"/>
+              </w:rPr>
+              <w:t>Interactive 14-hazard spatial grid, satellite/terrain layers &amp; telemetry badges</w:t>
+            </w:r>
+          </w:p>
+        </w:tc>
+      </w:tr>
+      <w:tr>
+        <w:tc>
+          <w:tcPr>
+            <w:tcW w:type="dxa" w:w="3312"/>
+            <w:tcMar>
+              <w:top w:w="80" w:type="dxa"/>
+              <w:bottom w:w="80" w:type="dxa"/>
+              <w:left w:w="100" w:type="dxa"/>
+              <w:right w:w="100" w:type="dxa"/>
+            </w:tcMar>
+            <w:shd w:fill="F8FAFC"/>
+          </w:tcPr>
+          <w:p>
+            <w:r>
+              <w:rPr>
+                <w:sz w:val="16"/>
+              </w:rPr>
+              <w:t>DMMC Ops Control &amp; SMS Dispatcher</w:t>
+            </w:r>
+          </w:p>
+        </w:tc>
+        <w:tc>
+          <w:tcPr>
+            <w:tcW w:type="dxa" w:w="3312"/>
+            <w:tcMar>
+              <w:top w:w="80" w:type="dxa"/>
+              <w:bottom w:w="80" w:type="dxa"/>
+              <w:left w:w="100" w:type="dxa"/>
+              <w:right w:w="100" w:type="dxa"/>
+            </w:tcMar>
+            <w:shd w:fill="F8FAFC"/>
+          </w:tcPr>
+          <w:p>
+            <w:hyperlink r:id="rId13">
+              <w:r>
+                <w:rPr>
+                  <w:color w:val="0056B3"/>
+                  <w:u w:val="single"/>
+                  <w:b/>
+                  <w:sz w:val="19"/>
+                </w:rPr>
+                <w:t>https://frontend-rosy-phi-23.vercel.app/admin</w:t>
+              </w:r>
+            </w:hyperlink>
+          </w:p>
+        </w:tc>
+        <w:tc>
+          <w:tcPr>
+            <w:tcW w:type="dxa" w:w="3312"/>
+            <w:tcMar>
+              <w:top w:w="80" w:type="dxa"/>
+              <w:bottom w:w="80" w:type="dxa"/>
+              <w:left w:w="100" w:type="dxa"/>
+              <w:right w:w="100" w:type="dxa"/>
+            </w:tcMar>
+            <w:shd w:fill="F8FAFC"/>
+          </w:tcPr>
+          <w:p>
+            <w:r>
+              <w:rPr>
+                <w:sz w:val="16"/>
+              </w:rPr>
+              <w:t>Tab 7: Test live multilingual SMS push &amp; dispatch automated voice calls</w:t>
+            </w:r>
+          </w:p>
+        </w:tc>
+      </w:tr>
+      <w:tr>
+        <w:tc>
+          <w:tcPr>
+            <w:tcW w:type="dxa" w:w="3312"/>
+            <w:tcMar>
+              <w:top w:w="80" w:type="dxa"/>
+              <w:bottom w:w="80" w:type="dxa"/>
+              <w:left w:w="100" w:type="dxa"/>
+              <w:right w:w="100" w:type="dxa"/>
+            </w:tcMar>
+          </w:tcPr>
+          <w:p>
+            <w:r>
+              <w:rPr>
+                <w:sz w:val="16"/>
+              </w:rPr>
+              <w:t>Evacuation Shelters Directory</w:t>
+            </w:r>
+          </w:p>
+        </w:tc>
+        <w:tc>
+          <w:tcPr>
+            <w:tcW w:type="dxa" w:w="3312"/>
+            <w:tcMar>
+              <w:top w:w="80" w:type="dxa"/>
+              <w:bottom w:w="80" w:type="dxa"/>
+              <w:left w:w="100" w:type="dxa"/>
+              <w:right w:w="100" w:type="dxa"/>
+            </w:tcMar>
+          </w:tcPr>
+          <w:p>
+            <w:hyperlink r:id="rId14">
+              <w:r>
+                <w:rPr>
+                  <w:color w:val="0056B3"/>
+                  <w:u w:val="single"/>
+                  <w:b/>
+                  <w:sz w:val="19"/>
+                </w:rPr>
+                <w:t>https://frontend-rosy-phi-23.vercel.app/shelters</w:t>
+              </w:r>
+            </w:hyperlink>
+          </w:p>
+        </w:tc>
+        <w:tc>
+          <w:tcPr>
+            <w:tcW w:type="dxa" w:w="3312"/>
+            <w:tcMar>
+              <w:top w:w="80" w:type="dxa"/>
+              <w:bottom w:w="80" w:type="dxa"/>
+              <w:left w:w="100" w:type="dxa"/>
+              <w:right w:w="100" w:type="dxa"/>
+            </w:tcMar>
+          </w:tcPr>
+          <w:p>
+            <w:r>
+              <w:rPr>
+                <w:sz w:val="16"/>
+              </w:rPr>
+              <w:t>High-ground shelter capacities, GPS coordinates &amp; emergency supply tracking</w:t>
+            </w:r>
+          </w:p>
+        </w:tc>
+      </w:tr>
+      <w:tr>
+        <w:tc>
+          <w:tcPr>
+            <w:tcW w:type="dxa" w:w="3312"/>
+            <w:tcMar>
+              <w:top w:w="80" w:type="dxa"/>
+              <w:bottom w:w="80" w:type="dxa"/>
+              <w:left w:w="100" w:type="dxa"/>
+              <w:right w:w="100" w:type="dxa"/>
+            </w:tcMar>
+            <w:shd w:fill="F8FAFC"/>
+          </w:tcPr>
+          <w:p>
+            <w:r>
+              <w:rPr>
+                <w:sz w:val="16"/>
+              </w:rPr>
+              <w:t>Citizen Emergency Guidebook</w:t>
+            </w:r>
+          </w:p>
+        </w:tc>
+        <w:tc>
+          <w:tcPr>
+            <w:tcW w:type="dxa" w:w="3312"/>
+            <w:tcMar>
+              <w:top w:w="80" w:type="dxa"/>
+              <w:bottom w:w="80" w:type="dxa"/>
+              <w:left w:w="100" w:type="dxa"/>
+              <w:right w:w="100" w:type="dxa"/>
+            </w:tcMar>
+            <w:shd w:fill="F8FAFC"/>
+          </w:tcPr>
+          <w:p>
             <w:hyperlink r:id="rId15">
+              <w:r>
+                <w:rPr>
+                  <w:color w:val="0056B3"/>
+                  <w:u w:val="single"/>
+                  <w:b/>
+                  <w:sz w:val="19"/>
+                </w:rPr>
+                <w:t>https://frontend-rosy-phi-23.vercel.app/guidebook</w:t>
+              </w:r>
+            </w:hyperlink>
+          </w:p>
+        </w:tc>
+        <w:tc>
+          <w:tcPr>
+            <w:tcW w:type="dxa" w:w="3312"/>
+            <w:tcMar>
+              <w:top w:w="80" w:type="dxa"/>
+              <w:bottom w:w="80" w:type="dxa"/>
+              <w:left w:w="100" w:type="dxa"/>
+              <w:right w:w="100" w:type="dxa"/>
+            </w:tcMar>
+            <w:shd w:fill="F8FAFC"/>
+          </w:tcPr>
+          <w:p>
+            <w:r>
+              <w:rPr>
+                <w:sz w:val="16"/>
+              </w:rPr>
+              <w:t>Offline survival protocols, flash flood evacuation rules &amp; hotlines (112 / 1070)</w:t>
+            </w:r>
+          </w:p>
+        </w:tc>
+      </w:tr>
+      <w:tr>
+        <w:tc>
+          <w:tcPr>
+            <w:tcW w:type="dxa" w:w="3312"/>
+            <w:tcMar>
+              <w:top w:w="80" w:type="dxa"/>
+              <w:bottom w:w="80" w:type="dxa"/>
+              <w:left w:w="100" w:type="dxa"/>
+              <w:right w:w="100" w:type="dxa"/>
+            </w:tcMar>
+          </w:tcPr>
+          <w:p>
+            <w:r>
+              <w:rPr>
+                <w:sz w:val="16"/>
+              </w:rPr>
+              <w:t>Permanent 24/7 Cloud Link (Vercel)</w:t>
+            </w:r>
+          </w:p>
+        </w:tc>
+        <w:tc>
+          <w:tcPr>
+            <w:tcW w:type="dxa" w:w="3312"/>
+            <w:tcMar>
+              <w:top w:w="80" w:type="dxa"/>
+              <w:bottom w:w="80" w:type="dxa"/>
+              <w:left w:w="100" w:type="dxa"/>
+              <w:right w:w="100" w:type="dxa"/>
+            </w:tcMar>
+          </w:tcPr>
+          <w:p>
+            <w:hyperlink r:id="rId9">
+              <w:r>
+                <w:rPr>
+                  <w:color w:val="0056B3"/>
+                  <w:u w:val="single"/>
+                  <w:b/>
+                  <w:sz w:val="19"/>
+                </w:rPr>
+                <w:t>https://frontend-rosy-phi-23.vercel.app</w:t>
+              </w:r>
+            </w:hyperlink>
+          </w:p>
+        </w:tc>
+        <w:tc>
+          <w:tcPr>
+            <w:tcW w:type="dxa" w:w="3312"/>
+            <w:tcMar>
+              <w:top w:w="80" w:type="dxa"/>
+              <w:bottom w:w="80" w:type="dxa"/>
+              <w:left w:w="100" w:type="dxa"/>
+              <w:right w:w="100" w:type="dxa"/>
+            </w:tcMar>
+          </w:tcPr>
+          <w:p>
+            <w:r>
+              <w:rPr>
+                <w:sz w:val="16"/>
+              </w:rPr>
+              <w:t>Permanent production deployment hosted on Vercel's global edge network</w:t>
+            </w:r>
+          </w:p>
+        </w:tc>
+      </w:tr>
+      <w:tr>
+        <w:tc>
+          <w:tcPr>
+            <w:tcW w:type="dxa" w:w="3312"/>
+            <w:tcMar>
+              <w:top w:w="80" w:type="dxa"/>
+              <w:bottom w:w="80" w:type="dxa"/>
+              <w:left w:w="100" w:type="dxa"/>
+              <w:right w:w="100" w:type="dxa"/>
+            </w:tcMar>
+            <w:shd w:fill="F8FAFC"/>
+          </w:tcPr>
+          <w:p>
+            <w:r>
+              <w:rPr>
+                <w:sz w:val="16"/>
+              </w:rPr>
+              <w:t>Official GitHub Repository (Dual-Sync)</w:t>
+            </w:r>
+          </w:p>
+        </w:tc>
+        <w:tc>
+          <w:tcPr>
+            <w:tcW w:type="dxa" w:w="3312"/>
+            <w:tcMar>
+              <w:top w:w="80" w:type="dxa"/>
+              <w:bottom w:w="80" w:type="dxa"/>
+              <w:left w:w="100" w:type="dxa"/>
+              <w:right w:w="100" w:type="dxa"/>
+            </w:tcMar>
+            <w:shd w:fill="F8FAFC"/>
+          </w:tcPr>
+          <w:p>
+            <w:hyperlink r:id="rId16">
               <w:r>
                 <w:rPr>
                   <w:color w:val="0056B3"/>
@@ -751,6 +817,7 @@
               <w:left w:w="100" w:type="dxa"/>
               <w:right w:w="100" w:type="dxa"/>
             </w:tcMar>
+            <w:shd w:fill="F8FAFC"/>
           </w:tcPr>
           <w:p>
             <w:r>

</xml_diff>

<commit_message>
docs: update system documentation and Word docx with Geospatial Early-Warning Platform and RBAC specifications
</commit_message>
<xml_diff>
--- a/DATA_CURATION_AND_ACTIVE_ALERT_SYSTEM.docx
+++ b/DATA_CURATION_AND_ACTIVE_ALERT_SYSTEM.docx
@@ -8,29 +8,70 @@
       </w:pPr>
       <w:r>
         <w:rPr>
+          <w:rFonts w:ascii="Arial" w:hAnsi="Arial"/>
+          <w:b/>
+          <w:color w:val="0A2558"/>
+          <w:sz w:val="40"/>
+        </w:rPr>
+        <w:t>UTTARAKHAND DISASTER EARLY WARNING INTELLIGENCE SYSTEM (UKIS)</w:t>
+      </w:r>
+    </w:p>
+    <w:p>
+      <w:pPr>
+        <w:jc w:val="center"/>
+      </w:pPr>
+      <w:r>
+        <w:rPr>
+          <w:rFonts w:ascii="Arial" w:hAnsi="Arial"/>
           <w:b/>
           <w:color w:val="B91C1C"/>
+          <w:sz w:val="26"/>
+        </w:rPr>
+        <w:t>Data Curation, Provenance Registry &amp; Active Multi-Channel Alerting Architecture</w:t>
+      </w:r>
+    </w:p>
+    <w:p>
+      <w:pPr>
+        <w:jc w:val="center"/>
+      </w:pPr>
+      <w:r>
+        <w:rPr>
+          <w:rFonts w:ascii="Arial" w:hAnsi="Arial"/>
+          <w:i/>
+          <w:color w:val="475569"/>
           <w:sz w:val="19"/>
         </w:rPr>
-        <w:t>GOVERNMENT OF UTTARAKHAND • USDMA &amp; ITDA DEVBHOOMI</w:t>
-        <w:br/>
+        <w:t>UKIS Problem Statement P-011 • State Emergency Operations Centre (SEOC) &amp; DMMC Uttarakhand</w:t>
       </w:r>
+    </w:p>
+    <w:p/>
+    <w:p>
+      <w:pPr>
+        <w:pStyle w:val="Heading1"/>
+      </w:pPr>
       <w:r>
         <w:rPr>
-          <w:b/>
-          <w:color w:val="0A2540"/>
-          <w:sz w:val="36"/>
+          <w:color w:val="0A2558"/>
         </w:rPr>
-        <w:t>AI Mountain Disaster Early-Warning Intelligence</w:t>
-        <w:br/>
+        <w:t>1. Executive Summary &amp; Core Doctrine: Beyond a Passive Dashboard</w:t>
       </w:r>
+    </w:p>
+    <w:p>
       <w:r>
         <w:rPr>
-          <w:i/>
-          <w:color w:val="334155"/>
-          <w:sz w:val="21"/>
+          <w:rFonts w:ascii="Arial" w:hAnsi="Arial"/>
+          <w:sz w:val="20"/>
         </w:rPr>
-        <w:t>UKIS 2026 Problem Statement P-011 • Operational System Documentation</w:t>
+        <w:t>A critical flaw in conventional disaster management software is passivity. Most platforms function purely as observation dashboards—expecting a human operator to constantly watch screens and manually trigger warnings. In the rugged terrain of Uttarakhand, where cloudbursts, glacial lake outbursts (GLOFs), and flash floods propagate through steep river canyons at velocities exceeding 5 meters per second, downstream lead times shrink to 15 to 45 minutes.</w:t>
+      </w:r>
+    </w:p>
+    <w:p>
+      <w:r>
+        <w:rPr>
+          <w:rFonts w:ascii="Arial" w:hAnsi="Arial"/>
+          <w:sz w:val="20"/>
+        </w:rPr>
+        <w:t>When an extreme surge occurs at 2:00 AM, a passive dashboard fails to save lives. The UKIS Early Warning System is built on an active, autonomous alerting doctrine: upon detecting critical threshold breaches through continuous mathematical calculus, the platform automatically initiates multi-channel escalations—including automated priority voice phone calls (IVR) directly to nodal disaster authorities (NDRF, SDRF, District Magistrates, SEOC), hyperlocal multilingual SMS push across 6 regional dialects, C-DOT Cell Broadcasts across mobile towers, and 120dB physical sirens.</w:t>
       </w:r>
     </w:p>
     <w:tbl>
@@ -40,35 +81,42 @@
         <w:tblLook w:firstColumn="1" w:firstRow="1" w:lastColumn="0" w:lastRow="0" w:noHBand="0" w:noVBand="1" w:val="04A0"/>
       </w:tblPr>
       <w:tblGrid>
-        <w:gridCol w:w="9936"/>
+        <w:gridCol w:w="10080"/>
       </w:tblGrid>
       <w:tr>
         <w:tc>
           <w:tcPr>
-            <w:tcW w:type="dxa" w:w="9936"/>
-            <w:shd w:fill="F0F9FF"/>
+            <w:tcW w:type="dxa" w:w="10080"/>
+            <w:shd w:fill="F1F5F9"/>
             <w:tcMar>
-              <w:top w:w="120" w:type="dxa"/>
-              <w:bottom w:w="120" w:type="dxa"/>
-              <w:left w:w="180" w:type="dxa"/>
-              <w:right w:w="180" w:type="dxa"/>
+              <w:top w:w="150" w:type="dxa"/>
+              <w:bottom w:w="150" w:type="dxa"/>
+              <w:left w:w="200" w:type="dxa"/>
+              <w:right w:w="200" w:type="dxa"/>
             </w:tcMar>
           </w:tcPr>
           <w:p>
             <w:r>
               <w:rPr>
                 <w:b/>
-                <w:color w:val="0A2540"/>
-                <w:sz w:val="19"/>
+                <w:color w:val="0A2558"/>
+                <w:sz w:val="21"/>
               </w:rPr>
-              <w:t>EXECUTIVE SUMMARY (WHY THIS IS NOT JUST A DASHBOARD):</w:t>
+              <w:t>THE 4 PILLARS OF UKIS ACTIVE EARLY WARNING:</w:t>
               <w:br/>
             </w:r>
             <w:r>
               <w:rPr>
-                <w:sz w:val="18"/>
+                <w:color w:val="1E293B"/>
+                <w:sz w:val="19"/>
               </w:rPr>
-              <w:t>Standard dashboards passively wait for someone to check a screen. In Himalayan valleys, flash floods and GLOFs travel at &gt;5 m/s, leaving only 15–45 minutes of warning time. This system actively defends lives by: (1) Autonomously dialing voice phone calls to SDRF and District Magistrates with spoken English/Hindi alerts, (2) Pushing multilingual SMS in 6 local dialects with Dijkstra escape routes, (3) Actuating 120dB physical sirens, and (4) Providing an AI Commander Bot grounded in USDMA SOPs with 0% data fabrication.</w:t>
+              <w:t>1. Real Multi-Source Curation: Real-time river gauges, rainfall, satellite SAR, soil moisture, and seismic streams.</w:t>
+              <w:br/>
+              <w:t>2. Calculus Threat Engine: Instantaneous rate-of-rise (dH/dt ≥ 0.8m/hr) and rain intensity (dP/dt ≥ 50mm/hr) detection.</w:t>
+              <w:br/>
+              <w:t>3. Automated Authority Calling: Direct phone calls to DM, SDRF Commandant, and SEOC with spoken bilingual audio.</w:t>
+              <w:br/>
+              <w:t>4. Hyperlocal Public Informing: Vernacular SMS (Hindi, Garhwali, Kumaoni, Jaunsari), C-DOT Cell Broadcast, and Sirens.</w:t>
             </w:r>
           </w:p>
         </w:tc>
@@ -81,9 +129,9 @@
       </w:pPr>
       <w:r>
         <w:rPr>
-          <w:color w:val="0A2540"/>
+          <w:color w:val="0A2558"/>
         </w:rPr>
-        <w:t>1. Live Clickable Links for Judges &amp; Evaluators</w:t>
+        <w:t>Interactive Live Links for Judges &amp; Evaluators (Click to Open)</w:t>
       </w:r>
     </w:p>
     <w:p>
@@ -102,15 +150,15 @@
         <w:tblLook w:firstColumn="1" w:firstRow="1" w:lastColumn="0" w:lastRow="0" w:noHBand="0" w:noVBand="1" w:val="04A0"/>
       </w:tblPr>
       <w:tblGrid>
-        <w:gridCol w:w="3312"/>
-        <w:gridCol w:w="3312"/>
-        <w:gridCol w:w="3312"/>
+        <w:gridCol w:w="3360"/>
+        <w:gridCol w:w="3360"/>
+        <w:gridCol w:w="3360"/>
       </w:tblGrid>
       <w:tr>
         <w:tc>
           <w:tcPr>
-            <w:tcW w:type="dxa" w:w="3312"/>
-            <w:shd w:fill="0A2540"/>
+            <w:tcW w:type="dxa" w:w="3360"/>
+            <w:shd w:fill="0A2558"/>
             <w:tcMar>
               <w:top w:w="100" w:type="dxa"/>
               <w:bottom w:w="100" w:type="dxa"/>
@@ -131,8 +179,8 @@
         </w:tc>
         <w:tc>
           <w:tcPr>
-            <w:tcW w:type="dxa" w:w="3312"/>
-            <w:shd w:fill="0A2540"/>
+            <w:tcW w:type="dxa" w:w="3360"/>
+            <w:shd w:fill="0A2558"/>
             <w:tcMar>
               <w:top w:w="100" w:type="dxa"/>
               <w:bottom w:w="100" w:type="dxa"/>
@@ -147,14 +195,14 @@
                 <w:color w:val="FFFFFF"/>
                 <w:sz w:val="17"/>
               </w:rPr>
-              <w:t>Direct Clickable Link (Click to Open)</w:t>
+              <w:t>Clickable Live URL (Click to Open)</w:t>
             </w:r>
           </w:p>
         </w:tc>
         <w:tc>
           <w:tcPr>
-            <w:tcW w:type="dxa" w:w="3312"/>
-            <w:shd w:fill="0A2540"/>
+            <w:tcW w:type="dxa" w:w="3360"/>
+            <w:shd w:fill="0A2558"/>
             <w:tcMar>
               <w:top w:w="100" w:type="dxa"/>
               <w:bottom w:w="100" w:type="dxa"/>
@@ -177,10 +225,10 @@
       <w:tr>
         <w:tc>
           <w:tcPr>
-            <w:tcW w:type="dxa" w:w="3312"/>
+            <w:tcW w:type="dxa" w:w="3360"/>
             <w:tcMar>
-              <w:top w:w="80" w:type="dxa"/>
-              <w:bottom w:w="80" w:type="dxa"/>
+              <w:top w:w="70" w:type="dxa"/>
+              <w:bottom w:w="70" w:type="dxa"/>
               <w:left w:w="100" w:type="dxa"/>
               <w:right w:w="100" w:type="dxa"/>
             </w:tcMar>
@@ -196,10 +244,10 @@
         </w:tc>
         <w:tc>
           <w:tcPr>
-            <w:tcW w:type="dxa" w:w="3312"/>
+            <w:tcW w:type="dxa" w:w="3360"/>
             <w:tcMar>
-              <w:top w:w="80" w:type="dxa"/>
-              <w:bottom w:w="80" w:type="dxa"/>
+              <w:top w:w="70" w:type="dxa"/>
+              <w:bottom w:w="70" w:type="dxa"/>
               <w:left w:w="100" w:type="dxa"/>
               <w:right w:w="100" w:type="dxa"/>
             </w:tcMar>
@@ -213,17 +261,17 @@
                   <w:b/>
                   <w:sz w:val="19"/>
                 </w:rPr>
-                <w:t>https://frontend-rosy-phi-23.vercel.app</w:t>
+                <w:t>https://d87699113bb09f.lhr.life</w:t>
               </w:r>
             </w:hyperlink>
           </w:p>
         </w:tc>
         <w:tc>
           <w:tcPr>
-            <w:tcW w:type="dxa" w:w="3312"/>
+            <w:tcW w:type="dxa" w:w="3360"/>
             <w:tcMar>
-              <w:top w:w="80" w:type="dxa"/>
-              <w:bottom w:w="80" w:type="dxa"/>
+              <w:top w:w="70" w:type="dxa"/>
+              <w:bottom w:w="70" w:type="dxa"/>
               <w:left w:w="100" w:type="dxa"/>
               <w:right w:w="100" w:type="dxa"/>
             </w:tcMar>
@@ -241,141 +289,10 @@
       <w:tr>
         <w:tc>
           <w:tcPr>
-            <w:tcW w:type="dxa" w:w="3312"/>
+            <w:tcW w:type="dxa" w:w="3360"/>
             <w:tcMar>
-              <w:top w:w="80" w:type="dxa"/>
-              <w:bottom w:w="80" w:type="dxa"/>
-              <w:left w:w="100" w:type="dxa"/>
-              <w:right w:w="100" w:type="dxa"/>
-            </w:tcMar>
-            <w:shd w:fill="F8FAFC"/>
-          </w:tcPr>
-          <w:p>
-            <w:r>
-              <w:rPr>
-                <w:sz w:val="16"/>
-              </w:rPr>
-              <w:t>Mountain Intelligence Hub (7 Problem Engines)</w:t>
-            </w:r>
-          </w:p>
-        </w:tc>
-        <w:tc>
-          <w:tcPr>
-            <w:tcW w:type="dxa" w:w="3312"/>
-            <w:tcMar>
-              <w:top w:w="80" w:type="dxa"/>
-              <w:bottom w:w="80" w:type="dxa"/>
-              <w:left w:w="100" w:type="dxa"/>
-              <w:right w:w="100" w:type="dxa"/>
-            </w:tcMar>
-            <w:shd w:fill="F8FAFC"/>
-          </w:tcPr>
-          <w:p>
-            <w:hyperlink r:id="rId10">
-              <w:r>
-                <w:rPr>
-                  <w:color w:val="0056B3"/>
-                  <w:u w:val="single"/>
-                  <w:b/>
-                  <w:sz w:val="19"/>
-                </w:rPr>
-                <w:t>https://frontend-rosy-phi-23.vercel.app/mountain-intelligence</w:t>
-              </w:r>
-            </w:hyperlink>
-          </w:p>
-        </w:tc>
-        <w:tc>
-          <w:tcPr>
-            <w:tcW w:type="dxa" w:w="3312"/>
-            <w:tcMar>
-              <w:top w:w="80" w:type="dxa"/>
-              <w:bottom w:w="80" w:type="dxa"/>
-              <w:left w:w="100" w:type="dxa"/>
-              <w:right w:w="100" w:type="dxa"/>
-            </w:tcMar>
-            <w:shd w:fill="F8FAFC"/>
-          </w:tcPr>
-          <w:p>
-            <w:r>
-              <w:rPr>
-                <w:sz w:val="16"/>
-              </w:rPr>
-              <w:t>Live empirical modeling of GLOFs, cloudbursts, canyon hydraulics, seismic cascades &amp; sensor mortality</w:t>
-            </w:r>
-          </w:p>
-        </w:tc>
-      </w:tr>
-      <w:tr>
-        <w:tc>
-          <w:tcPr>
-            <w:tcW w:type="dxa" w:w="3312"/>
-            <w:tcMar>
-              <w:top w:w="80" w:type="dxa"/>
-              <w:bottom w:w="80" w:type="dxa"/>
-              <w:left w:w="100" w:type="dxa"/>
-              <w:right w:w="100" w:type="dxa"/>
-            </w:tcMar>
-          </w:tcPr>
-          <w:p>
-            <w:r>
-              <w:rPr>
-                <w:sz w:val="16"/>
-              </w:rPr>
-              <w:t>Zero-Data Alert Simulator (iOS/Android)</w:t>
-            </w:r>
-          </w:p>
-        </w:tc>
-        <w:tc>
-          <w:tcPr>
-            <w:tcW w:type="dxa" w:w="3312"/>
-            <w:tcMar>
-              <w:top w:w="80" w:type="dxa"/>
-              <w:bottom w:w="80" w:type="dxa"/>
-              <w:left w:w="100" w:type="dxa"/>
-              <w:right w:w="100" w:type="dxa"/>
-            </w:tcMar>
-          </w:tcPr>
-          <w:p>
-            <w:hyperlink r:id="rId11">
-              <w:r>
-                <w:rPr>
-                  <w:color w:val="0056B3"/>
-                  <w:u w:val="single"/>
-                  <w:b/>
-                  <w:sz w:val="19"/>
-                </w:rPr>
-                <w:t>https://frontend-rosy-phi-23.vercel.app/api/v1/alerts/mobile-broadcast</w:t>
-              </w:r>
-            </w:hyperlink>
-          </w:p>
-        </w:tc>
-        <w:tc>
-          <w:tcPr>
-            <w:tcW w:type="dxa" w:w="3312"/>
-            <w:tcMar>
-              <w:top w:w="80" w:type="dxa"/>
-              <w:bottom w:w="80" w:type="dxa"/>
-              <w:left w:w="100" w:type="dxa"/>
-              <w:right w:w="100" w:type="dxa"/>
-            </w:tcMar>
-          </w:tcPr>
-          <w:p>
-            <w:r>
-              <w:rPr>
-                <w:sz w:val="16"/>
-              </w:rPr>
-              <w:t>3GPP TS 23.041 zero-data &amp; grid power failure mobile broadcast test API</w:t>
-            </w:r>
-          </w:p>
-        </w:tc>
-      </w:tr>
-      <w:tr>
-        <w:tc>
-          <w:tcPr>
-            <w:tcW w:type="dxa" w:w="3312"/>
-            <w:tcMar>
-              <w:top w:w="80" w:type="dxa"/>
-              <w:bottom w:w="80" w:type="dxa"/>
+              <w:top w:w="70" w:type="dxa"/>
+              <w:bottom w:w="70" w:type="dxa"/>
               <w:left w:w="100" w:type="dxa"/>
               <w:right w:w="100" w:type="dxa"/>
             </w:tcMar>
@@ -392,10 +309,10 @@
         </w:tc>
         <w:tc>
           <w:tcPr>
-            <w:tcW w:type="dxa" w:w="3312"/>
+            <w:tcW w:type="dxa" w:w="3360"/>
             <w:tcMar>
-              <w:top w:w="80" w:type="dxa"/>
-              <w:bottom w:w="80" w:type="dxa"/>
+              <w:top w:w="70" w:type="dxa"/>
+              <w:bottom w:w="70" w:type="dxa"/>
               <w:left w:w="100" w:type="dxa"/>
               <w:right w:w="100" w:type="dxa"/>
             </w:tcMar>
@@ -410,17 +327,17 @@
                   <w:b/>
                   <w:sz w:val="19"/>
                 </w:rPr>
-                <w:t>https://frontend-rosy-phi-23.vercel.app</w:t>
+                <w:t>https://d87699113bb09f.lhr.life</w:t>
               </w:r>
             </w:hyperlink>
           </w:p>
         </w:tc>
         <w:tc>
           <w:tcPr>
-            <w:tcW w:type="dxa" w:w="3312"/>
+            <w:tcW w:type="dxa" w:w="3360"/>
             <w:tcMar>
-              <w:top w:w="80" w:type="dxa"/>
-              <w:bottom w:w="80" w:type="dxa"/>
+              <w:top w:w="70" w:type="dxa"/>
+              <w:bottom w:w="70" w:type="dxa"/>
               <w:left w:w="100" w:type="dxa"/>
               <w:right w:w="100" w:type="dxa"/>
             </w:tcMar>
@@ -439,10 +356,10 @@
       <w:tr>
         <w:tc>
           <w:tcPr>
-            <w:tcW w:type="dxa" w:w="3312"/>
+            <w:tcW w:type="dxa" w:w="3360"/>
             <w:tcMar>
-              <w:top w:w="80" w:type="dxa"/>
-              <w:bottom w:w="80" w:type="dxa"/>
+              <w:top w:w="70" w:type="dxa"/>
+              <w:bottom w:w="70" w:type="dxa"/>
               <w:left w:w="100" w:type="dxa"/>
               <w:right w:w="100" w:type="dxa"/>
             </w:tcMar>
@@ -458,16 +375,16 @@
         </w:tc>
         <w:tc>
           <w:tcPr>
-            <w:tcW w:type="dxa" w:w="3312"/>
+            <w:tcW w:type="dxa" w:w="3360"/>
             <w:tcMar>
-              <w:top w:w="80" w:type="dxa"/>
-              <w:bottom w:w="80" w:type="dxa"/>
+              <w:top w:w="70" w:type="dxa"/>
+              <w:bottom w:w="70" w:type="dxa"/>
               <w:left w:w="100" w:type="dxa"/>
               <w:right w:w="100" w:type="dxa"/>
             </w:tcMar>
           </w:tcPr>
           <w:p>
-            <w:hyperlink r:id="rId12">
+            <w:hyperlink r:id="rId10">
               <w:r>
                 <w:rPr>
                   <w:color w:val="0056B3"/>
@@ -475,17 +392,17 @@
                   <w:b/>
                   <w:sz w:val="19"/>
                 </w:rPr>
-                <w:t>https://frontend-rosy-phi-23.vercel.app/emergency</w:t>
+                <w:t>https://d87699113bb09f.lhr.life/emergency</w:t>
               </w:r>
             </w:hyperlink>
           </w:p>
         </w:tc>
         <w:tc>
           <w:tcPr>
-            <w:tcW w:type="dxa" w:w="3312"/>
+            <w:tcW w:type="dxa" w:w="3360"/>
             <w:tcMar>
-              <w:top w:w="80" w:type="dxa"/>
-              <w:bottom w:w="80" w:type="dxa"/>
+              <w:top w:w="70" w:type="dxa"/>
+              <w:bottom w:w="70" w:type="dxa"/>
               <w:left w:w="100" w:type="dxa"/>
               <w:right w:w="100" w:type="dxa"/>
             </w:tcMar>
@@ -503,10 +420,10 @@
       <w:tr>
         <w:tc>
           <w:tcPr>
-            <w:tcW w:type="dxa" w:w="3312"/>
+            <w:tcW w:type="dxa" w:w="3360"/>
             <w:tcMar>
-              <w:top w:w="80" w:type="dxa"/>
-              <w:bottom w:w="80" w:type="dxa"/>
+              <w:top w:w="70" w:type="dxa"/>
+              <w:bottom w:w="70" w:type="dxa"/>
               <w:left w:w="100" w:type="dxa"/>
               <w:right w:w="100" w:type="dxa"/>
             </w:tcMar>
@@ -523,17 +440,17 @@
         </w:tc>
         <w:tc>
           <w:tcPr>
-            <w:tcW w:type="dxa" w:w="3312"/>
+            <w:tcW w:type="dxa" w:w="3360"/>
             <w:tcMar>
-              <w:top w:w="80" w:type="dxa"/>
-              <w:bottom w:w="80" w:type="dxa"/>
+              <w:top w:w="70" w:type="dxa"/>
+              <w:bottom w:w="70" w:type="dxa"/>
               <w:left w:w="100" w:type="dxa"/>
               <w:right w:w="100" w:type="dxa"/>
             </w:tcMar>
             <w:shd w:fill="F8FAFC"/>
           </w:tcPr>
           <w:p>
-            <w:hyperlink r:id="rId13">
+            <w:hyperlink r:id="rId11">
               <w:r>
                 <w:rPr>
                   <w:color w:val="0056B3"/>
@@ -541,17 +458,17 @@
                   <w:b/>
                   <w:sz w:val="19"/>
                 </w:rPr>
-                <w:t>https://frontend-rosy-phi-23.vercel.app/admin</w:t>
+                <w:t>https://d87699113bb09f.lhr.life/admin</w:t>
               </w:r>
             </w:hyperlink>
           </w:p>
         </w:tc>
         <w:tc>
           <w:tcPr>
-            <w:tcW w:type="dxa" w:w="3312"/>
+            <w:tcW w:type="dxa" w:w="3360"/>
             <w:tcMar>
-              <w:top w:w="80" w:type="dxa"/>
-              <w:bottom w:w="80" w:type="dxa"/>
+              <w:top w:w="70" w:type="dxa"/>
+              <w:bottom w:w="70" w:type="dxa"/>
               <w:left w:w="100" w:type="dxa"/>
               <w:right w:w="100" w:type="dxa"/>
             </w:tcMar>
@@ -562,7 +479,7 @@
               <w:rPr>
                 <w:sz w:val="16"/>
               </w:rPr>
-              <w:t>Tab 7: Test live multilingual SMS push &amp; dispatch automated voice calls</w:t>
+              <w:t>Tab 7: Test live multilingual SMS push &amp; dispatch automated authority voice calls</w:t>
             </w:r>
           </w:p>
         </w:tc>
@@ -570,10 +487,10 @@
       <w:tr>
         <w:tc>
           <w:tcPr>
-            <w:tcW w:type="dxa" w:w="3312"/>
+            <w:tcW w:type="dxa" w:w="3360"/>
             <w:tcMar>
-              <w:top w:w="80" w:type="dxa"/>
-              <w:bottom w:w="80" w:type="dxa"/>
+              <w:top w:w="70" w:type="dxa"/>
+              <w:bottom w:w="70" w:type="dxa"/>
               <w:left w:w="100" w:type="dxa"/>
               <w:right w:w="100" w:type="dxa"/>
             </w:tcMar>
@@ -589,16 +506,16 @@
         </w:tc>
         <w:tc>
           <w:tcPr>
-            <w:tcW w:type="dxa" w:w="3312"/>
+            <w:tcW w:type="dxa" w:w="3360"/>
             <w:tcMar>
-              <w:top w:w="80" w:type="dxa"/>
-              <w:bottom w:w="80" w:type="dxa"/>
+              <w:top w:w="70" w:type="dxa"/>
+              <w:bottom w:w="70" w:type="dxa"/>
               <w:left w:w="100" w:type="dxa"/>
               <w:right w:w="100" w:type="dxa"/>
             </w:tcMar>
           </w:tcPr>
           <w:p>
-            <w:hyperlink r:id="rId14">
+            <w:hyperlink r:id="rId12">
               <w:r>
                 <w:rPr>
                   <w:color w:val="0056B3"/>
@@ -606,17 +523,17 @@
                   <w:b/>
                   <w:sz w:val="19"/>
                 </w:rPr>
-                <w:t>https://frontend-rosy-phi-23.vercel.app/shelters</w:t>
+                <w:t>https://d87699113bb09f.lhr.life/shelters</w:t>
               </w:r>
             </w:hyperlink>
           </w:p>
         </w:tc>
         <w:tc>
           <w:tcPr>
-            <w:tcW w:type="dxa" w:w="3312"/>
+            <w:tcW w:type="dxa" w:w="3360"/>
             <w:tcMar>
-              <w:top w:w="80" w:type="dxa"/>
-              <w:bottom w:w="80" w:type="dxa"/>
+              <w:top w:w="70" w:type="dxa"/>
+              <w:bottom w:w="70" w:type="dxa"/>
               <w:left w:w="100" w:type="dxa"/>
               <w:right w:w="100" w:type="dxa"/>
             </w:tcMar>
@@ -634,10 +551,10 @@
       <w:tr>
         <w:tc>
           <w:tcPr>
-            <w:tcW w:type="dxa" w:w="3312"/>
+            <w:tcW w:type="dxa" w:w="3360"/>
             <w:tcMar>
-              <w:top w:w="80" w:type="dxa"/>
-              <w:bottom w:w="80" w:type="dxa"/>
+              <w:top w:w="70" w:type="dxa"/>
+              <w:bottom w:w="70" w:type="dxa"/>
               <w:left w:w="100" w:type="dxa"/>
               <w:right w:w="100" w:type="dxa"/>
             </w:tcMar>
@@ -654,17 +571,17 @@
         </w:tc>
         <w:tc>
           <w:tcPr>
-            <w:tcW w:type="dxa" w:w="3312"/>
+            <w:tcW w:type="dxa" w:w="3360"/>
             <w:tcMar>
-              <w:top w:w="80" w:type="dxa"/>
-              <w:bottom w:w="80" w:type="dxa"/>
+              <w:top w:w="70" w:type="dxa"/>
+              <w:bottom w:w="70" w:type="dxa"/>
               <w:left w:w="100" w:type="dxa"/>
               <w:right w:w="100" w:type="dxa"/>
             </w:tcMar>
             <w:shd w:fill="F8FAFC"/>
           </w:tcPr>
           <w:p>
-            <w:hyperlink r:id="rId15">
+            <w:hyperlink r:id="rId13">
               <w:r>
                 <w:rPr>
                   <w:color w:val="0056B3"/>
@@ -672,17 +589,17 @@
                   <w:b/>
                   <w:sz w:val="19"/>
                 </w:rPr>
-                <w:t>https://frontend-rosy-phi-23.vercel.app/guidebook</w:t>
+                <w:t>https://d87699113bb09f.lhr.life/guidebook</w:t>
               </w:r>
             </w:hyperlink>
           </w:p>
         </w:tc>
         <w:tc>
           <w:tcPr>
-            <w:tcW w:type="dxa" w:w="3312"/>
+            <w:tcW w:type="dxa" w:w="3360"/>
             <w:tcMar>
-              <w:top w:w="80" w:type="dxa"/>
-              <w:bottom w:w="80" w:type="dxa"/>
+              <w:top w:w="70" w:type="dxa"/>
+              <w:bottom w:w="70" w:type="dxa"/>
               <w:left w:w="100" w:type="dxa"/>
               <w:right w:w="100" w:type="dxa"/>
             </w:tcMar>
@@ -701,10 +618,10 @@
       <w:tr>
         <w:tc>
           <w:tcPr>
-            <w:tcW w:type="dxa" w:w="3312"/>
+            <w:tcW w:type="dxa" w:w="3360"/>
             <w:tcMar>
-              <w:top w:w="80" w:type="dxa"/>
-              <w:bottom w:w="80" w:type="dxa"/>
+              <w:top w:w="70" w:type="dxa"/>
+              <w:bottom w:w="70" w:type="dxa"/>
               <w:left w:w="100" w:type="dxa"/>
               <w:right w:w="100" w:type="dxa"/>
             </w:tcMar>
@@ -720,16 +637,16 @@
         </w:tc>
         <w:tc>
           <w:tcPr>
-            <w:tcW w:type="dxa" w:w="3312"/>
+            <w:tcW w:type="dxa" w:w="3360"/>
             <w:tcMar>
-              <w:top w:w="80" w:type="dxa"/>
-              <w:bottom w:w="80" w:type="dxa"/>
+              <w:top w:w="70" w:type="dxa"/>
+              <w:bottom w:w="70" w:type="dxa"/>
               <w:left w:w="100" w:type="dxa"/>
               <w:right w:w="100" w:type="dxa"/>
             </w:tcMar>
           </w:tcPr>
           <w:p>
-            <w:hyperlink r:id="rId9">
+            <w:hyperlink r:id="rId14">
               <w:r>
                 <w:rPr>
                   <w:color w:val="0056B3"/>
@@ -744,10 +661,10 @@
         </w:tc>
         <w:tc>
           <w:tcPr>
-            <w:tcW w:type="dxa" w:w="3312"/>
+            <w:tcW w:type="dxa" w:w="3360"/>
             <w:tcMar>
-              <w:top w:w="80" w:type="dxa"/>
-              <w:bottom w:w="80" w:type="dxa"/>
+              <w:top w:w="70" w:type="dxa"/>
+              <w:bottom w:w="70" w:type="dxa"/>
               <w:left w:w="100" w:type="dxa"/>
               <w:right w:w="100" w:type="dxa"/>
             </w:tcMar>
@@ -762,10 +679,264 @@
           </w:p>
         </w:tc>
       </w:tr>
+    </w:tbl>
+    <w:p/>
+    <w:p>
+      <w:pPr>
+        <w:pStyle w:val="Heading1"/>
+      </w:pPr>
+      <w:r>
+        <w:rPr>
+          <w:color w:val="0A2558"/>
+        </w:rPr>
+        <w:t>2. Complete Master Registry of Curated Data &amp; External APIs</w:t>
+      </w:r>
+    </w:p>
+    <w:p>
+      <w:r>
+        <w:rPr>
+          <w:rFonts w:ascii="Arial" w:hAnsi="Arial"/>
+          <w:sz w:val="20"/>
+        </w:rPr>
+        <w:t>Every data value in this platform has verifiable provenance. Under statutory principles, the system adheres to a strict Zero Data Fabrication Policy: if an upstream provider is unconfigured or unreachable, the system reports DATA UNAVAILABLE and never manufactures synthetic numbers.</w:t>
+      </w:r>
+    </w:p>
+    <w:tbl>
+      <w:tblPr>
+        <w:tblW w:type="auto" w:w="0"/>
+        <w:jc w:val="center"/>
+        <w:tblLook w:firstColumn="1" w:firstRow="1" w:lastColumn="0" w:lastRow="0" w:noHBand="0" w:noVBand="1" w:val="04A0"/>
+      </w:tblPr>
+      <w:tblGrid>
+        <w:gridCol w:w="2016"/>
+        <w:gridCol w:w="2016"/>
+        <w:gridCol w:w="2016"/>
+        <w:gridCol w:w="2016"/>
+        <w:gridCol w:w="2016"/>
+      </w:tblGrid>
       <w:tr>
         <w:tc>
           <w:tcPr>
-            <w:tcW w:type="dxa" w:w="3312"/>
+            <w:tcW w:type="dxa" w:w="2016"/>
+            <w:shd w:fill="0A2558"/>
+            <w:tcMar>
+              <w:top w:w="120" w:type="dxa"/>
+              <w:bottom w:w="120" w:type="dxa"/>
+              <w:left w:w="120" w:type="dxa"/>
+              <w:right w:w="120" w:type="dxa"/>
+            </w:tcMar>
+          </w:tcPr>
+          <w:p>
+            <w:r>
+              <w:rPr>
+                <w:rFonts w:ascii="Arial" w:hAnsi="Arial"/>
+                <w:b/>
+                <w:color w:val="FFFFFF"/>
+                <w:sz w:val="17"/>
+              </w:rPr>
+              <w:t>Data Stream &amp; Provider</w:t>
+            </w:r>
+          </w:p>
+        </w:tc>
+        <w:tc>
+          <w:tcPr>
+            <w:tcW w:type="dxa" w:w="2016"/>
+            <w:shd w:fill="0A2558"/>
+            <w:tcMar>
+              <w:top w:w="120" w:type="dxa"/>
+              <w:bottom w:w="120" w:type="dxa"/>
+              <w:left w:w="120" w:type="dxa"/>
+              <w:right w:w="120" w:type="dxa"/>
+            </w:tcMar>
+          </w:tcPr>
+          <w:p>
+            <w:r>
+              <w:rPr>
+                <w:rFonts w:ascii="Arial" w:hAnsi="Arial"/>
+                <w:b/>
+                <w:color w:val="FFFFFF"/>
+                <w:sz w:val="17"/>
+              </w:rPr>
+              <w:t>Ingested Parameters</w:t>
+            </w:r>
+          </w:p>
+        </w:tc>
+        <w:tc>
+          <w:tcPr>
+            <w:tcW w:type="dxa" w:w="2016"/>
+            <w:shd w:fill="0A2558"/>
+            <w:tcMar>
+              <w:top w:w="120" w:type="dxa"/>
+              <w:bottom w:w="120" w:type="dxa"/>
+              <w:left w:w="120" w:type="dxa"/>
+              <w:right w:w="120" w:type="dxa"/>
+            </w:tcMar>
+          </w:tcPr>
+          <w:p>
+            <w:r>
+              <w:rPr>
+                <w:rFonts w:ascii="Arial" w:hAnsi="Arial"/>
+                <w:b/>
+                <w:color w:val="FFFFFF"/>
+                <w:sz w:val="17"/>
+              </w:rPr>
+              <w:t>Spatial / Temporal Resolution</w:t>
+            </w:r>
+          </w:p>
+        </w:tc>
+        <w:tc>
+          <w:tcPr>
+            <w:tcW w:type="dxa" w:w="2016"/>
+            <w:shd w:fill="0A2558"/>
+            <w:tcMar>
+              <w:top w:w="120" w:type="dxa"/>
+              <w:bottom w:w="120" w:type="dxa"/>
+              <w:left w:w="120" w:type="dxa"/>
+              <w:right w:w="120" w:type="dxa"/>
+            </w:tcMar>
+          </w:tcPr>
+          <w:p>
+            <w:r>
+              <w:rPr>
+                <w:rFonts w:ascii="Arial" w:hAnsi="Arial"/>
+                <w:b/>
+                <w:color w:val="FFFFFF"/>
+                <w:sz w:val="17"/>
+              </w:rPr>
+              <w:t>Cadence</w:t>
+            </w:r>
+          </w:p>
+        </w:tc>
+        <w:tc>
+          <w:tcPr>
+            <w:tcW w:type="dxa" w:w="2016"/>
+            <w:shd w:fill="0A2558"/>
+            <w:tcMar>
+              <w:top w:w="120" w:type="dxa"/>
+              <w:bottom w:w="120" w:type="dxa"/>
+              <w:left w:w="120" w:type="dxa"/>
+              <w:right w:w="120" w:type="dxa"/>
+            </w:tcMar>
+          </w:tcPr>
+          <w:p>
+            <w:r>
+              <w:rPr>
+                <w:rFonts w:ascii="Arial" w:hAnsi="Arial"/>
+                <w:b/>
+                <w:color w:val="FFFFFF"/>
+                <w:sz w:val="17"/>
+              </w:rPr>
+              <w:t>Operational Purpose</w:t>
+            </w:r>
+          </w:p>
+        </w:tc>
+      </w:tr>
+      <w:tr>
+        <w:tc>
+          <w:tcPr>
+            <w:tcW w:type="dxa" w:w="2016"/>
+            <w:tcMar>
+              <w:top w:w="80" w:type="dxa"/>
+              <w:bottom w:w="80" w:type="dxa"/>
+              <w:left w:w="100" w:type="dxa"/>
+              <w:right w:w="100" w:type="dxa"/>
+            </w:tcMar>
+          </w:tcPr>
+          <w:p>
+            <w:r>
+              <w:rPr>
+                <w:rFonts w:ascii="Arial" w:hAnsi="Arial"/>
+                <w:sz w:val="15"/>
+              </w:rPr>
+              <w:t>Central Water Commission (CWC India-WRIS)</w:t>
+            </w:r>
+          </w:p>
+        </w:tc>
+        <w:tc>
+          <w:tcPr>
+            <w:tcW w:type="dxa" w:w="2016"/>
+            <w:tcMar>
+              <w:top w:w="80" w:type="dxa"/>
+              <w:bottom w:w="80" w:type="dxa"/>
+              <w:left w:w="100" w:type="dxa"/>
+              <w:right w:w="100" w:type="dxa"/>
+            </w:tcMar>
+          </w:tcPr>
+          <w:p>
+            <w:r>
+              <w:rPr>
+                <w:rFonts w:ascii="Arial" w:hAnsi="Arial"/>
+                <w:sz w:val="15"/>
+              </w:rPr>
+              <w:t>River Stage H (m MSL), Danger &amp; Warning Marks, Rate of Rise dH/dt (m/hr), Base Flow Q (cumecs)</w:t>
+            </w:r>
+          </w:p>
+        </w:tc>
+        <w:tc>
+          <w:tcPr>
+            <w:tcW w:type="dxa" w:w="2016"/>
+            <w:tcMar>
+              <w:top w:w="80" w:type="dxa"/>
+              <w:bottom w:w="80" w:type="dxa"/>
+              <w:left w:w="100" w:type="dxa"/>
+              <w:right w:w="100" w:type="dxa"/>
+            </w:tcMar>
+          </w:tcPr>
+          <w:p>
+            <w:r>
+              <w:rPr>
+                <w:rFonts w:ascii="Arial" w:hAnsi="Arial"/>
+                <w:sz w:val="15"/>
+              </w:rPr>
+              <w:t>Station-level (Joshimath, Rudraprayag, Uttarkashi, Srinagar, Rishikesh, Haridwar)</w:t>
+            </w:r>
+          </w:p>
+        </w:tc>
+        <w:tc>
+          <w:tcPr>
+            <w:tcW w:type="dxa" w:w="2016"/>
+            <w:tcMar>
+              <w:top w:w="80" w:type="dxa"/>
+              <w:bottom w:w="80" w:type="dxa"/>
+              <w:left w:w="100" w:type="dxa"/>
+              <w:right w:w="100" w:type="dxa"/>
+            </w:tcMar>
+          </w:tcPr>
+          <w:p>
+            <w:r>
+              <w:rPr>
+                <w:rFonts w:ascii="Arial" w:hAnsi="Arial"/>
+                <w:sz w:val="15"/>
+              </w:rPr>
+              <w:t>Sub-hourly / telemetry</w:t>
+            </w:r>
+          </w:p>
+        </w:tc>
+        <w:tc>
+          <w:tcPr>
+            <w:tcW w:type="dxa" w:w="2016"/>
+            <w:tcMar>
+              <w:top w:w="80" w:type="dxa"/>
+              <w:bottom w:w="80" w:type="dxa"/>
+              <w:left w:w="100" w:type="dxa"/>
+              <w:right w:w="100" w:type="dxa"/>
+            </w:tcMar>
+          </w:tcPr>
+          <w:p>
+            <w:r>
+              <w:rPr>
+                <w:rFonts w:ascii="Arial" w:hAnsi="Arial"/>
+                <w:sz w:val="15"/>
+              </w:rPr>
+              <w:t>Primary river surge detection, dam breach wave tracking</w:t>
+            </w:r>
+          </w:p>
+        </w:tc>
+      </w:tr>
+      <w:tr>
+        <w:tc>
+          <w:tcPr>
+            <w:tcW w:type="dxa" w:w="2016"/>
             <w:tcMar>
               <w:top w:w="80" w:type="dxa"/>
               <w:bottom w:w="80" w:type="dxa"/>
@@ -777,40 +948,16 @@
           <w:p>
             <w:r>
               <w:rPr>
-                <w:sz w:val="16"/>
+                <w:rFonts w:ascii="Arial" w:hAnsi="Arial"/>
+                <w:sz w:val="15"/>
               </w:rPr>
-              <w:t>Official GitHub Repository (Dual-Sync)</w:t>
+              <w:t>India Meteorological Department (IMD Mausam)</w:t>
             </w:r>
           </w:p>
         </w:tc>
         <w:tc>
           <w:tcPr>
-            <w:tcW w:type="dxa" w:w="3312"/>
-            <w:tcMar>
-              <w:top w:w="80" w:type="dxa"/>
-              <w:bottom w:w="80" w:type="dxa"/>
-              <w:left w:w="100" w:type="dxa"/>
-              <w:right w:w="100" w:type="dxa"/>
-            </w:tcMar>
-            <w:shd w:fill="F8FAFC"/>
-          </w:tcPr>
-          <w:p>
-            <w:hyperlink r:id="rId16">
-              <w:r>
-                <w:rPr>
-                  <w:color w:val="0056B3"/>
-                  <w:u w:val="single"/>
-                  <w:b/>
-                  <w:sz w:val="19"/>
-                </w:rPr>
-                <w:t>https://github.com/adityajoshi202424-commits/ukis-mountain-disaster-early-warning</w:t>
-              </w:r>
-            </w:hyperlink>
-          </w:p>
-        </w:tc>
-        <w:tc>
-          <w:tcPr>
-            <w:tcW w:type="dxa" w:w="3312"/>
+            <w:tcW w:type="dxa" w:w="2016"/>
             <w:tcMar>
               <w:top w:w="80" w:type="dxa"/>
               <w:bottom w:w="80" w:type="dxa"/>
@@ -822,9 +969,1429 @@
           <w:p>
             <w:r>
               <w:rPr>
-                <w:sz w:val="16"/>
+                <w:rFonts w:ascii="Arial" w:hAnsi="Arial"/>
+                <w:sz w:val="15"/>
               </w:rPr>
-              <w:t>Direct git tracking repo synced with Vercel production</w:t>
+              <w:t>AWS Hourly Rainfall (mm/hr), SOP-01 Cloudburst Nowcasts (≥50mm/hr), Doppler Radar (dBZ)</w:t>
+            </w:r>
+          </w:p>
+        </w:tc>
+        <w:tc>
+          <w:tcPr>
+            <w:tcW w:type="dxa" w:w="2016"/>
+            <w:tcMar>
+              <w:top w:w="80" w:type="dxa"/>
+              <w:bottom w:w="80" w:type="dxa"/>
+              <w:left w:w="100" w:type="dxa"/>
+              <w:right w:w="100" w:type="dxa"/>
+            </w:tcMar>
+            <w:shd w:fill="F8FAFC"/>
+          </w:tcPr>
+          <w:p>
+            <w:r>
+              <w:rPr>
+                <w:rFonts w:ascii="Arial" w:hAnsi="Arial"/>
+                <w:sz w:val="15"/>
+              </w:rPr>
+              <w:t>Station-level / District Grid</w:t>
+            </w:r>
+          </w:p>
+        </w:tc>
+        <w:tc>
+          <w:tcPr>
+            <w:tcW w:type="dxa" w:w="2016"/>
+            <w:tcMar>
+              <w:top w:w="80" w:type="dxa"/>
+              <w:bottom w:w="80" w:type="dxa"/>
+              <w:left w:w="100" w:type="dxa"/>
+              <w:right w:w="100" w:type="dxa"/>
+            </w:tcMar>
+            <w:shd w:fill="F8FAFC"/>
+          </w:tcPr>
+          <w:p>
+            <w:r>
+              <w:rPr>
+                <w:rFonts w:ascii="Arial" w:hAnsi="Arial"/>
+                <w:sz w:val="15"/>
+              </w:rPr>
+              <w:t>Hourly to 3-hourly nowcasts</w:t>
+            </w:r>
+          </w:p>
+        </w:tc>
+        <w:tc>
+          <w:tcPr>
+            <w:tcW w:type="dxa" w:w="2016"/>
+            <w:tcMar>
+              <w:top w:w="80" w:type="dxa"/>
+              <w:bottom w:w="80" w:type="dxa"/>
+              <w:left w:w="100" w:type="dxa"/>
+              <w:right w:w="100" w:type="dxa"/>
+            </w:tcMar>
+            <w:shd w:fill="F8FAFC"/>
+          </w:tcPr>
+          <w:p>
+            <w:r>
+              <w:rPr>
+                <w:rFonts w:ascii="Arial" w:hAnsi="Arial"/>
+                <w:sz w:val="15"/>
+              </w:rPr>
+              <w:t>Cloudburst detection, extreme weather advisories</w:t>
+            </w:r>
+          </w:p>
+        </w:tc>
+      </w:tr>
+      <w:tr>
+        <w:tc>
+          <w:tcPr>
+            <w:tcW w:type="dxa" w:w="2016"/>
+            <w:tcMar>
+              <w:top w:w="80" w:type="dxa"/>
+              <w:bottom w:w="80" w:type="dxa"/>
+              <w:left w:w="100" w:type="dxa"/>
+              <w:right w:w="100" w:type="dxa"/>
+            </w:tcMar>
+          </w:tcPr>
+          <w:p>
+            <w:r>
+              <w:rPr>
+                <w:rFonts w:ascii="Arial" w:hAnsi="Arial"/>
+                <w:sz w:val="15"/>
+              </w:rPr>
+              <w:t>Open-Meteo High-Resolution Grid (ECMWF &amp; DWD)</w:t>
+            </w:r>
+          </w:p>
+        </w:tc>
+        <w:tc>
+          <w:tcPr>
+            <w:tcW w:type="dxa" w:w="2016"/>
+            <w:tcMar>
+              <w:top w:w="80" w:type="dxa"/>
+              <w:bottom w:w="80" w:type="dxa"/>
+              <w:left w:w="100" w:type="dxa"/>
+              <w:right w:w="100" w:type="dxa"/>
+            </w:tcMar>
+          </w:tcPr>
+          <w:p>
+            <w:r>
+              <w:rPr>
+                <w:rFonts w:ascii="Arial" w:hAnsi="Arial"/>
+                <w:sz w:val="15"/>
+              </w:rPr>
+              <w:t>Hourly precipitation, 72h rolling cumulative rainfall, soil moisture (0-7cm, 7-28cm), 0°C freezing level</w:t>
+            </w:r>
+          </w:p>
+        </w:tc>
+        <w:tc>
+          <w:tcPr>
+            <w:tcW w:type="dxa" w:w="2016"/>
+            <w:tcMar>
+              <w:top w:w="80" w:type="dxa"/>
+              <w:bottom w:w="80" w:type="dxa"/>
+              <w:left w:w="100" w:type="dxa"/>
+              <w:right w:w="100" w:type="dxa"/>
+            </w:tcMar>
+          </w:tcPr>
+          <w:p>
+            <w:r>
+              <w:rPr>
+                <w:rFonts w:ascii="Arial" w:hAnsi="Arial"/>
+                <w:sz w:val="15"/>
+              </w:rPr>
+              <w:t>0.25° (~25 km) grid</w:t>
+            </w:r>
+          </w:p>
+        </w:tc>
+        <w:tc>
+          <w:tcPr>
+            <w:tcW w:type="dxa" w:w="2016"/>
+            <w:tcMar>
+              <w:top w:w="80" w:type="dxa"/>
+              <w:bottom w:w="80" w:type="dxa"/>
+              <w:left w:w="100" w:type="dxa"/>
+              <w:right w:w="100" w:type="dxa"/>
+            </w:tcMar>
+          </w:tcPr>
+          <w:p>
+            <w:r>
+              <w:rPr>
+                <w:rFonts w:ascii="Arial" w:hAnsi="Arial"/>
+                <w:sz w:val="15"/>
+              </w:rPr>
+              <w:t>Hourly real-time</w:t>
+            </w:r>
+          </w:p>
+        </w:tc>
+        <w:tc>
+          <w:tcPr>
+            <w:tcW w:type="dxa" w:w="2016"/>
+            <w:tcMar>
+              <w:top w:w="80" w:type="dxa"/>
+              <w:bottom w:w="80" w:type="dxa"/>
+              <w:left w:w="100" w:type="dxa"/>
+              <w:right w:w="100" w:type="dxa"/>
+            </w:tcMar>
+          </w:tcPr>
+          <w:p>
+            <w:r>
+              <w:rPr>
+                <w:rFonts w:ascii="Arial" w:hAnsi="Arial"/>
+                <w:sz w:val="15"/>
+              </w:rPr>
+              <w:t>Soil saturation index (Sm), antecedent moisture (API), freeze-thaw</w:t>
+            </w:r>
+          </w:p>
+        </w:tc>
+      </w:tr>
+      <w:tr>
+        <w:tc>
+          <w:tcPr>
+            <w:tcW w:type="dxa" w:w="2016"/>
+            <w:tcMar>
+              <w:top w:w="80" w:type="dxa"/>
+              <w:bottom w:w="80" w:type="dxa"/>
+              <w:left w:w="100" w:type="dxa"/>
+              <w:right w:w="100" w:type="dxa"/>
+            </w:tcMar>
+            <w:shd w:fill="F8FAFC"/>
+          </w:tcPr>
+          <w:p>
+            <w:r>
+              <w:rPr>
+                <w:rFonts w:ascii="Arial" w:hAnsi="Arial"/>
+                <w:sz w:val="15"/>
+              </w:rPr>
+              <w:t>Copernicus GloFAS (ECMWF)</w:t>
+            </w:r>
+          </w:p>
+        </w:tc>
+        <w:tc>
+          <w:tcPr>
+            <w:tcW w:type="dxa" w:w="2016"/>
+            <w:tcMar>
+              <w:top w:w="80" w:type="dxa"/>
+              <w:bottom w:w="80" w:type="dxa"/>
+              <w:left w:w="100" w:type="dxa"/>
+              <w:right w:w="100" w:type="dxa"/>
+            </w:tcMar>
+            <w:shd w:fill="F8FAFC"/>
+          </w:tcPr>
+          <w:p>
+            <w:r>
+              <w:rPr>
+                <w:rFonts w:ascii="Arial" w:hAnsi="Arial"/>
+                <w:sz w:val="15"/>
+              </w:rPr>
+              <w:t>51-member ensemble river discharge forecast hydrographs (T+00h to T+72h in cumecs)</w:t>
+            </w:r>
+          </w:p>
+        </w:tc>
+        <w:tc>
+          <w:tcPr>
+            <w:tcW w:type="dxa" w:w="2016"/>
+            <w:tcMar>
+              <w:top w:w="80" w:type="dxa"/>
+              <w:bottom w:w="80" w:type="dxa"/>
+              <w:left w:w="100" w:type="dxa"/>
+              <w:right w:w="100" w:type="dxa"/>
+            </w:tcMar>
+            <w:shd w:fill="F8FAFC"/>
+          </w:tcPr>
+          <w:p>
+            <w:r>
+              <w:rPr>
+                <w:rFonts w:ascii="Arial" w:hAnsi="Arial"/>
+                <w:sz w:val="15"/>
+              </w:rPr>
+              <w:t>10 km river grid points</w:t>
+            </w:r>
+          </w:p>
+        </w:tc>
+        <w:tc>
+          <w:tcPr>
+            <w:tcW w:type="dxa" w:w="2016"/>
+            <w:tcMar>
+              <w:top w:w="80" w:type="dxa"/>
+              <w:bottom w:w="80" w:type="dxa"/>
+              <w:left w:w="100" w:type="dxa"/>
+              <w:right w:w="100" w:type="dxa"/>
+            </w:tcMar>
+            <w:shd w:fill="F8FAFC"/>
+          </w:tcPr>
+          <w:p>
+            <w:r>
+              <w:rPr>
+                <w:rFonts w:ascii="Arial" w:hAnsi="Arial"/>
+                <w:sz w:val="15"/>
+              </w:rPr>
+              <w:t>Daily forecast cycles</w:t>
+            </w:r>
+          </w:p>
+        </w:tc>
+        <w:tc>
+          <w:tcPr>
+            <w:tcW w:type="dxa" w:w="2016"/>
+            <w:tcMar>
+              <w:top w:w="80" w:type="dxa"/>
+              <w:bottom w:w="80" w:type="dxa"/>
+              <w:left w:w="100" w:type="dxa"/>
+              <w:right w:w="100" w:type="dxa"/>
+            </w:tcMar>
+            <w:shd w:fill="F8FAFC"/>
+          </w:tcPr>
+          <w:p>
+            <w:r>
+              <w:rPr>
+                <w:rFonts w:ascii="Arial" w:hAnsi="Arial"/>
+                <w:sz w:val="15"/>
+              </w:rPr>
+              <w:t>Probabilistic hydrological forecasting, flood crest arrival timing</w:t>
+            </w:r>
+          </w:p>
+        </w:tc>
+      </w:tr>
+      <w:tr>
+        <w:tc>
+          <w:tcPr>
+            <w:tcW w:type="dxa" w:w="2016"/>
+            <w:tcMar>
+              <w:top w:w="80" w:type="dxa"/>
+              <w:bottom w:w="80" w:type="dxa"/>
+              <w:left w:w="100" w:type="dxa"/>
+              <w:right w:w="100" w:type="dxa"/>
+            </w:tcMar>
+          </w:tcPr>
+          <w:p>
+            <w:r>
+              <w:rPr>
+                <w:rFonts w:ascii="Arial" w:hAnsi="Arial"/>
+                <w:sz w:val="15"/>
+              </w:rPr>
+              <w:t>NASA POWER &amp; GPM IMERG</w:t>
+            </w:r>
+          </w:p>
+        </w:tc>
+        <w:tc>
+          <w:tcPr>
+            <w:tcW w:type="dxa" w:w="2016"/>
+            <w:tcMar>
+              <w:top w:w="80" w:type="dxa"/>
+              <w:bottom w:w="80" w:type="dxa"/>
+              <w:left w:w="100" w:type="dxa"/>
+              <w:right w:w="100" w:type="dxa"/>
+            </w:tcMar>
+          </w:tcPr>
+          <w:p>
+            <w:r>
+              <w:rPr>
+                <w:rFonts w:ascii="Arial" w:hAnsi="Arial"/>
+                <w:sz w:val="15"/>
+              </w:rPr>
+              <w:t>Hourly precipitation, satellite radar precipitation (0.1° IMERG), humidity, irradiance</w:t>
+            </w:r>
+          </w:p>
+        </w:tc>
+        <w:tc>
+          <w:tcPr>
+            <w:tcW w:type="dxa" w:w="2016"/>
+            <w:tcMar>
+              <w:top w:w="80" w:type="dxa"/>
+              <w:bottom w:w="80" w:type="dxa"/>
+              <w:left w:w="100" w:type="dxa"/>
+              <w:right w:w="100" w:type="dxa"/>
+            </w:tcMar>
+          </w:tcPr>
+          <w:p>
+            <w:r>
+              <w:rPr>
+                <w:rFonts w:ascii="Arial" w:hAnsi="Arial"/>
+                <w:sz w:val="15"/>
+              </w:rPr>
+              <w:t>0.1° (~10 km) grid</w:t>
+            </w:r>
+          </w:p>
+        </w:tc>
+        <w:tc>
+          <w:tcPr>
+            <w:tcW w:type="dxa" w:w="2016"/>
+            <w:tcMar>
+              <w:top w:w="80" w:type="dxa"/>
+              <w:bottom w:w="80" w:type="dxa"/>
+              <w:left w:w="100" w:type="dxa"/>
+              <w:right w:w="100" w:type="dxa"/>
+            </w:tcMar>
+          </w:tcPr>
+          <w:p>
+            <w:r>
+              <w:rPr>
+                <w:rFonts w:ascii="Arial" w:hAnsi="Arial"/>
+                <w:sz w:val="15"/>
+              </w:rPr>
+              <w:t>Half-hourly to hourly</w:t>
+            </w:r>
+          </w:p>
+        </w:tc>
+        <w:tc>
+          <w:tcPr>
+            <w:tcW w:type="dxa" w:w="2016"/>
+            <w:tcMar>
+              <w:top w:w="80" w:type="dxa"/>
+              <w:bottom w:w="80" w:type="dxa"/>
+              <w:left w:w="100" w:type="dxa"/>
+              <w:right w:w="100" w:type="dxa"/>
+            </w:tcMar>
+          </w:tcPr>
+          <w:p>
+            <w:r>
+              <w:rPr>
+                <w:rFonts w:ascii="Arial" w:hAnsi="Arial"/>
+                <w:sz w:val="15"/>
+              </w:rPr>
+              <w:t>Gauge-independent satellite precipitation across remote peaks</w:t>
+            </w:r>
+          </w:p>
+        </w:tc>
+      </w:tr>
+      <w:tr>
+        <w:tc>
+          <w:tcPr>
+            <w:tcW w:type="dxa" w:w="2016"/>
+            <w:tcMar>
+              <w:top w:w="80" w:type="dxa"/>
+              <w:bottom w:w="80" w:type="dxa"/>
+              <w:left w:w="100" w:type="dxa"/>
+              <w:right w:w="100" w:type="dxa"/>
+            </w:tcMar>
+            <w:shd w:fill="F8FAFC"/>
+          </w:tcPr>
+          <w:p>
+            <w:r>
+              <w:rPr>
+                <w:rFonts w:ascii="Arial" w:hAnsi="Arial"/>
+                <w:sz w:val="15"/>
+              </w:rPr>
+              <w:t>USGS Earthquake Hazards Program</w:t>
+            </w:r>
+          </w:p>
+        </w:tc>
+        <w:tc>
+          <w:tcPr>
+            <w:tcW w:type="dxa" w:w="2016"/>
+            <w:tcMar>
+              <w:top w:w="80" w:type="dxa"/>
+              <w:bottom w:w="80" w:type="dxa"/>
+              <w:left w:w="100" w:type="dxa"/>
+              <w:right w:w="100" w:type="dxa"/>
+            </w:tcMar>
+            <w:shd w:fill="F8FAFC"/>
+          </w:tcPr>
+          <w:p>
+            <w:r>
+              <w:rPr>
+                <w:rFonts w:ascii="Arial" w:hAnsi="Arial"/>
+                <w:sz w:val="15"/>
+              </w:rPr>
+              <w:t>Seismic magnitude (Mw), hypocenter depth (km), epicenter coordinates, origin epoch</w:t>
+            </w:r>
+          </w:p>
+        </w:tc>
+        <w:tc>
+          <w:tcPr>
+            <w:tcW w:type="dxa" w:w="2016"/>
+            <w:tcMar>
+              <w:top w:w="80" w:type="dxa"/>
+              <w:bottom w:w="80" w:type="dxa"/>
+              <w:left w:w="100" w:type="dxa"/>
+              <w:right w:w="100" w:type="dxa"/>
+            </w:tcMar>
+            <w:shd w:fill="F8FAFC"/>
+          </w:tcPr>
+          <w:p>
+            <w:r>
+              <w:rPr>
+                <w:rFonts w:ascii="Arial" w:hAnsi="Arial"/>
+                <w:sz w:val="15"/>
+              </w:rPr>
+              <w:t>Point events</w:t>
+            </w:r>
+          </w:p>
+        </w:tc>
+        <w:tc>
+          <w:tcPr>
+            <w:tcW w:type="dxa" w:w="2016"/>
+            <w:tcMar>
+              <w:top w:w="80" w:type="dxa"/>
+              <w:bottom w:w="80" w:type="dxa"/>
+              <w:left w:w="100" w:type="dxa"/>
+              <w:right w:w="100" w:type="dxa"/>
+            </w:tcMar>
+            <w:shd w:fill="F8FAFC"/>
+          </w:tcPr>
+          <w:p>
+            <w:r>
+              <w:rPr>
+                <w:rFonts w:ascii="Arial" w:hAnsi="Arial"/>
+                <w:sz w:val="15"/>
+              </w:rPr>
+              <w:t>Real-time (&lt;5 min latency)</w:t>
+            </w:r>
+          </w:p>
+        </w:tc>
+        <w:tc>
+          <w:tcPr>
+            <w:tcW w:type="dxa" w:w="2016"/>
+            <w:tcMar>
+              <w:top w:w="80" w:type="dxa"/>
+              <w:bottom w:w="80" w:type="dxa"/>
+              <w:left w:w="100" w:type="dxa"/>
+              <w:right w:w="100" w:type="dxa"/>
+            </w:tcMar>
+            <w:shd w:fill="F8FAFC"/>
+          </w:tcPr>
+          <w:p>
+            <w:r>
+              <w:rPr>
+                <w:rFonts w:ascii="Arial" w:hAnsi="Arial"/>
+                <w:sz w:val="15"/>
+              </w:rPr>
+              <w:t>Live seismic trigger monitoring along Main Central Thrust (MCT)</w:t>
+            </w:r>
+          </w:p>
+        </w:tc>
+      </w:tr>
+      <w:tr>
+        <w:tc>
+          <w:tcPr>
+            <w:tcW w:type="dxa" w:w="2016"/>
+            <w:tcMar>
+              <w:top w:w="80" w:type="dxa"/>
+              <w:bottom w:w="80" w:type="dxa"/>
+              <w:left w:w="100" w:type="dxa"/>
+              <w:right w:w="100" w:type="dxa"/>
+            </w:tcMar>
+          </w:tcPr>
+          <w:p>
+            <w:r>
+              <w:rPr>
+                <w:rFonts w:ascii="Arial" w:hAnsi="Arial"/>
+                <w:sz w:val="15"/>
+              </w:rPr>
+              <w:t>IIT Roorkee EEW Network</w:t>
+            </w:r>
+          </w:p>
+        </w:tc>
+        <w:tc>
+          <w:tcPr>
+            <w:tcW w:type="dxa" w:w="2016"/>
+            <w:tcMar>
+              <w:top w:w="80" w:type="dxa"/>
+              <w:bottom w:w="80" w:type="dxa"/>
+              <w:left w:w="100" w:type="dxa"/>
+              <w:right w:w="100" w:type="dxa"/>
+            </w:tcMar>
+          </w:tcPr>
+          <w:p>
+            <w:r>
+              <w:rPr>
+                <w:rFonts w:ascii="Arial" w:hAnsi="Arial"/>
+                <w:sz w:val="15"/>
+              </w:rPr>
+              <w:t>Peak Ground Acceleration (m/s²), P-wave detection, Seismic Intensity Index</w:t>
+            </w:r>
+          </w:p>
+        </w:tc>
+        <w:tc>
+          <w:tcPr>
+            <w:tcW w:type="dxa" w:w="2016"/>
+            <w:tcMar>
+              <w:top w:w="80" w:type="dxa"/>
+              <w:bottom w:w="80" w:type="dxa"/>
+              <w:left w:w="100" w:type="dxa"/>
+              <w:right w:w="100" w:type="dxa"/>
+            </w:tcMar>
+          </w:tcPr>
+          <w:p>
+            <w:r>
+              <w:rPr>
+                <w:rFonts w:ascii="Arial" w:hAnsi="Arial"/>
+                <w:sz w:val="15"/>
+              </w:rPr>
+              <w:t>Station array across Uttarakhand</w:t>
+            </w:r>
+          </w:p>
+        </w:tc>
+        <w:tc>
+          <w:tcPr>
+            <w:tcW w:type="dxa" w:w="2016"/>
+            <w:tcMar>
+              <w:top w:w="80" w:type="dxa"/>
+              <w:bottom w:w="80" w:type="dxa"/>
+              <w:left w:w="100" w:type="dxa"/>
+              <w:right w:w="100" w:type="dxa"/>
+            </w:tcMar>
+          </w:tcPr>
+          <w:p>
+            <w:r>
+              <w:rPr>
+                <w:rFonts w:ascii="Arial" w:hAnsi="Arial"/>
+                <w:sz w:val="15"/>
+              </w:rPr>
+              <w:t>Sub-second telemetry</w:t>
+            </w:r>
+          </w:p>
+        </w:tc>
+        <w:tc>
+          <w:tcPr>
+            <w:tcW w:type="dxa" w:w="2016"/>
+            <w:tcMar>
+              <w:top w:w="80" w:type="dxa"/>
+              <w:bottom w:w="80" w:type="dxa"/>
+              <w:left w:w="100" w:type="dxa"/>
+              <w:right w:w="100" w:type="dxa"/>
+            </w:tcMar>
+          </w:tcPr>
+          <w:p>
+            <w:r>
+              <w:rPr>
+                <w:rFonts w:ascii="Arial" w:hAnsi="Arial"/>
+                <w:sz w:val="15"/>
+              </w:rPr>
+              <w:t>Early warning before damaging S-waves strike weakened slopes</w:t>
+            </w:r>
+          </w:p>
+        </w:tc>
+      </w:tr>
+      <w:tr>
+        <w:tc>
+          <w:tcPr>
+            <w:tcW w:type="dxa" w:w="2016"/>
+            <w:tcMar>
+              <w:top w:w="80" w:type="dxa"/>
+              <w:bottom w:w="80" w:type="dxa"/>
+              <w:left w:w="100" w:type="dxa"/>
+              <w:right w:w="100" w:type="dxa"/>
+            </w:tcMar>
+            <w:shd w:fill="F8FAFC"/>
+          </w:tcPr>
+          <w:p>
+            <w:r>
+              <w:rPr>
+                <w:rFonts w:ascii="Arial" w:hAnsi="Arial"/>
+                <w:sz w:val="15"/>
+              </w:rPr>
+              <w:t>Copernicus Sentinel-1 SAR Radar</w:t>
+            </w:r>
+          </w:p>
+        </w:tc>
+        <w:tc>
+          <w:tcPr>
+            <w:tcW w:type="dxa" w:w="2016"/>
+            <w:tcMar>
+              <w:top w:w="80" w:type="dxa"/>
+              <w:bottom w:w="80" w:type="dxa"/>
+              <w:left w:w="100" w:type="dxa"/>
+              <w:right w:w="100" w:type="dxa"/>
+            </w:tcMar>
+            <w:shd w:fill="F8FAFC"/>
+          </w:tcPr>
+          <w:p>
+            <w:r>
+              <w:rPr>
+                <w:rFonts w:ascii="Arial" w:hAnsi="Arial"/>
+                <w:sz w:val="15"/>
+              </w:rPr>
+              <w:t>C-Band SAR GRD/SLC radar backscatter (dB), interferometric coherence, flood extent</w:t>
+            </w:r>
+          </w:p>
+        </w:tc>
+        <w:tc>
+          <w:tcPr>
+            <w:tcW w:type="dxa" w:w="2016"/>
+            <w:tcMar>
+              <w:top w:w="80" w:type="dxa"/>
+              <w:bottom w:w="80" w:type="dxa"/>
+              <w:left w:w="100" w:type="dxa"/>
+              <w:right w:w="100" w:type="dxa"/>
+            </w:tcMar>
+            <w:shd w:fill="F8FAFC"/>
+          </w:tcPr>
+          <w:p>
+            <w:r>
+              <w:rPr>
+                <w:rFonts w:ascii="Arial" w:hAnsi="Arial"/>
+                <w:sz w:val="15"/>
+              </w:rPr>
+              <w:t>10 m spatial resolution</w:t>
+            </w:r>
+          </w:p>
+        </w:tc>
+        <w:tc>
+          <w:tcPr>
+            <w:tcW w:type="dxa" w:w="2016"/>
+            <w:tcMar>
+              <w:top w:w="80" w:type="dxa"/>
+              <w:bottom w:w="80" w:type="dxa"/>
+              <w:left w:w="100" w:type="dxa"/>
+              <w:right w:w="100" w:type="dxa"/>
+            </w:tcMar>
+            <w:shd w:fill="F8FAFC"/>
+          </w:tcPr>
+          <w:p>
+            <w:r>
+              <w:rPr>
+                <w:rFonts w:ascii="Arial" w:hAnsi="Arial"/>
+                <w:sz w:val="15"/>
+              </w:rPr>
+              <w:t>6-12 day repeat orbit</w:t>
+            </w:r>
+          </w:p>
+        </w:tc>
+        <w:tc>
+          <w:tcPr>
+            <w:tcW w:type="dxa" w:w="2016"/>
+            <w:tcMar>
+              <w:top w:w="80" w:type="dxa"/>
+              <w:bottom w:w="80" w:type="dxa"/>
+              <w:left w:w="100" w:type="dxa"/>
+              <w:right w:w="100" w:type="dxa"/>
+            </w:tcMar>
+            <w:shd w:fill="F8FAFC"/>
+          </w:tcPr>
+          <w:p>
+            <w:r>
+              <w:rPr>
+                <w:rFonts w:ascii="Arial" w:hAnsi="Arial"/>
+                <w:sz w:val="15"/>
+              </w:rPr>
+              <w:t>All-weather cloud-penetrating inundation mapping &amp; slope motion</w:t>
+            </w:r>
+          </w:p>
+        </w:tc>
+      </w:tr>
+      <w:tr>
+        <w:tc>
+          <w:tcPr>
+            <w:tcW w:type="dxa" w:w="2016"/>
+            <w:tcMar>
+              <w:top w:w="80" w:type="dxa"/>
+              <w:bottom w:w="80" w:type="dxa"/>
+              <w:left w:w="100" w:type="dxa"/>
+              <w:right w:w="100" w:type="dxa"/>
+            </w:tcMar>
+          </w:tcPr>
+          <w:p>
+            <w:r>
+              <w:rPr>
+                <w:rFonts w:ascii="Arial" w:hAnsi="Arial"/>
+                <w:sz w:val="15"/>
+              </w:rPr>
+              <w:t>Copernicus Sentinel-2 Optical MSI</w:t>
+            </w:r>
+          </w:p>
+        </w:tc>
+        <w:tc>
+          <w:tcPr>
+            <w:tcW w:type="dxa" w:w="2016"/>
+            <w:tcMar>
+              <w:top w:w="80" w:type="dxa"/>
+              <w:bottom w:w="80" w:type="dxa"/>
+              <w:left w:w="100" w:type="dxa"/>
+              <w:right w:w="100" w:type="dxa"/>
+            </w:tcMar>
+          </w:tcPr>
+          <w:p>
+            <w:r>
+              <w:rPr>
+                <w:rFonts w:ascii="Arial" w:hAnsi="Arial"/>
+                <w:sz w:val="15"/>
+              </w:rPr>
+              <w:t>Band 3 (Green) &amp; Band 8 (NIR), NDWI water index, glacial lake surface area delta</w:t>
+            </w:r>
+          </w:p>
+        </w:tc>
+        <w:tc>
+          <w:tcPr>
+            <w:tcW w:type="dxa" w:w="2016"/>
+            <w:tcMar>
+              <w:top w:w="80" w:type="dxa"/>
+              <w:bottom w:w="80" w:type="dxa"/>
+              <w:left w:w="100" w:type="dxa"/>
+              <w:right w:w="100" w:type="dxa"/>
+            </w:tcMar>
+          </w:tcPr>
+          <w:p>
+            <w:r>
+              <w:rPr>
+                <w:rFonts w:ascii="Arial" w:hAnsi="Arial"/>
+                <w:sz w:val="15"/>
+              </w:rPr>
+              <w:t>10 m spatial resolution</w:t>
+            </w:r>
+          </w:p>
+        </w:tc>
+        <w:tc>
+          <w:tcPr>
+            <w:tcW w:type="dxa" w:w="2016"/>
+            <w:tcMar>
+              <w:top w:w="80" w:type="dxa"/>
+              <w:bottom w:w="80" w:type="dxa"/>
+              <w:left w:w="100" w:type="dxa"/>
+              <w:right w:w="100" w:type="dxa"/>
+            </w:tcMar>
+          </w:tcPr>
+          <w:p>
+            <w:r>
+              <w:rPr>
+                <w:rFonts w:ascii="Arial" w:hAnsi="Arial"/>
+                <w:sz w:val="15"/>
+              </w:rPr>
+              <w:t>5-day revisit pass</w:t>
+            </w:r>
+          </w:p>
+        </w:tc>
+        <w:tc>
+          <w:tcPr>
+            <w:tcW w:type="dxa" w:w="2016"/>
+            <w:tcMar>
+              <w:top w:w="80" w:type="dxa"/>
+              <w:bottom w:w="80" w:type="dxa"/>
+              <w:left w:w="100" w:type="dxa"/>
+              <w:right w:w="100" w:type="dxa"/>
+            </w:tcMar>
+          </w:tcPr>
+          <w:p>
+            <w:r>
+              <w:rPr>
+                <w:rFonts w:ascii="Arial" w:hAnsi="Arial"/>
+                <w:sz w:val="15"/>
+              </w:rPr>
+              <w:t>Glacial lake outburst flood (GLOF) moraine lake expansion</w:t>
+            </w:r>
+          </w:p>
+        </w:tc>
+      </w:tr>
+      <w:tr>
+        <w:tc>
+          <w:tcPr>
+            <w:tcW w:type="dxa" w:w="2016"/>
+            <w:tcMar>
+              <w:top w:w="80" w:type="dxa"/>
+              <w:bottom w:w="80" w:type="dxa"/>
+              <w:left w:w="100" w:type="dxa"/>
+              <w:right w:w="100" w:type="dxa"/>
+            </w:tcMar>
+            <w:shd w:fill="F8FAFC"/>
+          </w:tcPr>
+          <w:p>
+            <w:r>
+              <w:rPr>
+                <w:rFonts w:ascii="Arial" w:hAnsi="Arial"/>
+                <w:sz w:val="15"/>
+              </w:rPr>
+              <w:t>OpenStreetMap Overpass API</w:t>
+            </w:r>
+          </w:p>
+        </w:tc>
+        <w:tc>
+          <w:tcPr>
+            <w:tcW w:type="dxa" w:w="2016"/>
+            <w:tcMar>
+              <w:top w:w="80" w:type="dxa"/>
+              <w:bottom w:w="80" w:type="dxa"/>
+              <w:left w:w="100" w:type="dxa"/>
+              <w:right w:w="100" w:type="dxa"/>
+            </w:tcMar>
+            <w:shd w:fill="F8FAFC"/>
+          </w:tcPr>
+          <w:p>
+            <w:r>
+              <w:rPr>
+                <w:rFonts w:ascii="Arial" w:hAnsi="Arial"/>
+                <w:sz w:val="15"/>
+              </w:rPr>
+              <w:t>Vector road network (NH-58, NH-107, NH-108), bridges, culverts, hospital locations</w:t>
+            </w:r>
+          </w:p>
+        </w:tc>
+        <w:tc>
+          <w:tcPr>
+            <w:tcW w:type="dxa" w:w="2016"/>
+            <w:tcMar>
+              <w:top w:w="80" w:type="dxa"/>
+              <w:bottom w:w="80" w:type="dxa"/>
+              <w:left w:w="100" w:type="dxa"/>
+              <w:right w:w="100" w:type="dxa"/>
+            </w:tcMar>
+            <w:shd w:fill="F8FAFC"/>
+          </w:tcPr>
+          <w:p>
+            <w:r>
+              <w:rPr>
+                <w:rFonts w:ascii="Arial" w:hAnsi="Arial"/>
+                <w:sz w:val="15"/>
+              </w:rPr>
+              <w:t>Exact vector geometry</w:t>
+            </w:r>
+          </w:p>
+        </w:tc>
+        <w:tc>
+          <w:tcPr>
+            <w:tcW w:type="dxa" w:w="2016"/>
+            <w:tcMar>
+              <w:top w:w="80" w:type="dxa"/>
+              <w:bottom w:w="80" w:type="dxa"/>
+              <w:left w:w="100" w:type="dxa"/>
+              <w:right w:w="100" w:type="dxa"/>
+            </w:tcMar>
+            <w:shd w:fill="F8FAFC"/>
+          </w:tcPr>
+          <w:p>
+            <w:r>
+              <w:rPr>
+                <w:rFonts w:ascii="Arial" w:hAnsi="Arial"/>
+                <w:sz w:val="15"/>
+              </w:rPr>
+              <w:t>Continuous community edits</w:t>
+            </w:r>
+          </w:p>
+        </w:tc>
+        <w:tc>
+          <w:tcPr>
+            <w:tcW w:type="dxa" w:w="2016"/>
+            <w:tcMar>
+              <w:top w:w="80" w:type="dxa"/>
+              <w:bottom w:w="80" w:type="dxa"/>
+              <w:left w:w="100" w:type="dxa"/>
+              <w:right w:w="100" w:type="dxa"/>
+            </w:tcMar>
+            <w:shd w:fill="F8FAFC"/>
+          </w:tcPr>
+          <w:p>
+            <w:r>
+              <w:rPr>
+                <w:rFonts w:ascii="Arial" w:hAnsi="Arial"/>
+                <w:sz w:val="15"/>
+              </w:rPr>
+              <w:t>Dynamic Dijkstra evacuation routing avoiding flooded roads</w:t>
+            </w:r>
+          </w:p>
+        </w:tc>
+      </w:tr>
+      <w:tr>
+        <w:tc>
+          <w:tcPr>
+            <w:tcW w:type="dxa" w:w="2016"/>
+            <w:tcMar>
+              <w:top w:w="80" w:type="dxa"/>
+              <w:bottom w:w="80" w:type="dxa"/>
+              <w:left w:w="100" w:type="dxa"/>
+              <w:right w:w="100" w:type="dxa"/>
+            </w:tcMar>
+          </w:tcPr>
+          <w:p>
+            <w:r>
+              <w:rPr>
+                <w:rFonts w:ascii="Arial" w:hAnsi="Arial"/>
+                <w:sz w:val="15"/>
+              </w:rPr>
+              <w:t>ISRO Bhuvan &amp; GSI Landslide Feed</w:t>
+            </w:r>
+          </w:p>
+        </w:tc>
+        <w:tc>
+          <w:tcPr>
+            <w:tcW w:type="dxa" w:w="2016"/>
+            <w:tcMar>
+              <w:top w:w="80" w:type="dxa"/>
+              <w:bottom w:w="80" w:type="dxa"/>
+              <w:left w:w="100" w:type="dxa"/>
+              <w:right w:w="100" w:type="dxa"/>
+            </w:tcMar>
+          </w:tcPr>
+          <w:p>
+            <w:r>
+              <w:rPr>
+                <w:rFonts w:ascii="Arial" w:hAnsi="Arial"/>
+                <w:sz w:val="15"/>
+              </w:rPr>
+              <w:t>Cartosat 10m/30m DEM elevation, slope angle, aspect, Landslide Susceptibility Index</w:t>
+            </w:r>
+          </w:p>
+        </w:tc>
+        <w:tc>
+          <w:tcPr>
+            <w:tcW w:type="dxa" w:w="2016"/>
+            <w:tcMar>
+              <w:top w:w="80" w:type="dxa"/>
+              <w:bottom w:w="80" w:type="dxa"/>
+              <w:left w:w="100" w:type="dxa"/>
+              <w:right w:w="100" w:type="dxa"/>
+            </w:tcMar>
+          </w:tcPr>
+          <w:p>
+            <w:r>
+              <w:rPr>
+                <w:rFonts w:ascii="Arial" w:hAnsi="Arial"/>
+                <w:sz w:val="15"/>
+              </w:rPr>
+              <w:t>10m / 30m raster</w:t>
+            </w:r>
+          </w:p>
+        </w:tc>
+        <w:tc>
+          <w:tcPr>
+            <w:tcW w:type="dxa" w:w="2016"/>
+            <w:tcMar>
+              <w:top w:w="80" w:type="dxa"/>
+              <w:bottom w:w="80" w:type="dxa"/>
+              <w:left w:w="100" w:type="dxa"/>
+              <w:right w:w="100" w:type="dxa"/>
+            </w:tcMar>
+          </w:tcPr>
+          <w:p>
+            <w:r>
+              <w:rPr>
+                <w:rFonts w:ascii="Arial" w:hAnsi="Arial"/>
+                <w:sz w:val="15"/>
+              </w:rPr>
+              <w:t>Static baseline + seasonal</w:t>
+            </w:r>
+          </w:p>
+        </w:tc>
+        <w:tc>
+          <w:tcPr>
+            <w:tcW w:type="dxa" w:w="2016"/>
+            <w:tcMar>
+              <w:top w:w="80" w:type="dxa"/>
+              <w:bottom w:w="80" w:type="dxa"/>
+              <w:left w:w="100" w:type="dxa"/>
+              <w:right w:w="100" w:type="dxa"/>
+            </w:tcMar>
+          </w:tcPr>
+          <w:p>
+            <w:r>
+              <w:rPr>
+                <w:rFonts w:ascii="Arial" w:hAnsi="Arial"/>
+                <w:sz w:val="15"/>
+              </w:rPr>
+              <w:t>Slope stability modeling, XGBoost Landslide ML with SHAP XAI</w:t>
+            </w:r>
+          </w:p>
+        </w:tc>
+      </w:tr>
+      <w:tr>
+        <w:tc>
+          <w:tcPr>
+            <w:tcW w:type="dxa" w:w="2016"/>
+            <w:tcMar>
+              <w:top w:w="80" w:type="dxa"/>
+              <w:bottom w:w="80" w:type="dxa"/>
+              <w:left w:w="100" w:type="dxa"/>
+              <w:right w:w="100" w:type="dxa"/>
+            </w:tcMar>
+            <w:shd w:fill="F8FAFC"/>
+          </w:tcPr>
+          <w:p>
+            <w:r>
+              <w:rPr>
+                <w:rFonts w:ascii="Arial" w:hAnsi="Arial"/>
+                <w:sz w:val="15"/>
+              </w:rPr>
+              <w:t>DGRE / SASE Avalanche Feeds</w:t>
+            </w:r>
+          </w:p>
+        </w:tc>
+        <w:tc>
+          <w:tcPr>
+            <w:tcW w:type="dxa" w:w="2016"/>
+            <w:tcMar>
+              <w:top w:w="80" w:type="dxa"/>
+              <w:bottom w:w="80" w:type="dxa"/>
+              <w:left w:w="100" w:type="dxa"/>
+              <w:right w:w="100" w:type="dxa"/>
+            </w:tcMar>
+            <w:shd w:fill="F8FAFC"/>
+          </w:tcPr>
+          <w:p>
+            <w:r>
+              <w:rPr>
+                <w:rFonts w:ascii="Arial" w:hAnsi="Arial"/>
+                <w:sz w:val="15"/>
+              </w:rPr>
+              <w:t>Snowpack depth (cm), avalanche hazard stage (1 to 5), snow water equivalent</w:t>
+            </w:r>
+          </w:p>
+        </w:tc>
+        <w:tc>
+          <w:tcPr>
+            <w:tcW w:type="dxa" w:w="2016"/>
+            <w:tcMar>
+              <w:top w:w="80" w:type="dxa"/>
+              <w:bottom w:w="80" w:type="dxa"/>
+              <w:left w:w="100" w:type="dxa"/>
+              <w:right w:w="100" w:type="dxa"/>
+            </w:tcMar>
+            <w:shd w:fill="F8FAFC"/>
+          </w:tcPr>
+          <w:p>
+            <w:r>
+              <w:rPr>
+                <w:rFonts w:ascii="Arial" w:hAnsi="Arial"/>
+                <w:sz w:val="15"/>
+              </w:rPr>
+              <w:t>Mountain valley sectors</w:t>
+            </w:r>
+          </w:p>
+        </w:tc>
+        <w:tc>
+          <w:tcPr>
+            <w:tcW w:type="dxa" w:w="2016"/>
+            <w:tcMar>
+              <w:top w:w="80" w:type="dxa"/>
+              <w:bottom w:w="80" w:type="dxa"/>
+              <w:left w:w="100" w:type="dxa"/>
+              <w:right w:w="100" w:type="dxa"/>
+            </w:tcMar>
+            <w:shd w:fill="F8FAFC"/>
+          </w:tcPr>
+          <w:p>
+            <w:r>
+              <w:rPr>
+                <w:rFonts w:ascii="Arial" w:hAnsi="Arial"/>
+                <w:sz w:val="15"/>
+              </w:rPr>
+              <w:t>Daily operational bulletins</w:t>
+            </w:r>
+          </w:p>
+        </w:tc>
+        <w:tc>
+          <w:tcPr>
+            <w:tcW w:type="dxa" w:w="2016"/>
+            <w:tcMar>
+              <w:top w:w="80" w:type="dxa"/>
+              <w:bottom w:w="80" w:type="dxa"/>
+              <w:left w:w="100" w:type="dxa"/>
+              <w:right w:w="100" w:type="dxa"/>
+            </w:tcMar>
+            <w:shd w:fill="F8FAFC"/>
+          </w:tcPr>
+          <w:p>
+            <w:r>
+              <w:rPr>
+                <w:rFonts w:ascii="Arial" w:hAnsi="Arial"/>
+                <w:sz w:val="15"/>
+              </w:rPr>
+              <w:t>Snow avalanche warnings &amp; rain-on-snow surge amplification</w:t>
+            </w:r>
+          </w:p>
+        </w:tc>
+      </w:tr>
+      <w:tr>
+        <w:tc>
+          <w:tcPr>
+            <w:tcW w:type="dxa" w:w="2016"/>
+            <w:tcMar>
+              <w:top w:w="80" w:type="dxa"/>
+              <w:bottom w:w="80" w:type="dxa"/>
+              <w:left w:w="100" w:type="dxa"/>
+              <w:right w:w="100" w:type="dxa"/>
+            </w:tcMar>
+          </w:tcPr>
+          <w:p>
+            <w:r>
+              <w:rPr>
+                <w:rFonts w:ascii="Arial" w:hAnsi="Arial"/>
+                <w:sz w:val="15"/>
+              </w:rPr>
+              <w:t>FSI Van Agni Forest Fire Tracker</w:t>
+            </w:r>
+          </w:p>
+        </w:tc>
+        <w:tc>
+          <w:tcPr>
+            <w:tcW w:type="dxa" w:w="2016"/>
+            <w:tcMar>
+              <w:top w:w="80" w:type="dxa"/>
+              <w:bottom w:w="80" w:type="dxa"/>
+              <w:left w:w="100" w:type="dxa"/>
+              <w:right w:w="100" w:type="dxa"/>
+            </w:tcMar>
+          </w:tcPr>
+          <w:p>
+            <w:r>
+              <w:rPr>
+                <w:rFonts w:ascii="Arial" w:hAnsi="Arial"/>
+                <w:sz w:val="15"/>
+              </w:rPr>
+              <w:t>Active fire MODIS/VIIRS coordinates, burn severity, soil hydrophobicity</w:t>
+            </w:r>
+          </w:p>
+        </w:tc>
+        <w:tc>
+          <w:tcPr>
+            <w:tcW w:type="dxa" w:w="2016"/>
+            <w:tcMar>
+              <w:top w:w="80" w:type="dxa"/>
+              <w:bottom w:w="80" w:type="dxa"/>
+              <w:left w:w="100" w:type="dxa"/>
+              <w:right w:w="100" w:type="dxa"/>
+            </w:tcMar>
+          </w:tcPr>
+          <w:p>
+            <w:r>
+              <w:rPr>
+                <w:rFonts w:ascii="Arial" w:hAnsi="Arial"/>
+                <w:sz w:val="15"/>
+              </w:rPr>
+              <w:t>375m / 1km points</w:t>
+            </w:r>
+          </w:p>
+        </w:tc>
+        <w:tc>
+          <w:tcPr>
+            <w:tcW w:type="dxa" w:w="2016"/>
+            <w:tcMar>
+              <w:top w:w="80" w:type="dxa"/>
+              <w:bottom w:w="80" w:type="dxa"/>
+              <w:left w:w="100" w:type="dxa"/>
+              <w:right w:w="100" w:type="dxa"/>
+            </w:tcMar>
+          </w:tcPr>
+          <w:p>
+            <w:r>
+              <w:rPr>
+                <w:rFonts w:ascii="Arial" w:hAnsi="Arial"/>
+                <w:sz w:val="15"/>
+              </w:rPr>
+              <w:t>Twice-daily satellite pass</w:t>
+            </w:r>
+          </w:p>
+        </w:tc>
+        <w:tc>
+          <w:tcPr>
+            <w:tcW w:type="dxa" w:w="2016"/>
+            <w:tcMar>
+              <w:top w:w="80" w:type="dxa"/>
+              <w:bottom w:w="80" w:type="dxa"/>
+              <w:left w:w="100" w:type="dxa"/>
+              <w:right w:w="100" w:type="dxa"/>
+            </w:tcMar>
+          </w:tcPr>
+          <w:p>
+            <w:r>
+              <w:rPr>
+                <w:rFonts w:ascii="Arial" w:hAnsi="Arial"/>
+                <w:sz w:val="15"/>
+              </w:rPr>
+              <w:t>Post-wildfire debris flow risk scaling (hydrophobic topsoil)</w:t>
+            </w:r>
+          </w:p>
+        </w:tc>
+      </w:tr>
+      <w:tr>
+        <w:tc>
+          <w:tcPr>
+            <w:tcW w:type="dxa" w:w="2016"/>
+            <w:tcMar>
+              <w:top w:w="80" w:type="dxa"/>
+              <w:bottom w:w="80" w:type="dxa"/>
+              <w:left w:w="100" w:type="dxa"/>
+              <w:right w:w="100" w:type="dxa"/>
+            </w:tcMar>
+            <w:shd w:fill="F8FAFC"/>
+          </w:tcPr>
+          <w:p>
+            <w:r>
+              <w:rPr>
+                <w:rFonts w:ascii="Arial" w:hAnsi="Arial"/>
+                <w:sz w:val="15"/>
+              </w:rPr>
+              <w:t>USDMA Dynamic Population Engine</w:t>
+            </w:r>
+          </w:p>
+        </w:tc>
+        <w:tc>
+          <w:tcPr>
+            <w:tcW w:type="dxa" w:w="2016"/>
+            <w:tcMar>
+              <w:top w:w="80" w:type="dxa"/>
+              <w:bottom w:w="80" w:type="dxa"/>
+              <w:left w:w="100" w:type="dxa"/>
+              <w:right w:w="100" w:type="dxa"/>
+            </w:tcMar>
+            <w:shd w:fill="F8FAFC"/>
+          </w:tcPr>
+          <w:p>
+            <w:r>
+              <w:rPr>
+                <w:rFonts w:ascii="Arial" w:hAnsi="Arial"/>
+                <w:sz w:val="15"/>
+              </w:rPr>
+              <w:t>Real-time Char Dham pilgrim counts, vehicle volume, mobile tower density</w:t>
+            </w:r>
+          </w:p>
+        </w:tc>
+        <w:tc>
+          <w:tcPr>
+            <w:tcW w:type="dxa" w:w="2016"/>
+            <w:tcMar>
+              <w:top w:w="80" w:type="dxa"/>
+              <w:bottom w:w="80" w:type="dxa"/>
+              <w:left w:w="100" w:type="dxa"/>
+              <w:right w:w="100" w:type="dxa"/>
+            </w:tcMar>
+            <w:shd w:fill="F8FAFC"/>
+          </w:tcPr>
+          <w:p>
+            <w:r>
+              <w:rPr>
+                <w:rFonts w:ascii="Arial" w:hAnsi="Arial"/>
+                <w:sz w:val="15"/>
+              </w:rPr>
+              <w:t>Corridor / shrine level</w:t>
+            </w:r>
+          </w:p>
+        </w:tc>
+        <w:tc>
+          <w:tcPr>
+            <w:tcW w:type="dxa" w:w="2016"/>
+            <w:tcMar>
+              <w:top w:w="80" w:type="dxa"/>
+              <w:bottom w:w="80" w:type="dxa"/>
+              <w:left w:w="100" w:type="dxa"/>
+              <w:right w:w="100" w:type="dxa"/>
+            </w:tcMar>
+            <w:shd w:fill="F8FAFC"/>
+          </w:tcPr>
+          <w:p>
+            <w:r>
+              <w:rPr>
+                <w:rFonts w:ascii="Arial" w:hAnsi="Arial"/>
+                <w:sz w:val="15"/>
+              </w:rPr>
+              <w:t>Hourly updates</w:t>
+            </w:r>
+          </w:p>
+        </w:tc>
+        <w:tc>
+          <w:tcPr>
+            <w:tcW w:type="dxa" w:w="2016"/>
+            <w:tcMar>
+              <w:top w:w="80" w:type="dxa"/>
+              <w:bottom w:w="80" w:type="dxa"/>
+              <w:left w:w="100" w:type="dxa"/>
+              <w:right w:w="100" w:type="dxa"/>
+            </w:tcMar>
+            <w:shd w:fill="F8FAFC"/>
+          </w:tcPr>
+          <w:p>
+            <w:r>
+              <w:rPr>
+                <w:rFonts w:ascii="Arial" w:hAnsi="Arial"/>
+                <w:sz w:val="15"/>
+              </w:rPr>
+              <w:t>Dynamic human exposure scaling for evacuation priority</w:t>
+            </w:r>
+          </w:p>
+        </w:tc>
+      </w:tr>
+      <w:tr>
+        <w:tc>
+          <w:tcPr>
+            <w:tcW w:type="dxa" w:w="2016"/>
+            <w:tcMar>
+              <w:top w:w="80" w:type="dxa"/>
+              <w:bottom w:w="80" w:type="dxa"/>
+              <w:left w:w="100" w:type="dxa"/>
+              <w:right w:w="100" w:type="dxa"/>
+            </w:tcMar>
+          </w:tcPr>
+          <w:p>
+            <w:r>
+              <w:rPr>
+                <w:rFonts w:ascii="Arial" w:hAnsi="Arial"/>
+                <w:sz w:val="15"/>
+              </w:rPr>
+              <w:t>USDMA Shelter &amp; Logistics Registry</w:t>
+            </w:r>
+          </w:p>
+        </w:tc>
+        <w:tc>
+          <w:tcPr>
+            <w:tcW w:type="dxa" w:w="2016"/>
+            <w:tcMar>
+              <w:top w:w="80" w:type="dxa"/>
+              <w:bottom w:w="80" w:type="dxa"/>
+              <w:left w:w="100" w:type="dxa"/>
+              <w:right w:w="100" w:type="dxa"/>
+            </w:tcMar>
+          </w:tcPr>
+          <w:p>
+            <w:r>
+              <w:rPr>
+                <w:rFonts w:ascii="Arial" w:hAnsi="Arial"/>
+                <w:sz w:val="15"/>
+              </w:rPr>
+              <w:t>28 designated safe shelters, capacities, live sensor occupancies, nodal phone numbers</w:t>
+            </w:r>
+          </w:p>
+        </w:tc>
+        <w:tc>
+          <w:tcPr>
+            <w:tcW w:type="dxa" w:w="2016"/>
+            <w:tcMar>
+              <w:top w:w="80" w:type="dxa"/>
+              <w:bottom w:w="80" w:type="dxa"/>
+              <w:left w:w="100" w:type="dxa"/>
+              <w:right w:w="100" w:type="dxa"/>
+            </w:tcMar>
+          </w:tcPr>
+          <w:p>
+            <w:r>
+              <w:rPr>
+                <w:rFonts w:ascii="Arial" w:hAnsi="Arial"/>
+                <w:sz w:val="15"/>
+              </w:rPr>
+              <w:t>Georeferenced shelter nodes</w:t>
+            </w:r>
+          </w:p>
+        </w:tc>
+        <w:tc>
+          <w:tcPr>
+            <w:tcW w:type="dxa" w:w="2016"/>
+            <w:tcMar>
+              <w:top w:w="80" w:type="dxa"/>
+              <w:bottom w:w="80" w:type="dxa"/>
+              <w:left w:w="100" w:type="dxa"/>
+              <w:right w:w="100" w:type="dxa"/>
+            </w:tcMar>
+          </w:tcPr>
+          <w:p>
+            <w:r>
+              <w:rPr>
+                <w:rFonts w:ascii="Arial" w:hAnsi="Arial"/>
+                <w:sz w:val="15"/>
+              </w:rPr>
+              <w:t>Real-time IoT + updates</w:t>
+            </w:r>
+          </w:p>
+        </w:tc>
+        <w:tc>
+          <w:tcPr>
+            <w:tcW w:type="dxa" w:w="2016"/>
+            <w:tcMar>
+              <w:top w:w="80" w:type="dxa"/>
+              <w:bottom w:w="80" w:type="dxa"/>
+              <w:left w:w="100" w:type="dxa"/>
+              <w:right w:w="100" w:type="dxa"/>
+            </w:tcMar>
+          </w:tcPr>
+          <w:p>
+            <w:r>
+              <w:rPr>
+                <w:rFonts w:ascii="Arial" w:hAnsi="Arial"/>
+                <w:sz w:val="15"/>
+              </w:rPr>
+              <w:t>Dijkstra safe haven destination assignment</w:t>
             </w:r>
           </w:p>
         </w:tc>
@@ -837,9 +2404,110 @@
       </w:pPr>
       <w:r>
         <w:rPr>
-          <w:color w:val="0A2540"/>
+          <w:color w:val="0A2558"/>
         </w:rPr>
-        <w:t>2. What Data Are We Curating &amp; From Where?</w:t>
+        <w:t>3. The 5-Stage Data Quality &amp; Provenance Verification Engine</w:t>
+      </w:r>
+    </w:p>
+    <w:p>
+      <w:r>
+        <w:rPr>
+          <w:b/>
+          <w:color w:val="B91C1C"/>
+          <w:sz w:val="19"/>
+        </w:rPr>
+        <w:t xml:space="preserve">• Rule 1: Physical Range Validation: </w:t>
+      </w:r>
+      <w:r>
+        <w:rPr>
+          <w:sz w:val="19"/>
+        </w:rPr>
+        <w:t>Strict hydrological and meteorological boundaries: Water Stage 0.0m ≤ H ≤ 120.0m; Rain Rate 0.0mm/hr ≤ P ≤ 300.0mm/hr; Soil Saturation 0.0 ≤ Sm ≤ 1.0. Out-of-bounds readings are rejected.</w:t>
+      </w:r>
+    </w:p>
+    <w:p>
+      <w:r>
+        <w:rPr>
+          <w:b/>
+          <w:color w:val="B91C1C"/>
+          <w:sz w:val="19"/>
+        </w:rPr>
+        <w:t xml:space="preserve">• Rule 2: Temporal Freshness Filter: </w:t>
+      </w:r>
+      <w:r>
+        <w:rPr>
+          <w:sz w:val="19"/>
+        </w:rPr>
+        <w:t>Observations older than 6.0 hours are flagged as STALE. The dashboard and risk engine explicitly display staleness warnings and degrade confidence rather than disguising age.</w:t>
+      </w:r>
+    </w:p>
+    <w:p>
+      <w:r>
+        <w:rPr>
+          <w:b/>
+          <w:color w:val="B91C1C"/>
+          <w:sz w:val="19"/>
+        </w:rPr>
+        <w:t xml:space="preserve">• Rule 3: Uttarakhand WGS84 Geographic Enclosure: </w:t>
+      </w:r>
+      <w:r>
+        <w:rPr>
+          <w:sz w:val="19"/>
+        </w:rPr>
+        <w:t>All coordinates must strictly resolve inside the Uttarakhand operational bounding box [77.57°E to 81.04°E longitude, 28.72°N to 31.46°N latitude].</w:t>
+      </w:r>
+    </w:p>
+    <w:p>
+      <w:r>
+        <w:rPr>
+          <w:b/>
+          <w:color w:val="B91C1C"/>
+          <w:sz w:val="19"/>
+        </w:rPr>
+        <w:t xml:space="preserve">• Rule 4: Cryptographic Consensus Hashing: </w:t>
+      </w:r>
+      <w:r>
+        <w:rPr>
+          <w:sz w:val="19"/>
+        </w:rPr>
+        <w:t>Each ingested batch creates a SHA-256 cryptographic digest creating an immutable, tamper-evident block audit trail for post-incident review.</w:t>
+      </w:r>
+    </w:p>
+    <w:p>
+      <w:r>
+        <w:rPr>
+          <w:b/>
+          <w:color w:val="B91C1C"/>
+          <w:sz w:val="19"/>
+        </w:rPr>
+        <w:t xml:space="preserve">• Rule 5: Fail-Closed Zero-Fabrication Protocol: </w:t>
+      </w:r>
+      <w:r>
+        <w:rPr>
+          <w:sz w:val="19"/>
+        </w:rPr>
+        <w:t>If an external API is unconfigured or returns HTTP errors, the system records DATA UNAVAILABLE. It never invents fallback data.</w:t>
+      </w:r>
+    </w:p>
+    <w:p/>
+    <w:p>
+      <w:pPr>
+        <w:pStyle w:val="Heading1"/>
+      </w:pPr>
+      <w:r>
+        <w:rPr>
+          <w:color w:val="0A2558"/>
+        </w:rPr>
+        <w:t>4. Autonomous Authority Escalation &amp; Automated Voice Calling</w:t>
+      </w:r>
+    </w:p>
+    <w:p>
+      <w:r>
+        <w:rPr>
+          <w:rFonts w:ascii="Arial" w:hAnsi="Arial"/>
+          <w:sz w:val="20"/>
+        </w:rPr>
+        <w:t>To ensure zero delay during nocturnal or sudden disasters, the AuthorityCallDispatcher (backend/services/authority_call_dispatcher.py) initiates automated priority phone calls directly to designated state and district emergency commanders upon detecting Critical / Red Alert thresholds.</w:t>
       </w:r>
     </w:p>
     <w:tbl>
@@ -849,19 +2517,20 @@
         <w:tblLook w:firstColumn="1" w:firstRow="1" w:lastColumn="0" w:lastRow="0" w:noHBand="0" w:noVBand="1" w:val="04A0"/>
       </w:tblPr>
       <w:tblGrid>
-        <w:gridCol w:w="2484"/>
-        <w:gridCol w:w="2484"/>
-        <w:gridCol w:w="2484"/>
-        <w:gridCol w:w="2484"/>
+        <w:gridCol w:w="2016"/>
+        <w:gridCol w:w="2016"/>
+        <w:gridCol w:w="2016"/>
+        <w:gridCol w:w="2016"/>
+        <w:gridCol w:w="2016"/>
       </w:tblGrid>
       <w:tr>
         <w:tc>
           <w:tcPr>
-            <w:tcW w:type="dxa" w:w="2484"/>
+            <w:tcW w:type="dxa" w:w="2016"/>
             <w:shd w:fill="B91C1C"/>
             <w:tcMar>
-              <w:top w:w="100" w:type="dxa"/>
-              <w:bottom w:w="100" w:type="dxa"/>
+              <w:top w:w="120" w:type="dxa"/>
+              <w:bottom w:w="120" w:type="dxa"/>
               <w:left w:w="120" w:type="dxa"/>
               <w:right w:w="120" w:type="dxa"/>
             </w:tcMar>
@@ -869,21 +2538,22 @@
           <w:p>
             <w:r>
               <w:rPr>
+                <w:rFonts w:ascii="Arial" w:hAnsi="Arial"/>
                 <w:b/>
                 <w:color w:val="FFFFFF"/>
                 <w:sz w:val="17"/>
               </w:rPr>
-              <w:t>Source Provider</w:t>
+              <w:t>Officer Name &amp; Designation</w:t>
             </w:r>
           </w:p>
         </w:tc>
         <w:tc>
           <w:tcPr>
-            <w:tcW w:type="dxa" w:w="2484"/>
+            <w:tcW w:type="dxa" w:w="2016"/>
             <w:shd w:fill="B91C1C"/>
             <w:tcMar>
-              <w:top w:w="100" w:type="dxa"/>
-              <w:bottom w:w="100" w:type="dxa"/>
+              <w:top w:w="120" w:type="dxa"/>
+              <w:bottom w:w="120" w:type="dxa"/>
               <w:left w:w="120" w:type="dxa"/>
               <w:right w:w="120" w:type="dxa"/>
             </w:tcMar>
@@ -891,21 +2561,22 @@
           <w:p>
             <w:r>
               <w:rPr>
+                <w:rFonts w:ascii="Arial" w:hAnsi="Arial"/>
                 <w:b/>
                 <w:color w:val="FFFFFF"/>
                 <w:sz w:val="17"/>
               </w:rPr>
-              <w:t>Curated Data Parameters</w:t>
+              <w:t>Agency</w:t>
             </w:r>
           </w:p>
         </w:tc>
         <w:tc>
           <w:tcPr>
-            <w:tcW w:type="dxa" w:w="2484"/>
+            <w:tcW w:type="dxa" w:w="2016"/>
             <w:shd w:fill="B91C1C"/>
             <w:tcMar>
-              <w:top w:w="100" w:type="dxa"/>
-              <w:bottom w:w="100" w:type="dxa"/>
+              <w:top w:w="120" w:type="dxa"/>
+              <w:bottom w:w="120" w:type="dxa"/>
               <w:left w:w="120" w:type="dxa"/>
               <w:right w:w="120" w:type="dxa"/>
             </w:tcMar>
@@ -913,21 +2584,22 @@
           <w:p>
             <w:r>
               <w:rPr>
+                <w:rFonts w:ascii="Arial" w:hAnsi="Arial"/>
                 <w:b/>
                 <w:color w:val="FFFFFF"/>
                 <w:sz w:val="17"/>
               </w:rPr>
-              <w:t>Query Cadence</w:t>
+              <w:t>District</w:t>
             </w:r>
           </w:p>
         </w:tc>
         <w:tc>
           <w:tcPr>
-            <w:tcW w:type="dxa" w:w="2484"/>
+            <w:tcW w:type="dxa" w:w="2016"/>
             <w:shd w:fill="B91C1C"/>
             <w:tcMar>
-              <w:top w:w="100" w:type="dxa"/>
-              <w:bottom w:w="100" w:type="dxa"/>
+              <w:top w:w="120" w:type="dxa"/>
+              <w:bottom w:w="120" w:type="dxa"/>
               <w:left w:w="120" w:type="dxa"/>
               <w:right w:w="120" w:type="dxa"/>
             </w:tcMar>
@@ -935,11 +2607,35 @@
           <w:p>
             <w:r>
               <w:rPr>
+                <w:rFonts w:ascii="Arial" w:hAnsi="Arial"/>
                 <w:b/>
                 <w:color w:val="FFFFFF"/>
                 <w:sz w:val="17"/>
               </w:rPr>
-              <w:t>Core Function in Platform</w:t>
+              <w:t>Phone (Mobile / Landline)</w:t>
+            </w:r>
+          </w:p>
+        </w:tc>
+        <w:tc>
+          <w:tcPr>
+            <w:tcW w:type="dxa" w:w="2016"/>
+            <w:shd w:fill="B91C1C"/>
+            <w:tcMar>
+              <w:top w:w="120" w:type="dxa"/>
+              <w:bottom w:w="120" w:type="dxa"/>
+              <w:left w:w="120" w:type="dxa"/>
+              <w:right w:w="120" w:type="dxa"/>
+            </w:tcMar>
+          </w:tcPr>
+          <w:p>
+            <w:r>
+              <w:rPr>
+                <w:rFonts w:ascii="Arial" w:hAnsi="Arial"/>
+                <w:b/>
+                <w:color w:val="FFFFFF"/>
+                <w:sz w:val="17"/>
+              </w:rPr>
+              <w:t>Escalation Priority &amp; Radio</w:t>
             </w:r>
           </w:p>
         </w:tc>
@@ -947,10 +2643,10 @@
       <w:tr>
         <w:tc>
           <w:tcPr>
-            <w:tcW w:type="dxa" w:w="2484"/>
+            <w:tcW w:type="dxa" w:w="2016"/>
             <w:tcMar>
-              <w:top w:w="70" w:type="dxa"/>
-              <w:bottom w:w="70" w:type="dxa"/>
+              <w:top w:w="80" w:type="dxa"/>
+              <w:bottom w:w="80" w:type="dxa"/>
               <w:left w:w="100" w:type="dxa"/>
               <w:right w:w="100" w:type="dxa"/>
             </w:tcMar>
@@ -958,18 +2654,21 @@
           <w:p>
             <w:r>
               <w:rPr>
+                <w:rFonts w:ascii="Arial" w:hAnsi="Arial"/>
                 <w:sz w:val="16"/>
               </w:rPr>
-              <w:t>Open-Meteo Weather API</w:t>
+              <w:t>State Duty Officer</w:t>
+              <w:br/>
+              <w:t>Joint CEO, State Emergency Operations Centre (SEOC)</w:t>
             </w:r>
           </w:p>
         </w:tc>
         <w:tc>
           <w:tcPr>
-            <w:tcW w:type="dxa" w:w="2484"/>
+            <w:tcW w:type="dxa" w:w="2016"/>
             <w:tcMar>
-              <w:top w:w="70" w:type="dxa"/>
-              <w:bottom w:w="70" w:type="dxa"/>
+              <w:top w:w="80" w:type="dxa"/>
+              <w:bottom w:w="80" w:type="dxa"/>
               <w:left w:w="100" w:type="dxa"/>
               <w:right w:w="100" w:type="dxa"/>
             </w:tcMar>
@@ -977,18 +2676,19 @@
           <w:p>
             <w:r>
               <w:rPr>
+                <w:rFonts w:ascii="Arial" w:hAnsi="Arial"/>
                 <w:sz w:val="16"/>
               </w:rPr>
-              <w:t>Hourly rainfall, precipitation rate, surface pressure, 0°C freezing level</w:t>
+              <w:t>SEOC</w:t>
             </w:r>
           </w:p>
         </w:tc>
         <w:tc>
           <w:tcPr>
-            <w:tcW w:type="dxa" w:w="2484"/>
+            <w:tcW w:type="dxa" w:w="2016"/>
             <w:tcMar>
-              <w:top w:w="70" w:type="dxa"/>
-              <w:bottom w:w="70" w:type="dxa"/>
+              <w:top w:w="80" w:type="dxa"/>
+              <w:bottom w:w="80" w:type="dxa"/>
               <w:left w:w="100" w:type="dxa"/>
               <w:right w:w="100" w:type="dxa"/>
             </w:tcMar>
@@ -996,18 +2696,19 @@
           <w:p>
             <w:r>
               <w:rPr>
+                <w:rFonts w:ascii="Arial" w:hAnsi="Arial"/>
                 <w:sz w:val="16"/>
               </w:rPr>
-              <w:t>Live / Real-Time</w:t>
+              <w:t>Statewide</w:t>
             </w:r>
           </w:p>
         </w:tc>
         <w:tc>
           <w:tcPr>
-            <w:tcW w:type="dxa" w:w="2484"/>
+            <w:tcW w:type="dxa" w:w="2016"/>
             <w:tcMar>
-              <w:top w:w="70" w:type="dxa"/>
-              <w:bottom w:w="70" w:type="dxa"/>
+              <w:top w:w="80" w:type="dxa"/>
+              <w:bottom w:w="80" w:type="dxa"/>
               <w:left w:w="100" w:type="dxa"/>
               <w:right w:w="100" w:type="dxa"/>
             </w:tcMar>
@@ -1015,9 +2716,34 @@
           <w:p>
             <w:r>
               <w:rPr>
+                <w:rFonts w:ascii="Arial" w:hAnsi="Arial"/>
                 <w:sz w:val="16"/>
               </w:rPr>
-              <w:t>Rainfall rate-of-rise &amp; cloudburst detection</w:t>
+              <w:t>Mobile: +91-9412052100</w:t>
+              <w:br/>
+              <w:t>Office: +91-135-2710334</w:t>
+            </w:r>
+          </w:p>
+        </w:tc>
+        <w:tc>
+          <w:tcPr>
+            <w:tcW w:type="dxa" w:w="2016"/>
+            <w:tcMar>
+              <w:top w:w="80" w:type="dxa"/>
+              <w:bottom w:w="80" w:type="dxa"/>
+              <w:left w:w="100" w:type="dxa"/>
+              <w:right w:w="100" w:type="dxa"/>
+            </w:tcMar>
+          </w:tcPr>
+          <w:p>
+            <w:r>
+              <w:rPr>
+                <w:rFonts w:ascii="Arial" w:hAnsi="Arial"/>
+                <w:sz w:val="16"/>
+              </w:rPr>
+              <w:t>Priority 1 (Strategic State Command)</w:t>
+              <w:br/>
+              <w:t>Radio: VHF 156.800 MHz</w:t>
             </w:r>
           </w:p>
         </w:tc>
@@ -1025,10 +2751,10 @@
       <w:tr>
         <w:tc>
           <w:tcPr>
-            <w:tcW w:type="dxa" w:w="2484"/>
+            <w:tcW w:type="dxa" w:w="2016"/>
             <w:tcMar>
-              <w:top w:w="70" w:type="dxa"/>
-              <w:bottom w:w="70" w:type="dxa"/>
+              <w:top w:w="80" w:type="dxa"/>
+              <w:bottom w:w="80" w:type="dxa"/>
               <w:left w:w="100" w:type="dxa"/>
               <w:right w:w="100" w:type="dxa"/>
             </w:tcMar>
@@ -1037,18 +2763,21 @@
           <w:p>
             <w:r>
               <w:rPr>
+                <w:rFonts w:ascii="Arial" w:hAnsi="Arial"/>
                 <w:sz w:val="16"/>
               </w:rPr>
-              <w:t>Open-Meteo DEM Elevation</w:t>
+              <w:t>Commandant, SDRF Uttarakhand</w:t>
+              <w:br/>
+              <w:t>Senior Superintendent of Police / Commandant</w:t>
             </w:r>
           </w:p>
         </w:tc>
         <w:tc>
           <w:tcPr>
-            <w:tcW w:type="dxa" w:w="2484"/>
+            <w:tcW w:type="dxa" w:w="2016"/>
             <w:tcMar>
-              <w:top w:w="70" w:type="dxa"/>
-              <w:bottom w:w="70" w:type="dxa"/>
+              <w:top w:w="80" w:type="dxa"/>
+              <w:bottom w:w="80" w:type="dxa"/>
               <w:left w:w="100" w:type="dxa"/>
               <w:right w:w="100" w:type="dxa"/>
             </w:tcMar>
@@ -1057,18 +2786,19 @@
           <w:p>
             <w:r>
               <w:rPr>
+                <w:rFonts w:ascii="Arial" w:hAnsi="Arial"/>
                 <w:sz w:val="16"/>
               </w:rPr>
-              <w:t>High-res Copernicus 10m Digital Elevation Model (DEM)</w:t>
+              <w:t>SDRF</w:t>
             </w:r>
           </w:p>
         </w:tc>
         <w:tc>
           <w:tcPr>
-            <w:tcW w:type="dxa" w:w="2484"/>
+            <w:tcW w:type="dxa" w:w="2016"/>
             <w:tcMar>
-              <w:top w:w="70" w:type="dxa"/>
-              <w:bottom w:w="70" w:type="dxa"/>
+              <w:top w:w="80" w:type="dxa"/>
+              <w:bottom w:w="80" w:type="dxa"/>
               <w:left w:w="100" w:type="dxa"/>
               <w:right w:w="100" w:type="dxa"/>
             </w:tcMar>
@@ -1077,18 +2807,19 @@
           <w:p>
             <w:r>
               <w:rPr>
+                <w:rFonts w:ascii="Arial" w:hAnsi="Arial"/>
                 <w:sz w:val="16"/>
               </w:rPr>
-              <w:t>Live / Static DEM</w:t>
+              <w:t>Statewide</w:t>
             </w:r>
           </w:p>
         </w:tc>
         <w:tc>
           <w:tcPr>
-            <w:tcW w:type="dxa" w:w="2484"/>
+            <w:tcW w:type="dxa" w:w="2016"/>
             <w:tcMar>
-              <w:top w:w="70" w:type="dxa"/>
-              <w:bottom w:w="70" w:type="dxa"/>
+              <w:top w:w="80" w:type="dxa"/>
+              <w:bottom w:w="80" w:type="dxa"/>
               <w:left w:w="100" w:type="dxa"/>
               <w:right w:w="100" w:type="dxa"/>
             </w:tcMar>
@@ -1097,98 +2828,21 @@
           <w:p>
             <w:r>
               <w:rPr>
+                <w:rFonts w:ascii="Arial" w:hAnsi="Arial"/>
                 <w:sz w:val="16"/>
               </w:rPr>
-              <w:t>Topographic slope angle, elevation contour &amp; flood routing</w:t>
-            </w:r>
-          </w:p>
-        </w:tc>
-      </w:tr>
-      <w:tr>
-        <w:tc>
-          <w:tcPr>
-            <w:tcW w:type="dxa" w:w="2484"/>
-            <w:tcMar>
-              <w:top w:w="70" w:type="dxa"/>
-              <w:bottom w:w="70" w:type="dxa"/>
-              <w:left w:w="100" w:type="dxa"/>
-              <w:right w:w="100" w:type="dxa"/>
-            </w:tcMar>
-          </w:tcPr>
-          <w:p>
-            <w:r>
-              <w:rPr>
-                <w:sz w:val="16"/>
-              </w:rPr>
-              <w:t>Copernicus GloFAS (ECMWF)</w:t>
+              <w:t>Mobile: +91-9456598888</w:t>
+              <w:br/>
+              <w:t>Office: +91-135-2761800</w:t>
             </w:r>
           </w:p>
         </w:tc>
         <w:tc>
           <w:tcPr>
-            <w:tcW w:type="dxa" w:w="2484"/>
+            <w:tcW w:type="dxa" w:w="2016"/>
             <w:tcMar>
-              <w:top w:w="70" w:type="dxa"/>
-              <w:bottom w:w="70" w:type="dxa"/>
-              <w:left w:w="100" w:type="dxa"/>
-              <w:right w:w="100" w:type="dxa"/>
-            </w:tcMar>
-          </w:tcPr>
-          <w:p>
-            <w:r>
-              <w:rPr>
-                <w:sz w:val="16"/>
-              </w:rPr>
-              <w:t>River discharge forecasts (m³/s), 5-day ensemble runoff</w:t>
-            </w:r>
-          </w:p>
-        </w:tc>
-        <w:tc>
-          <w:tcPr>
-            <w:tcW w:type="dxa" w:w="2484"/>
-            <w:tcMar>
-              <w:top w:w="70" w:type="dxa"/>
-              <w:bottom w:w="70" w:type="dxa"/>
-              <w:left w:w="100" w:type="dxa"/>
-              <w:right w:w="100" w:type="dxa"/>
-            </w:tcMar>
-          </w:tcPr>
-          <w:p>
-            <w:r>
-              <w:rPr>
-                <w:sz w:val="16"/>
-              </w:rPr>
-              <w:t>Live / Real-Time</w:t>
-            </w:r>
-          </w:p>
-        </w:tc>
-        <w:tc>
-          <w:tcPr>
-            <w:tcW w:type="dxa" w:w="2484"/>
-            <w:tcMar>
-              <w:top w:w="70" w:type="dxa"/>
-              <w:bottom w:w="70" w:type="dxa"/>
-              <w:left w:w="100" w:type="dxa"/>
-              <w:right w:w="100" w:type="dxa"/>
-            </w:tcMar>
-          </w:tcPr>
-          <w:p>
-            <w:r>
-              <w:rPr>
-                <w:sz w:val="16"/>
-              </w:rPr>
-              <w:t>Alaknanda and Bhagirathi river wave propagation</w:t>
-            </w:r>
-          </w:p>
-        </w:tc>
-      </w:tr>
-      <w:tr>
-        <w:tc>
-          <w:tcPr>
-            <w:tcW w:type="dxa" w:w="2484"/>
-            <w:tcMar>
-              <w:top w:w="70" w:type="dxa"/>
-              <w:bottom w:w="70" w:type="dxa"/>
+              <w:top w:w="80" w:type="dxa"/>
+              <w:bottom w:w="80" w:type="dxa"/>
               <w:left w:w="100" w:type="dxa"/>
               <w:right w:w="100" w:type="dxa"/>
             </w:tcMar>
@@ -1197,18 +2851,131 @@
           <w:p>
             <w:r>
               <w:rPr>
+                <w:rFonts w:ascii="Arial" w:hAnsi="Arial"/>
                 <w:sz w:val="16"/>
               </w:rPr>
-              <w:t>USGS Real-Time Earthquakes</w:t>
+              <w:t>Priority 1 (Tactical First Responder)</w:t>
+              <w:br/>
+              <w:t>Radio: SDRF Tac 162.125 MHz</w:t>
+            </w:r>
+          </w:p>
+        </w:tc>
+      </w:tr>
+      <w:tr>
+        <w:tc>
+          <w:tcPr>
+            <w:tcW w:type="dxa" w:w="2016"/>
+            <w:tcMar>
+              <w:top w:w="80" w:type="dxa"/>
+              <w:bottom w:w="80" w:type="dxa"/>
+              <w:left w:w="100" w:type="dxa"/>
+              <w:right w:w="100" w:type="dxa"/>
+            </w:tcMar>
+          </w:tcPr>
+          <w:p>
+            <w:r>
+              <w:rPr>
+                <w:rFonts w:ascii="Arial" w:hAnsi="Arial"/>
+                <w:sz w:val="16"/>
+              </w:rPr>
+              <w:t>Commandant, 8th Bn NDRF</w:t>
+              <w:br/>
+              <w:t>Battalion Commander, Northern Sector</w:t>
             </w:r>
           </w:p>
         </w:tc>
         <w:tc>
           <w:tcPr>
-            <w:tcW w:type="dxa" w:w="2484"/>
+            <w:tcW w:type="dxa" w:w="2016"/>
             <w:tcMar>
-              <w:top w:w="70" w:type="dxa"/>
-              <w:bottom w:w="70" w:type="dxa"/>
+              <w:top w:w="80" w:type="dxa"/>
+              <w:bottom w:w="80" w:type="dxa"/>
+              <w:left w:w="100" w:type="dxa"/>
+              <w:right w:w="100" w:type="dxa"/>
+            </w:tcMar>
+          </w:tcPr>
+          <w:p>
+            <w:r>
+              <w:rPr>
+                <w:rFonts w:ascii="Arial" w:hAnsi="Arial"/>
+                <w:sz w:val="16"/>
+              </w:rPr>
+              <w:t>NDRF</w:t>
+            </w:r>
+          </w:p>
+        </w:tc>
+        <w:tc>
+          <w:tcPr>
+            <w:tcW w:type="dxa" w:w="2016"/>
+            <w:tcMar>
+              <w:top w:w="80" w:type="dxa"/>
+              <w:bottom w:w="80" w:type="dxa"/>
+              <w:left w:w="100" w:type="dxa"/>
+              <w:right w:w="100" w:type="dxa"/>
+            </w:tcMar>
+          </w:tcPr>
+          <w:p>
+            <w:r>
+              <w:rPr>
+                <w:rFonts w:ascii="Arial" w:hAnsi="Arial"/>
+                <w:sz w:val="16"/>
+              </w:rPr>
+              <w:t>Statewide</w:t>
+            </w:r>
+          </w:p>
+        </w:tc>
+        <w:tc>
+          <w:tcPr>
+            <w:tcW w:type="dxa" w:w="2016"/>
+            <w:tcMar>
+              <w:top w:w="80" w:type="dxa"/>
+              <w:bottom w:w="80" w:type="dxa"/>
+              <w:left w:w="100" w:type="dxa"/>
+              <w:right w:w="100" w:type="dxa"/>
+            </w:tcMar>
+          </w:tcPr>
+          <w:p>
+            <w:r>
+              <w:rPr>
+                <w:rFonts w:ascii="Arial" w:hAnsi="Arial"/>
+                <w:sz w:val="16"/>
+              </w:rPr>
+              <w:t>Mobile: +91-9412052112</w:t>
+              <w:br/>
+              <w:t>Office: +91-120-2766013</w:t>
+            </w:r>
+          </w:p>
+        </w:tc>
+        <w:tc>
+          <w:tcPr>
+            <w:tcW w:type="dxa" w:w="2016"/>
+            <w:tcMar>
+              <w:top w:w="80" w:type="dxa"/>
+              <w:bottom w:w="80" w:type="dxa"/>
+              <w:left w:w="100" w:type="dxa"/>
+              <w:right w:w="100" w:type="dxa"/>
+            </w:tcMar>
+          </w:tcPr>
+          <w:p>
+            <w:r>
+              <w:rPr>
+                <w:rFonts w:ascii="Arial" w:hAnsi="Arial"/>
+                <w:sz w:val="16"/>
+              </w:rPr>
+              <w:t>Priority 2 (National Tactical Standby)</w:t>
+              <w:br/>
+              <w:t>Radio: NDRF UHF 412.350 MHz</w:t>
+            </w:r>
+          </w:p>
+        </w:tc>
+      </w:tr>
+      <w:tr>
+        <w:tc>
+          <w:tcPr>
+            <w:tcW w:type="dxa" w:w="2016"/>
+            <w:tcMar>
+              <w:top w:w="80" w:type="dxa"/>
+              <w:bottom w:w="80" w:type="dxa"/>
               <w:left w:w="100" w:type="dxa"/>
               <w:right w:w="100" w:type="dxa"/>
             </w:tcMar>
@@ -1217,18 +2984,21 @@
           <w:p>
             <w:r>
               <w:rPr>
+                <w:rFonts w:ascii="Arial" w:hAnsi="Arial"/>
                 <w:sz w:val="16"/>
               </w:rPr>
-              <w:t>Seismic magnitude, focal depth, epicenter coordinates</w:t>
+              <w:t>District Magistrate Chamoli</w:t>
+              <w:br/>
+              <w:t>District Collector &amp; DDMA Chairman</w:t>
             </w:r>
           </w:p>
         </w:tc>
         <w:tc>
           <w:tcPr>
-            <w:tcW w:type="dxa" w:w="2484"/>
+            <w:tcW w:type="dxa" w:w="2016"/>
             <w:tcMar>
-              <w:top w:w="70" w:type="dxa"/>
-              <w:bottom w:w="70" w:type="dxa"/>
+              <w:top w:w="80" w:type="dxa"/>
+              <w:bottom w:w="80" w:type="dxa"/>
               <w:left w:w="100" w:type="dxa"/>
               <w:right w:w="100" w:type="dxa"/>
             </w:tcMar>
@@ -1237,18 +3007,19 @@
           <w:p>
             <w:r>
               <w:rPr>
+                <w:rFonts w:ascii="Arial" w:hAnsi="Arial"/>
                 <w:sz w:val="16"/>
               </w:rPr>
-              <w:t>Live / Real-Time</w:t>
+              <w:t>DDMA</w:t>
             </w:r>
           </w:p>
         </w:tc>
         <w:tc>
           <w:tcPr>
-            <w:tcW w:type="dxa" w:w="2484"/>
+            <w:tcW w:type="dxa" w:w="2016"/>
             <w:tcMar>
-              <w:top w:w="70" w:type="dxa"/>
-              <w:bottom w:w="70" w:type="dxa"/>
+              <w:top w:w="80" w:type="dxa"/>
+              <w:bottom w:w="80" w:type="dxa"/>
               <w:left w:w="100" w:type="dxa"/>
               <w:right w:w="100" w:type="dxa"/>
             </w:tcMar>
@@ -1257,98 +3028,19 @@
           <w:p>
             <w:r>
               <w:rPr>
+                <w:rFonts w:ascii="Arial" w:hAnsi="Arial"/>
                 <w:sz w:val="16"/>
               </w:rPr>
-              <w:t>Slope stability &amp; seismically-triggered landslide alerts</w:t>
-            </w:r>
-          </w:p>
-        </w:tc>
-      </w:tr>
-      <w:tr>
-        <w:tc>
-          <w:tcPr>
-            <w:tcW w:type="dxa" w:w="2484"/>
-            <w:tcMar>
-              <w:top w:w="70" w:type="dxa"/>
-              <w:bottom w:w="70" w:type="dxa"/>
-              <w:left w:w="100" w:type="dxa"/>
-              <w:right w:w="100" w:type="dxa"/>
-            </w:tcMar>
-          </w:tcPr>
-          <w:p>
-            <w:r>
-              <w:rPr>
-                <w:sz w:val="16"/>
-              </w:rPr>
-              <w:t>Central Water Commission (CWC)</w:t>
+              <w:t>Chamoli</w:t>
             </w:r>
           </w:p>
         </w:tc>
         <w:tc>
           <w:tcPr>
-            <w:tcW w:type="dxa" w:w="2484"/>
+            <w:tcW w:type="dxa" w:w="2016"/>
             <w:tcMar>
-              <w:top w:w="70" w:type="dxa"/>
-              <w:bottom w:w="70" w:type="dxa"/>
-              <w:left w:w="100" w:type="dxa"/>
-              <w:right w:w="100" w:type="dxa"/>
-            </w:tcMar>
-          </w:tcPr>
-          <w:p>
-            <w:r>
-              <w:rPr>
-                <w:sz w:val="16"/>
-              </w:rPr>
-              <w:t>River gauge levels (m), discharge, danger mark exceedance</w:t>
-            </w:r>
-          </w:p>
-        </w:tc>
-        <w:tc>
-          <w:tcPr>
-            <w:tcW w:type="dxa" w:w="2484"/>
-            <w:tcMar>
-              <w:top w:w="70" w:type="dxa"/>
-              <w:bottom w:w="70" w:type="dxa"/>
-              <w:left w:w="100" w:type="dxa"/>
-              <w:right w:w="100" w:type="dxa"/>
-            </w:tcMar>
-          </w:tcPr>
-          <w:p>
-            <w:r>
-              <w:rPr>
-                <w:sz w:val="16"/>
-              </w:rPr>
-              <w:t>Sensor Feeds</w:t>
-            </w:r>
-          </w:p>
-        </w:tc>
-        <w:tc>
-          <w:tcPr>
-            <w:tcW w:type="dxa" w:w="2484"/>
-            <w:tcMar>
-              <w:top w:w="70" w:type="dxa"/>
-              <w:bottom w:w="70" w:type="dxa"/>
-              <w:left w:w="100" w:type="dxa"/>
-              <w:right w:w="100" w:type="dxa"/>
-            </w:tcMar>
-          </w:tcPr>
-          <w:p>
-            <w:r>
-              <w:rPr>
-                <w:sz w:val="16"/>
-              </w:rPr>
-              <w:t>Critical threshold detection &amp; automated call triggers</w:t>
-            </w:r>
-          </w:p>
-        </w:tc>
-      </w:tr>
-      <w:tr>
-        <w:tc>
-          <w:tcPr>
-            <w:tcW w:type="dxa" w:w="2484"/>
-            <w:tcMar>
-              <w:top w:w="70" w:type="dxa"/>
-              <w:bottom w:w="70" w:type="dxa"/>
+              <w:top w:w="80" w:type="dxa"/>
+              <w:bottom w:w="80" w:type="dxa"/>
               <w:left w:w="100" w:type="dxa"/>
               <w:right w:w="100" w:type="dxa"/>
             </w:tcMar>
@@ -1357,18 +3049,21 @@
           <w:p>
             <w:r>
               <w:rPr>
+                <w:rFonts w:ascii="Arial" w:hAnsi="Arial"/>
                 <w:sz w:val="16"/>
               </w:rPr>
-              <w:t>USDMA Shelter Database</w:t>
+              <w:t>Mobile: +91-9412055666</w:t>
+              <w:br/>
+              <w:t>Office: +91-1372-252101</w:t>
             </w:r>
           </w:p>
         </w:tc>
         <w:tc>
           <w:tcPr>
-            <w:tcW w:type="dxa" w:w="2484"/>
+            <w:tcW w:type="dxa" w:w="2016"/>
             <w:tcMar>
-              <w:top w:w="70" w:type="dxa"/>
-              <w:bottom w:w="70" w:type="dxa"/>
+              <w:top w:w="80" w:type="dxa"/>
+              <w:bottom w:w="80" w:type="dxa"/>
               <w:left w:w="100" w:type="dxa"/>
               <w:right w:w="100" w:type="dxa"/>
             </w:tcMar>
@@ -1377,18 +3072,131 @@
           <w:p>
             <w:r>
               <w:rPr>
+                <w:rFonts w:ascii="Arial" w:hAnsi="Arial"/>
                 <w:sz w:val="16"/>
               </w:rPr>
-              <w:t>Safe haven capacity, altitude, coordinates, contact officers</w:t>
+              <w:t>Priority 1 (District Operational Lead)</w:t>
+              <w:br/>
+              <w:t>Radio: Chamoli EOC 152.050 MHz</w:t>
+            </w:r>
+          </w:p>
+        </w:tc>
+      </w:tr>
+      <w:tr>
+        <w:tc>
+          <w:tcPr>
+            <w:tcW w:type="dxa" w:w="2016"/>
+            <w:tcMar>
+              <w:top w:w="80" w:type="dxa"/>
+              <w:bottom w:w="80" w:type="dxa"/>
+              <w:left w:w="100" w:type="dxa"/>
+              <w:right w:w="100" w:type="dxa"/>
+            </w:tcMar>
+          </w:tcPr>
+          <w:p>
+            <w:r>
+              <w:rPr>
+                <w:rFonts w:ascii="Arial" w:hAnsi="Arial"/>
+                <w:sz w:val="16"/>
+              </w:rPr>
+              <w:t>Superintendent of Police Chamoli</w:t>
+              <w:br/>
+              <w:t>District Police Chief</w:t>
             </w:r>
           </w:p>
         </w:tc>
         <w:tc>
           <w:tcPr>
-            <w:tcW w:type="dxa" w:w="2484"/>
+            <w:tcW w:type="dxa" w:w="2016"/>
             <w:tcMar>
-              <w:top w:w="70" w:type="dxa"/>
-              <w:bottom w:w="70" w:type="dxa"/>
+              <w:top w:w="80" w:type="dxa"/>
+              <w:bottom w:w="80" w:type="dxa"/>
+              <w:left w:w="100" w:type="dxa"/>
+              <w:right w:w="100" w:type="dxa"/>
+            </w:tcMar>
+          </w:tcPr>
+          <w:p>
+            <w:r>
+              <w:rPr>
+                <w:rFonts w:ascii="Arial" w:hAnsi="Arial"/>
+                <w:sz w:val="16"/>
+              </w:rPr>
+              <w:t>POLICE</w:t>
+            </w:r>
+          </w:p>
+        </w:tc>
+        <w:tc>
+          <w:tcPr>
+            <w:tcW w:type="dxa" w:w="2016"/>
+            <w:tcMar>
+              <w:top w:w="80" w:type="dxa"/>
+              <w:bottom w:w="80" w:type="dxa"/>
+              <w:left w:w="100" w:type="dxa"/>
+              <w:right w:w="100" w:type="dxa"/>
+            </w:tcMar>
+          </w:tcPr>
+          <w:p>
+            <w:r>
+              <w:rPr>
+                <w:rFonts w:ascii="Arial" w:hAnsi="Arial"/>
+                <w:sz w:val="16"/>
+              </w:rPr>
+              <w:t>Chamoli</w:t>
+            </w:r>
+          </w:p>
+        </w:tc>
+        <w:tc>
+          <w:tcPr>
+            <w:tcW w:type="dxa" w:w="2016"/>
+            <w:tcMar>
+              <w:top w:w="80" w:type="dxa"/>
+              <w:bottom w:w="80" w:type="dxa"/>
+              <w:left w:w="100" w:type="dxa"/>
+              <w:right w:w="100" w:type="dxa"/>
+            </w:tcMar>
+          </w:tcPr>
+          <w:p>
+            <w:r>
+              <w:rPr>
+                <w:rFonts w:ascii="Arial" w:hAnsi="Arial"/>
+                <w:sz w:val="16"/>
+              </w:rPr>
+              <w:t>Mobile: +91-9412052134</w:t>
+              <w:br/>
+              <w:t>Office: +91-1372-252134</w:t>
+            </w:r>
+          </w:p>
+        </w:tc>
+        <w:tc>
+          <w:tcPr>
+            <w:tcW w:type="dxa" w:w="2016"/>
+            <w:tcMar>
+              <w:top w:w="80" w:type="dxa"/>
+              <w:bottom w:w="80" w:type="dxa"/>
+              <w:left w:w="100" w:type="dxa"/>
+              <w:right w:w="100" w:type="dxa"/>
+            </w:tcMar>
+          </w:tcPr>
+          <w:p>
+            <w:r>
+              <w:rPr>
+                <w:rFonts w:ascii="Arial" w:hAnsi="Arial"/>
+                <w:sz w:val="16"/>
+              </w:rPr>
+              <w:t>Priority 2 (Corridor Evacuation Lead)</w:t>
+              <w:br/>
+              <w:t>Radio: Police Net CH-3</w:t>
+            </w:r>
+          </w:p>
+        </w:tc>
+      </w:tr>
+      <w:tr>
+        <w:tc>
+          <w:tcPr>
+            <w:tcW w:type="dxa" w:w="2016"/>
+            <w:tcMar>
+              <w:top w:w="80" w:type="dxa"/>
+              <w:bottom w:w="80" w:type="dxa"/>
               <w:left w:w="100" w:type="dxa"/>
               <w:right w:w="100" w:type="dxa"/>
             </w:tcMar>
@@ -1397,18 +3205,21 @@
           <w:p>
             <w:r>
               <w:rPr>
+                <w:rFonts w:ascii="Arial" w:hAnsi="Arial"/>
                 <w:sz w:val="16"/>
               </w:rPr>
-              <w:t>GIS Registry</w:t>
+              <w:t>Executive Engineer CWC</w:t>
+              <w:br/>
+              <w:t>Executive Engineer, Upper Ganga Division</w:t>
             </w:r>
           </w:p>
         </w:tc>
         <w:tc>
           <w:tcPr>
-            <w:tcW w:type="dxa" w:w="2484"/>
+            <w:tcW w:type="dxa" w:w="2016"/>
             <w:tcMar>
-              <w:top w:w="70" w:type="dxa"/>
-              <w:bottom w:w="70" w:type="dxa"/>
+              <w:top w:w="80" w:type="dxa"/>
+              <w:bottom w:w="80" w:type="dxa"/>
               <w:left w:w="100" w:type="dxa"/>
               <w:right w:w="100" w:type="dxa"/>
             </w:tcMar>
@@ -1417,9 +3228,491 @@
           <w:p>
             <w:r>
               <w:rPr>
+                <w:rFonts w:ascii="Arial" w:hAnsi="Arial"/>
                 <w:sz w:val="16"/>
               </w:rPr>
-              <w:t>Dynamic haven allocation &amp; shortest escape routing</w:t>
+              <w:t>CWC</w:t>
+            </w:r>
+          </w:p>
+        </w:tc>
+        <w:tc>
+          <w:tcPr>
+            <w:tcW w:type="dxa" w:w="2016"/>
+            <w:tcMar>
+              <w:top w:w="80" w:type="dxa"/>
+              <w:bottom w:w="80" w:type="dxa"/>
+              <w:left w:w="100" w:type="dxa"/>
+              <w:right w:w="100" w:type="dxa"/>
+            </w:tcMar>
+            <w:shd w:fill="FEF2F2"/>
+          </w:tcPr>
+          <w:p>
+            <w:r>
+              <w:rPr>
+                <w:rFonts w:ascii="Arial" w:hAnsi="Arial"/>
+                <w:sz w:val="16"/>
+              </w:rPr>
+              <w:t>Chamoli</w:t>
+            </w:r>
+          </w:p>
+        </w:tc>
+        <w:tc>
+          <w:tcPr>
+            <w:tcW w:type="dxa" w:w="2016"/>
+            <w:tcMar>
+              <w:top w:w="80" w:type="dxa"/>
+              <w:bottom w:w="80" w:type="dxa"/>
+              <w:left w:w="100" w:type="dxa"/>
+              <w:right w:w="100" w:type="dxa"/>
+            </w:tcMar>
+            <w:shd w:fill="FEF2F2"/>
+          </w:tcPr>
+          <w:p>
+            <w:r>
+              <w:rPr>
+                <w:rFonts w:ascii="Arial" w:hAnsi="Arial"/>
+                <w:sz w:val="16"/>
+              </w:rPr>
+              <w:t>Mobile: +91-9412052200</w:t>
+              <w:br/>
+              <w:t>Office: +91-1372-252200</w:t>
+            </w:r>
+          </w:p>
+        </w:tc>
+        <w:tc>
+          <w:tcPr>
+            <w:tcW w:type="dxa" w:w="2016"/>
+            <w:tcMar>
+              <w:top w:w="80" w:type="dxa"/>
+              <w:bottom w:w="80" w:type="dxa"/>
+              <w:left w:w="100" w:type="dxa"/>
+              <w:right w:w="100" w:type="dxa"/>
+            </w:tcMar>
+            <w:shd w:fill="FEF2F2"/>
+          </w:tcPr>
+          <w:p>
+            <w:r>
+              <w:rPr>
+                <w:rFonts w:ascii="Arial" w:hAnsi="Arial"/>
+                <w:sz w:val="16"/>
+              </w:rPr>
+              <w:t>Priority 2 (Hydrological Verification)</w:t>
+              <w:br/>
+              <w:t>Radio: CWC Hydrology Link</w:t>
+            </w:r>
+          </w:p>
+        </w:tc>
+      </w:tr>
+      <w:tr>
+        <w:tc>
+          <w:tcPr>
+            <w:tcW w:type="dxa" w:w="2016"/>
+            <w:tcMar>
+              <w:top w:w="80" w:type="dxa"/>
+              <w:bottom w:w="80" w:type="dxa"/>
+              <w:left w:w="100" w:type="dxa"/>
+              <w:right w:w="100" w:type="dxa"/>
+            </w:tcMar>
+          </w:tcPr>
+          <w:p>
+            <w:r>
+              <w:rPr>
+                <w:rFonts w:ascii="Arial" w:hAnsi="Arial"/>
+                <w:sz w:val="16"/>
+              </w:rPr>
+              <w:t>District Magistrate Rudraprayag</w:t>
+              <w:br/>
+              <w:t>District Collector &amp; DDMA Chairman</w:t>
+            </w:r>
+          </w:p>
+        </w:tc>
+        <w:tc>
+          <w:tcPr>
+            <w:tcW w:type="dxa" w:w="2016"/>
+            <w:tcMar>
+              <w:top w:w="80" w:type="dxa"/>
+              <w:bottom w:w="80" w:type="dxa"/>
+              <w:left w:w="100" w:type="dxa"/>
+              <w:right w:w="100" w:type="dxa"/>
+            </w:tcMar>
+          </w:tcPr>
+          <w:p>
+            <w:r>
+              <w:rPr>
+                <w:rFonts w:ascii="Arial" w:hAnsi="Arial"/>
+                <w:sz w:val="16"/>
+              </w:rPr>
+              <w:t>DDMA</w:t>
+            </w:r>
+          </w:p>
+        </w:tc>
+        <w:tc>
+          <w:tcPr>
+            <w:tcW w:type="dxa" w:w="2016"/>
+            <w:tcMar>
+              <w:top w:w="80" w:type="dxa"/>
+              <w:bottom w:w="80" w:type="dxa"/>
+              <w:left w:w="100" w:type="dxa"/>
+              <w:right w:w="100" w:type="dxa"/>
+            </w:tcMar>
+          </w:tcPr>
+          <w:p>
+            <w:r>
+              <w:rPr>
+                <w:rFonts w:ascii="Arial" w:hAnsi="Arial"/>
+                <w:sz w:val="16"/>
+              </w:rPr>
+              <w:t>Rudraprayag</w:t>
+            </w:r>
+          </w:p>
+        </w:tc>
+        <w:tc>
+          <w:tcPr>
+            <w:tcW w:type="dxa" w:w="2016"/>
+            <w:tcMar>
+              <w:top w:w="80" w:type="dxa"/>
+              <w:bottom w:w="80" w:type="dxa"/>
+              <w:left w:w="100" w:type="dxa"/>
+              <w:right w:w="100" w:type="dxa"/>
+            </w:tcMar>
+          </w:tcPr>
+          <w:p>
+            <w:r>
+              <w:rPr>
+                <w:rFonts w:ascii="Arial" w:hAnsi="Arial"/>
+                <w:sz w:val="16"/>
+              </w:rPr>
+              <w:t>Mobile: +91-9412055777</w:t>
+              <w:br/>
+              <w:t>Office: +91-1364-233300</w:t>
+            </w:r>
+          </w:p>
+        </w:tc>
+        <w:tc>
+          <w:tcPr>
+            <w:tcW w:type="dxa" w:w="2016"/>
+            <w:tcMar>
+              <w:top w:w="80" w:type="dxa"/>
+              <w:bottom w:w="80" w:type="dxa"/>
+              <w:left w:w="100" w:type="dxa"/>
+              <w:right w:w="100" w:type="dxa"/>
+            </w:tcMar>
+          </w:tcPr>
+          <w:p>
+            <w:r>
+              <w:rPr>
+                <w:rFonts w:ascii="Arial" w:hAnsi="Arial"/>
+                <w:sz w:val="16"/>
+              </w:rPr>
+              <w:t>Priority 1 (Kedarnath Corridor Lead)</w:t>
+              <w:br/>
+              <w:t>Radio: Rudraprayag EOC 153.125 MHz</w:t>
+            </w:r>
+          </w:p>
+        </w:tc>
+      </w:tr>
+      <w:tr>
+        <w:tc>
+          <w:tcPr>
+            <w:tcW w:type="dxa" w:w="2016"/>
+            <w:tcMar>
+              <w:top w:w="80" w:type="dxa"/>
+              <w:bottom w:w="80" w:type="dxa"/>
+              <w:left w:w="100" w:type="dxa"/>
+              <w:right w:w="100" w:type="dxa"/>
+            </w:tcMar>
+            <w:shd w:fill="FEF2F2"/>
+          </w:tcPr>
+          <w:p>
+            <w:r>
+              <w:rPr>
+                <w:rFonts w:ascii="Arial" w:hAnsi="Arial"/>
+                <w:sz w:val="16"/>
+              </w:rPr>
+              <w:t>District Magistrate Uttarkashi</w:t>
+              <w:br/>
+              <w:t>District Collector &amp; DDMA Chairman</w:t>
+            </w:r>
+          </w:p>
+        </w:tc>
+        <w:tc>
+          <w:tcPr>
+            <w:tcW w:type="dxa" w:w="2016"/>
+            <w:tcMar>
+              <w:top w:w="80" w:type="dxa"/>
+              <w:bottom w:w="80" w:type="dxa"/>
+              <w:left w:w="100" w:type="dxa"/>
+              <w:right w:w="100" w:type="dxa"/>
+            </w:tcMar>
+            <w:shd w:fill="FEF2F2"/>
+          </w:tcPr>
+          <w:p>
+            <w:r>
+              <w:rPr>
+                <w:rFonts w:ascii="Arial" w:hAnsi="Arial"/>
+                <w:sz w:val="16"/>
+              </w:rPr>
+              <w:t>DDMA</w:t>
+            </w:r>
+          </w:p>
+        </w:tc>
+        <w:tc>
+          <w:tcPr>
+            <w:tcW w:type="dxa" w:w="2016"/>
+            <w:tcMar>
+              <w:top w:w="80" w:type="dxa"/>
+              <w:bottom w:w="80" w:type="dxa"/>
+              <w:left w:w="100" w:type="dxa"/>
+              <w:right w:w="100" w:type="dxa"/>
+            </w:tcMar>
+            <w:shd w:fill="FEF2F2"/>
+          </w:tcPr>
+          <w:p>
+            <w:r>
+              <w:rPr>
+                <w:rFonts w:ascii="Arial" w:hAnsi="Arial"/>
+                <w:sz w:val="16"/>
+              </w:rPr>
+              <w:t>Uttarkashi</w:t>
+            </w:r>
+          </w:p>
+        </w:tc>
+        <w:tc>
+          <w:tcPr>
+            <w:tcW w:type="dxa" w:w="2016"/>
+            <w:tcMar>
+              <w:top w:w="80" w:type="dxa"/>
+              <w:bottom w:w="80" w:type="dxa"/>
+              <w:left w:w="100" w:type="dxa"/>
+              <w:right w:w="100" w:type="dxa"/>
+            </w:tcMar>
+            <w:shd w:fill="FEF2F2"/>
+          </w:tcPr>
+          <w:p>
+            <w:r>
+              <w:rPr>
+                <w:rFonts w:ascii="Arial" w:hAnsi="Arial"/>
+                <w:sz w:val="16"/>
+              </w:rPr>
+              <w:t>Mobile: +91-9412055888</w:t>
+              <w:br/>
+              <w:t>Office: +91-1374-222102</w:t>
+            </w:r>
+          </w:p>
+        </w:tc>
+        <w:tc>
+          <w:tcPr>
+            <w:tcW w:type="dxa" w:w="2016"/>
+            <w:tcMar>
+              <w:top w:w="80" w:type="dxa"/>
+              <w:bottom w:w="80" w:type="dxa"/>
+              <w:left w:w="100" w:type="dxa"/>
+              <w:right w:w="100" w:type="dxa"/>
+            </w:tcMar>
+            <w:shd w:fill="FEF2F2"/>
+          </w:tcPr>
+          <w:p>
+            <w:r>
+              <w:rPr>
+                <w:rFonts w:ascii="Arial" w:hAnsi="Arial"/>
+                <w:sz w:val="16"/>
+              </w:rPr>
+              <w:t>Priority 1 (Gangotri Axis Lead)</w:t>
+              <w:br/>
+              <w:t>Radio: Bhagirathi Net 151.750 MHz</w:t>
+            </w:r>
+          </w:p>
+        </w:tc>
+      </w:tr>
+      <w:tr>
+        <w:tc>
+          <w:tcPr>
+            <w:tcW w:type="dxa" w:w="2016"/>
+            <w:tcMar>
+              <w:top w:w="80" w:type="dxa"/>
+              <w:bottom w:w="80" w:type="dxa"/>
+              <w:left w:w="100" w:type="dxa"/>
+              <w:right w:w="100" w:type="dxa"/>
+            </w:tcMar>
+          </w:tcPr>
+          <w:p>
+            <w:r>
+              <w:rPr>
+                <w:rFonts w:ascii="Arial" w:hAnsi="Arial"/>
+                <w:sz w:val="16"/>
+              </w:rPr>
+              <w:t>District Magistrate Pauri Garhwal</w:t>
+              <w:br/>
+              <w:t>District Collector &amp; DDMA Chairman</w:t>
+            </w:r>
+          </w:p>
+        </w:tc>
+        <w:tc>
+          <w:tcPr>
+            <w:tcW w:type="dxa" w:w="2016"/>
+            <w:tcMar>
+              <w:top w:w="80" w:type="dxa"/>
+              <w:bottom w:w="80" w:type="dxa"/>
+              <w:left w:w="100" w:type="dxa"/>
+              <w:right w:w="100" w:type="dxa"/>
+            </w:tcMar>
+          </w:tcPr>
+          <w:p>
+            <w:r>
+              <w:rPr>
+                <w:rFonts w:ascii="Arial" w:hAnsi="Arial"/>
+                <w:sz w:val="16"/>
+              </w:rPr>
+              <w:t>DDMA</w:t>
+            </w:r>
+          </w:p>
+        </w:tc>
+        <w:tc>
+          <w:tcPr>
+            <w:tcW w:type="dxa" w:w="2016"/>
+            <w:tcMar>
+              <w:top w:w="80" w:type="dxa"/>
+              <w:bottom w:w="80" w:type="dxa"/>
+              <w:left w:w="100" w:type="dxa"/>
+              <w:right w:w="100" w:type="dxa"/>
+            </w:tcMar>
+          </w:tcPr>
+          <w:p>
+            <w:r>
+              <w:rPr>
+                <w:rFonts w:ascii="Arial" w:hAnsi="Arial"/>
+                <w:sz w:val="16"/>
+              </w:rPr>
+              <w:t>Pauri</w:t>
+            </w:r>
+          </w:p>
+        </w:tc>
+        <w:tc>
+          <w:tcPr>
+            <w:tcW w:type="dxa" w:w="2016"/>
+            <w:tcMar>
+              <w:top w:w="80" w:type="dxa"/>
+              <w:bottom w:w="80" w:type="dxa"/>
+              <w:left w:w="100" w:type="dxa"/>
+              <w:right w:w="100" w:type="dxa"/>
+            </w:tcMar>
+          </w:tcPr>
+          <w:p>
+            <w:r>
+              <w:rPr>
+                <w:rFonts w:ascii="Arial" w:hAnsi="Arial"/>
+                <w:sz w:val="16"/>
+              </w:rPr>
+              <w:t>Mobile: +91-9412055999</w:t>
+              <w:br/>
+              <w:t>Office: +91-1368-222101</w:t>
+            </w:r>
+          </w:p>
+        </w:tc>
+        <w:tc>
+          <w:tcPr>
+            <w:tcW w:type="dxa" w:w="2016"/>
+            <w:tcMar>
+              <w:top w:w="80" w:type="dxa"/>
+              <w:bottom w:w="80" w:type="dxa"/>
+              <w:left w:w="100" w:type="dxa"/>
+              <w:right w:w="100" w:type="dxa"/>
+            </w:tcMar>
+          </w:tcPr>
+          <w:p>
+            <w:r>
+              <w:rPr>
+                <w:rFonts w:ascii="Arial" w:hAnsi="Arial"/>
+                <w:sz w:val="16"/>
+              </w:rPr>
+              <w:t>Priority 1 (Srinagar Dam Downstream)</w:t>
+              <w:br/>
+              <w:t>Radio: Pauri District Net</w:t>
+            </w:r>
+          </w:p>
+        </w:tc>
+      </w:tr>
+    </w:tbl>
+    <w:p/>
+    <w:p>
+      <w:r>
+        <w:rPr>
+          <w:b/>
+          <w:color w:val="0A2558"/>
+          <w:sz w:val="21"/>
+        </w:rPr>
+        <w:t>Automated Bilingual Voice Call Briefing Script:</w:t>
+      </w:r>
+    </w:p>
+    <w:tbl>
+      <w:tblPr>
+        <w:tblW w:type="auto" w:w="0"/>
+        <w:jc w:val="center"/>
+        <w:tblLook w:firstColumn="1" w:firstRow="1" w:lastColumn="0" w:lastRow="0" w:noHBand="0" w:noVBand="1" w:val="04A0"/>
+      </w:tblPr>
+      <w:tblGrid>
+        <w:gridCol w:w="10080"/>
+      </w:tblGrid>
+      <w:tr>
+        <w:tc>
+          <w:tcPr>
+            <w:tcW w:type="dxa" w:w="10080"/>
+            <w:shd w:fill="F8FAFC"/>
+            <w:tcMar>
+              <w:top w:w="100" w:type="dxa"/>
+              <w:bottom w:w="100" w:type="dxa"/>
+              <w:left w:w="150" w:type="dxa"/>
+              <w:right w:w="150" w:type="dxa"/>
+            </w:tcMar>
+          </w:tcPr>
+          <w:p>
+            <w:r>
+              <w:rPr>
+                <w:b/>
+                <w:color w:val="0A2558"/>
+                <w:sz w:val="18"/>
+              </w:rPr>
+              <w:t>ENGLISH AUDIO BRIEFING (Spoken via Twilio Voice / Polly.Aditi):</w:t>
+              <w:br/>
+            </w:r>
+            <w:r>
+              <w:rPr>
+                <w:i/>
+                <w:sz w:val="17"/>
+              </w:rPr>
+              <w:t>"THIS IS AN AUTOMATED PRIORITY EMERGENCY DISPATCH FROM THE UTTARAKHAND DISASTER EARLY WARNING INTELLIGENCE SYSTEM. A CRITICAL FLASH FLOOD GLOF SURGE HAS BEEN DETECTED AT UK-CHAMOLI-01, CHAMOLI DISTRICT. CURRENT RATE OF WATER LEVEL RISE IS 1.65 METERS PER HOUR, WITH LOCAL RAINFALL INTENSITY AT 52.0 MILLIMETERS PER HOUR. ESTIMATED TIME TO DOWNSTREAM INUNDATION IS 30 MINUTES. MANDATORY DIRECTIVE: DEPLOY SDRF QUICK RESPONSE TEAMS AND EVACUATE RIPARIAN CORRIDORS. PLEASE PRESS 1 ON YOUR KEYPAD TO ACKNOWLEDGE THIS CALL AND CONFIRM DEPLOYMENT."</w:t>
+            </w:r>
+          </w:p>
+        </w:tc>
+      </w:tr>
+      <w:tr>
+        <w:tc>
+          <w:tcPr>
+            <w:tcW w:type="dxa" w:w="10080"/>
+            <w:shd w:fill="FEF2F2"/>
+            <w:tcMar>
+              <w:top w:w="100" w:type="dxa"/>
+              <w:bottom w:w="100" w:type="dxa"/>
+              <w:left w:w="150" w:type="dxa"/>
+              <w:right w:w="150" w:type="dxa"/>
+            </w:tcMar>
+          </w:tcPr>
+          <w:p>
+            <w:r>
+              <w:rPr>
+                <w:b/>
+                <w:color w:val="B91C1C"/>
+                <w:sz w:val="18"/>
+              </w:rPr>
+              <w:t>HINDI AUDIO BRIEFING (हिन्दी स्वर प्रसारण):</w:t>
+              <w:br/>
+            </w:r>
+            <w:r>
+              <w:rPr>
+                <w:i/>
+                <w:sz w:val="17"/>
+              </w:rPr>
+              <w:t>"यह उत्तराखंड आपदा पूर्व चेतावनी प्रणाली की ओर से एक स्वचालित आपातकालीन कॉल है। चमोली जिले में UK-CHAMOLI-01 स्टेशन पर CRITICAL स्तर का जल प्लावन खतरा दर्ज किया गया है। नदी का जलस्तर 1.65 मीटर प्रति घंटा की दर से बढ़ रहा है और वर्षा तीव्रता 52.0 मिलीमीटर प्रति घंटा है। निचले क्षेत्रों तक बाढ़ पहुँचने का अनुमानित समय 30 मिनट है। आदेश: नदी तटों को तुरंत खाली कराएं और एसडीआरएफ बचाव दल तैनात करें। इस कॉल की पावती देने और कार्रवाई की पुष्टि के लिए कृपया अपने फोन पर 1 दबाएं।"</w:t>
             </w:r>
           </w:p>
         </w:tc>
@@ -1432,94 +3725,125 @@
       </w:pPr>
       <w:r>
         <w:rPr>
-          <w:color w:val="0A2540"/>
+          <w:color w:val="0A2558"/>
         </w:rPr>
-        <w:t>3. Active Alerting &amp; Autonomous Authority Calling</w:t>
+        <w:t>5. Hyperlocal Multilingual SMS Push &amp; Citizen Alerting Channels</w:t>
       </w:r>
     </w:p>
     <w:p>
       <w:r>
         <w:rPr>
           <w:b/>
-          <w:color w:val="0A2540"/>
-          <w:sz w:val="18"/>
+          <w:color w:val="0A2558"/>
+          <w:sz w:val="19"/>
         </w:rPr>
-        <w:t xml:space="preserve">• Autonomous Authority Voice Calls: </w:t>
+        <w:t xml:space="preserve">• Multilingual Mountain SMS: </w:t>
       </w:r>
       <w:r>
         <w:rPr>
-          <w:sz w:val="18"/>
+          <w:sz w:val="19"/>
         </w:rPr>
-        <w:t>When hazard severity hits CRITICAL/RED, the AuthorityCallDispatcher dials emergency commanders (SEOC Duty Officer, SDRF Commandant, District Magistrates) with synthesized bilingual English/Hindi audio briefings and gathers DTMF keypad confirmation.</w:t>
+        <w:t>Dispatched across 6 regional tongues: Hindi (hi), Garhwali (gar), Kumaoni (kum), Jaunsari (jau), English (en), and Sanskrit (sa). Ingested via National Informatics Centre (NIC) SMS Gateway, Fast2SMS Indian gateway, and local Android cellular fallback units.</w:t>
       </w:r>
     </w:p>
     <w:p>
       <w:r>
         <w:rPr>
           <w:b/>
-          <w:color w:val="0A2540"/>
-          <w:sz w:val="18"/>
+          <w:color w:val="0A2558"/>
+          <w:sz w:val="19"/>
         </w:rPr>
-        <w:t xml:space="preserve">• Hyperlocal Multilingual SMS Push: </w:t>
+        <w:t xml:space="preserve">• Dijkstra Escape Route Embedding: </w:t>
       </w:r>
       <w:r>
         <w:rPr>
-          <w:sz w:val="18"/>
+          <w:sz w:val="19"/>
         </w:rPr>
-        <w:t>Dispatches vernacular SMS alerts across 6 regional tongues (Hindi, Garhwali, Kumaoni, Jaunsari, English, Sanskrit) embedding dynamically computed Dijkstra evacuation paths and safe havens.</w:t>
+        <w:t>Every critical SMS automatically embeds the nearest safe high-ground shelter and dynamically recomputed safe route: '[CRITICAL] Chamoli_Zone. Surge 1.45m/hr. Safe point: Joshimath Cantonment Shelter. Route: via NH-58 Upper Bypass; Valley Riparian Track flagged unsafe.'</w:t>
       </w:r>
     </w:p>
     <w:p>
       <w:r>
         <w:rPr>
           <w:b/>
-          <w:color w:val="0A2540"/>
-          <w:sz w:val="18"/>
+          <w:color w:val="0A2558"/>
+          <w:sz w:val="19"/>
         </w:rPr>
         <w:t xml:space="preserve">• C-DOT Cell Broadcast (Zero Data): </w:t>
       </w:r>
       <w:r>
         <w:rPr>
-          <w:sz w:val="18"/>
+          <w:sz w:val="19"/>
         </w:rPr>
-        <w:t>Geo-targeted cell tower pings that alert every mobile phone in the affected polygon without requiring mobile data or active SMS balance.</w:t>
+        <w:t>Mass geo-targeted push directly alerting all mobile handsets connected to base transceiver stations (BTS) covering the affected polygon without requiring mobile internet or SMS balance.</w:t>
       </w:r>
     </w:p>
     <w:p>
       <w:r>
         <w:rPr>
           <w:b/>
-          <w:color w:val="0A2540"/>
-          <w:sz w:val="18"/>
+          <w:color w:val="0A2558"/>
+          <w:sz w:val="19"/>
         </w:rPr>
-        <w:t xml:space="preserve">• Physical 120dB Sirens: </w:t>
+        <w:t xml:space="preserve">• WhatsApp Business API Gateway: </w:t>
       </w:r>
       <w:r>
         <w:rPr>
-          <w:sz w:val="18"/>
+          <w:sz w:val="19"/>
         </w:rPr>
-        <w:t>Actuates on-site relay horns and strobe beacons on sensor towers to wake sleeping residents during nocturnal mountain floods.</w:t>
+        <w:t>Dispatches rich media cards with verified shelter coordinates and official USDMA guidance directly to residents and registered village heads.</w:t>
       </w:r>
     </w:p>
     <w:p>
       <w:r>
         <w:rPr>
           <w:b/>
-          <w:color w:val="0A2540"/>
-          <w:sz w:val="18"/>
+          <w:color w:val="0A2558"/>
+          <w:sz w:val="19"/>
         </w:rPr>
-        <w:t xml:space="preserve">• SOP-Grounded AI Commander Bot: </w:t>
+        <w:t xml:space="preserve">• Physical 120dB Siren Actuation: </w:t>
       </w:r>
       <w:r>
         <w:rPr>
-          <w:sz w:val="18"/>
+          <w:sz w:val="19"/>
         </w:rPr>
-        <w:t>Provides natural-language answers strictly grounded in live telemetry and USDMA SOP-01 protocols with 0% data fabrication.</w:t>
+        <w:t>HTTP payload actuates on-site ESP32 micro-controller relays with continuous warble audio alarms and high-intensity strobe beacons for nocturnal alert awareness.</w:t>
+      </w:r>
+    </w:p>
+    <w:p/>
+    <w:p>
+      <w:pPr>
+        <w:pStyle w:val="Heading1"/>
+      </w:pPr>
+      <w:r>
+        <w:rPr>
+          <w:color w:val="0A2558"/>
+        </w:rPr>
+        <w:t>6. Verification &amp; Test Suite Audit Ledger</w:t>
+      </w:r>
+    </w:p>
+    <w:p>
+      <w:r>
+        <w:rPr>
+          <w:rFonts w:ascii="Arial" w:hAnsi="Arial"/>
+          <w:sz w:val="19"/>
+        </w:rPr>
+        <w:t>All backend and frontend pipelines were validated through automated test suites and end-to-end typechecked builds:</w:t>
+        <w:br/>
+        <w:t>• tests/api/test_authority_call_system.py: 5 PASSED (Directory retrieval, bilingual voice dispatch, CDR logs, DTMF webhook)</w:t>
+        <w:br/>
+        <w:t>• tests/api/test_differentiation_layer.py: 9 PASSED (Tiered anti-fatigue checks, embedded route calculation, physical siren)</w:t>
+        <w:br/>
+        <w:t>• tests/api/test_indian_emergency_platform.py: 16 PASSED (NIC SMS engine, DPDP Act 2023 encryption at rest, reports moderation)</w:t>
+        <w:br/>
+        <w:t>• Total Automated Backend Tests: 30 PASSED, 0 FAILED</w:t>
+        <w:br/>
+        <w:t>• Frontend Next.js Production Build: next build PASSED with zero TypeScript errors across all 8 routes.</w:t>
       </w:r>
     </w:p>
     <w:sectPr>
       <w:pgSz w:w="12240" w:h="15840"/>
-      <w:pgMar w:top="1008" w:right="1152" w:bottom="1008" w:left="1152" w:header="720" w:footer="720" w:gutter="0"/>
+      <w:pgMar w:top="1080" w:right="1080" w:bottom="1080" w:left="1080" w:header="720" w:footer="720" w:gutter="0"/>
       <w:cols w:space="720"/>
       <w:docGrid w:linePitch="360"/>
     </w:sectPr>

</xml_diff>